<commit_message>
fix: synchronize quality metrics across artifacts
</commit_message>
<xml_diff>
--- a/research/thesis/systematic_review_thesis_v3.docx
+++ b/research/thesis/systematic_review_thesis_v3.docx
@@ -46,7 +46,7 @@
     </w:p>
     <w:p>
       <w:r>
-        <w:t>본 연구는 항응고제를 복용하는 성인과 신장결석·고칼슘뇨 등 신장 관련 고위험군에서 비타민 K, 오메가-3, 칼슘, 비타민 D 및 비타민 C 보충제의 안전성 근거를 체계적으로 검색·구조화하고, 개인의 복용 조건에 따라 확인사항과 근거 문헌을 제시하는 웹 시스템을 구축하는 것을 목적으로 하였다. PubMed, ClinicalTrials.gov와 KoreaMed에서 수집한 공개 서지자료를 연구계획서의 PICOS에 따라 자동 선별하고 대상자, 보충제, 용량, 안전성 결과와 근거 위치를 추출하였다. 직접 관련 후보는 4,593건이었고, 용량 정보가 확인된 문헌은 987건, 공개 원문 위치가 연결된 문헌은 1,507건이었다. 제목 직접관련성, 연구설계, 용량·결과 및 원문 접근성을 기준으로 핵심 근거 129건을 선정하였다. 조회 시스템은 보충제, 일일 용량, 병용 약물, 질환·결석 병력과 검사값을 입력받아 질문별 확인사항, 맞춤형 요약과 근거 원문을 제공하도록 구현하였다. 59개 자동 테스트, TypeScript 검사와 Production 빌드를 통과한 버전을 Vercel 고정 주소에 배포하였다. 본 연구는 체계적인 검색·선별·추출과 소프트웨어 검증을 수행했으나 독립된 두 명의 사람 선별자가 없으므로 자동 선별 결과를 최종 임상 권고로 해석할 수 없다.</w:t>
+        <w:t>본 연구는 항응고제를 복용하는 성인과 신장결석·고칼슘뇨 등 신장 관련 고위험군에서 비타민 K, 오메가-3, 칼슘, 비타민 D 및 비타민 C 보충제의 안전성 근거를 체계적으로 검색·구조화하고, 개인의 복용 조건에 따라 확인사항과 근거 문헌을 제시하는 웹 시스템을 구축하는 것을 목적으로 하였다. PubMed, ClinicalTrials.gov와 KoreaMed에서 수집한 공개 서지자료를 연구계획서의 PICOS에 따라 자동 선별하고 대상자, 보충제, 용량, 안전성 결과와 근거 위치를 추출하였다. 직접 관련 후보는 4,593건이었고, 용량 정보가 확인된 문헌은 987건, 공개 원문 위치가 연결된 문헌은 1,507건이었다. 제목 직접관련성, 연구설계, 용량·결과 및 원문 접근성을 기준으로 핵심 근거 129건을 선정하였다. 조회 시스템은 보충제, 일일 용량, 병용 약물, 질환·결석 병력과 검사값을 입력받아 질문별 확인사항, 맞춤형 요약과 근거 원문을 제공하도록 구현하였다. 62개 자동 테스트, TypeScript 검사와 Production 빌드를 통과한 버전을 Vercel 고정 주소에 배포하였다. 본 연구는 체계적인 검색·선별·추출과 소프트웨어 검증을 수행했으나 독립된 두 명의 사람 선별자가 없으므로 자동 선별 결과를 최종 임상 권고로 해석할 수 없다.</w:t>
       </w:r>
     </w:p>
     <w:p>
@@ -186,7 +186,7 @@
     </w:p>
     <w:p>
       <w:r>
-        <w:t>단위·계약·경계·개인맞춤 API 테스트 59개, lint, TypeScript 검사와 Production 빌드를 수행하였다. 최종 시스템은 https://nutrition-safety-engine.vercel.app 에 배포하였다.</w:t>
+        <w:t>단위·계약·경계·개인맞춤 API 테스트 62개, lint, TypeScript 검사와 Production 빌드를 수행하였다. 최종 시스템은 https://nutrition-safety-engine.vercel.app 에 배포하였다.</w:t>
       </w:r>
     </w:p>
     <w:p>
@@ -1101,7 +1101,7 @@
           </w:tcPr>
           <w:p>
             <w:r>
-              <w:t>59개 통과</w:t>
+              <w:t>62개 통과</w:t>
             </w:r>
           </w:p>
         </w:tc>
@@ -1123,7 +1123,7 @@
           </w:tcPr>
           <w:p>
             <w:r>
-              <w:t>통과</w:t>
+              <w:t>passed</w:t>
             </w:r>
           </w:p>
         </w:tc>
@@ -1145,7 +1145,7 @@
           </w:tcPr>
           <w:p>
             <w:r>
-              <w:t>통과</w:t>
+              <w:t>passed</w:t>
             </w:r>
           </w:p>
         </w:tc>
@@ -1167,7 +1167,7 @@
           </w:tcPr>
           <w:p>
             <w:r>
-              <w:t>통과</w:t>
+              <w:t>passed</w:t>
             </w:r>
           </w:p>
         </w:tc>

</xml_diff>

<commit_message>
fix: correct dose extraction and adult scope
</commit_message>
<xml_diff>
--- a/research/thesis/systematic_review_thesis_v3.docx
+++ b/research/thesis/systematic_review_thesis_v3.docx
@@ -46,7 +46,7 @@
     </w:p>
     <w:p>
       <w:r>
-        <w:t>본 연구는 항응고제를 복용하는 성인과 신장결석·고칼슘뇨 등 신장 관련 고위험군에서 비타민 K, 오메가-3, 칼슘, 비타민 D 및 비타민 C 보충제의 안전성 근거를 체계적으로 검색·구조화하고, 개인의 복용 조건에 따라 확인사항과 근거 문헌을 제시하는 웹 시스템을 구축하는 것을 목적으로 하였다. PubMed, ClinicalTrials.gov와 KoreaMed에서 수집한 공개 서지자료를 연구계획서의 PICOS에 따라 자동 선별하고 대상자, 보충제, 용량, 안전성 결과와 근거 위치를 추출하였다. 직접 관련 후보는 4,593건이었고, 용량 정보가 확인된 문헌은 987건, 공개 원문 위치가 연결된 문헌은 1,507건이었다. 제목 직접관련성, 연구설계, 용량·결과 및 원문 접근성을 기준으로 핵심 근거 129건을 선정하였다. 조회 시스템은 보충제, 일일 용량, 병용 약물, 질환·결석 병력과 검사값을 입력받아 질문별 확인사항, 맞춤형 요약과 근거 원문을 제공하도록 구현하였다. 62개 자동 테스트, TypeScript 검사와 Production 빌드를 통과한 버전을 Vercel 고정 주소에 배포하였다. 본 연구는 체계적인 검색·선별·추출과 소프트웨어 검증을 수행했으나 독립된 두 명의 사람 선별자가 없으므로 자동 선별 결과를 최종 임상 권고로 해석할 수 없다.</w:t>
+        <w:t>본 연구는 항응고제를 복용하는 성인과 신장결석·고칼슘뇨 등 신장 관련 고위험군에서 비타민 K, 오메가-3, 칼슘, 비타민 D 및 비타민 C 보충제의 안전성 근거를 체계적으로 검색·구조화하고, 개인의 복용 조건에 따라 확인사항과 근거 문헌을 제시하는 웹 시스템을 구축하는 것을 목적으로 하였다. PubMed, ClinicalTrials.gov와 KoreaMed에서 수집한 공개 서지자료를 연구계획서의 PICOS에 따라 자동 선별하고 대상자, 보충제, 용량, 안전성 결과와 근거 위치를 추출하였다. 직접 관련 후보는 4,593건이었고, 용량 정보가 확인된 문헌은 369건, 공개 원문 위치가 연결된 문헌은 1,507건이었다. 제목 직접관련성, 연구설계, 용량·결과 및 원문 접근성을 기준으로 핵심 근거 128건을 선정하였다. 조회 시스템은 보충제, 일일 용량, 병용 약물, 질환·결석 병력과 검사값을 입력받아 질문별 확인사항, 맞춤형 요약과 근거 원문을 제공하도록 구현하였다. 62개 자동 테스트, TypeScript 검사와 Production 빌드를 통과한 버전을 Vercel 고정 주소에 배포하였다. 본 연구는 체계적인 검색·선별·추출과 소프트웨어 검증을 수행했으나 독립된 두 명의 사람 선별자가 없으므로 자동 선별 결과를 최종 임상 권고로 해석할 수 없다.</w:t>
       </w:r>
     </w:p>
     <w:p>
@@ -207,7 +207,7 @@
     </w:p>
     <w:p>
       <w:r>
-        <w:t>PICOS 직접 후보는 4,593건이었다. 이 중 987건에서 단위가 있는 용량을 관찰했고 1,507건에 공개 원문 위치를 연결하였다. 제목 직접관련성 필터를 통과한 핵심 문헌은 129건이었다.</w:t>
+        <w:t>PICOS 직접 후보는 4,593건이었다. 이 중 369건에서 단위가 있는 용량을 관찰했고 1,507건에 공개 원문 위치를 연결하였다. 제목 직접관련성 필터를 통과한 핵심 문헌은 128건이었다.</w:t>
       </w:r>
     </w:p>
     <w:tbl>
@@ -302,7 +302,7 @@
           </w:tcPr>
           <w:p>
             <w:r>
-              <w:t>987</w:t>
+              <w:t>369</w:t>
             </w:r>
           </w:p>
         </w:tc>
@@ -366,7 +366,7 @@
           </w:tcPr>
           <w:p>
             <w:r>
-              <w:t>129</w:t>
+              <w:t>128</w:t>
             </w:r>
           </w:p>
         </w:tc>
@@ -484,7 +484,7 @@
           </w:tcPr>
           <w:p>
             <w:r>
-              <w:t>22</w:t>
+              <w:t>18</w:t>
             </w:r>
           </w:p>
         </w:tc>
@@ -536,7 +536,7 @@
           </w:tcPr>
           <w:p>
             <w:r>
-              <w:t>4</w:t>
+              <w:t>2</w:t>
             </w:r>
           </w:p>
         </w:tc>
@@ -588,7 +588,7 @@
           </w:tcPr>
           <w:p>
             <w:r>
-              <w:t>22</w:t>
+              <w:t>14</w:t>
             </w:r>
           </w:p>
         </w:tc>
@@ -598,7 +598,7 @@
           </w:tcPr>
           <w:p>
             <w:r>
-              <w:t>11</w:t>
+              <w:t>10</w:t>
             </w:r>
           </w:p>
         </w:tc>
@@ -640,7 +640,7 @@
           </w:tcPr>
           <w:p>
             <w:r>
-              <w:t>23</w:t>
+              <w:t>15</w:t>
             </w:r>
           </w:p>
         </w:tc>
@@ -650,7 +650,7 @@
           </w:tcPr>
           <w:p>
             <w:r>
-              <w:t>20</w:t>
+              <w:t>18</w:t>
             </w:r>
           </w:p>
         </w:tc>
@@ -682,7 +682,7 @@
           </w:tcPr>
           <w:p>
             <w:r>
-              <w:t>27</w:t>
+              <w:t>26</w:t>
             </w:r>
           </w:p>
         </w:tc>
@@ -692,7 +692,7 @@
           </w:tcPr>
           <w:p>
             <w:r>
-              <w:t>18</w:t>
+              <w:t>8</w:t>
             </w:r>
           </w:p>
         </w:tc>
@@ -731,7 +731,7 @@
     </w:p>
     <w:p>
       <w:r>
-        <w:t>이 가운데 명시적 용량이 관찰된 문헌은 22건, 공개 원문 위치가 연결된 문헌은 7건이었다. 용량이 공란인 경우 수치가 없다고 단정하지 않고, 현재 확보한 초록에서 명시적 단위를 추출하지 못한 상태로 해석하였다.</w:t>
+        <w:t>이 가운데 명시적 용량이 관찰된 문헌은 18건, 공개 원문 위치가 연결된 문헌은 7건이었다. 용량이 공란인 경우 수치가 없다고 단정하지 않고, 현재 확보한 초록에서 명시적 단위를 추출하지 못한 상태로 해석하였다.</w:t>
       </w:r>
     </w:p>
     <w:p>
@@ -744,7 +744,7 @@
         <w:pStyle w:val="ListBullet"/>
       </w:pPr>
       <w:r>
-        <w:t>Interaction Between Dietary Vitamin K Intake and Anticoagulation by Vitamin K Antagonists: Is It Really True?: A Systematic Review. (2016.0). 보고 용량: 150 μg | 76 to 217 μg</w:t>
+        <w:t>Interaction Between Dietary Vitamin K Intake and Anticoagulation by Vitamin K Antagonists: Is It Really True?: A Systematic Review (2016). 보고 용량: 150 μg/day | 76 to 217 μg/day</w:t>
       </w:r>
     </w:p>
     <w:p>
@@ -752,7 +752,7 @@
         <w:pStyle w:val="ListBullet"/>
       </w:pPr>
       <w:r>
-        <w:t>A prospective randomized study to determine the optimal dose of intravenous vitamin K in reversal of over-warfarinization. (2000.0). 보고 용량: 0.5 mg | 1 mg | 2 mg</w:t>
+        <w:t>A prospective randomized study to determine the optimal dose of intravenous vitamin K in reversal of over-warfarinization (2000). 보고 용량: 0.5 mg | 1 mg | 2 mg</w:t>
       </w:r>
     </w:p>
     <w:p>
@@ -760,7 +760,7 @@
         <w:pStyle w:val="ListBullet"/>
       </w:pPr>
       <w:r>
-        <w:t>Vitamin K1 supplementation to improve the stability of anticoagulation therapy with vitamin K antagonists: a dose-finding study. (2011.0). 보고 용량: 100 μg | 150 μg | 200 μg</w:t>
+        <w:t>Vitamin K1 supplementation to improve the stability of anticoagulation therapy with vitamin K antagonists: a dose-finding study (2011). 보고 용량: 100 μg | 150 μg | 200 μg</w:t>
       </w:r>
     </w:p>
     <w:p>
@@ -768,7 +768,7 @@
         <w:pStyle w:val="ListBullet"/>
       </w:pPr>
       <w:r>
-        <w:t>Over-the-counter vitamin K1-containing multivitamin supplements disrupt warfarin anticoagulation in vitamin K1-depleted patients. A prospective, controlled trial. (2004.0). 보고 용량: 1.5 mcg | 25 mcg | 4.5 mcg</w:t>
+        <w:t>Over-the-counter vitamin K1-containing multivitamin supplements disrupt warfarin anticoagulation in vitamin K1-depleted patients. A prospective, controlled trial (2004). 보고 용량: 25 mcg</w:t>
       </w:r>
     </w:p>
     <w:p>
@@ -776,7 +776,7 @@
         <w:pStyle w:val="ListBullet"/>
       </w:pPr>
       <w:r>
-        <w:t>Nutri-pharmacogenomics of warfarin anticoagulation therapy: VKORC1 genotype-dependent influence of dietary vitamin K intake. (2014.0). 보고 용량: 1639 G | 3.91 mg | 4.0 mg</w:t>
+        <w:t>Reversal of overanticoagulation in very elderly hospitalized patients with an INR above 5.0: 24-hour INR response after vitamin K administration (2011). 보고 용량: 1 mg</w:t>
       </w:r>
     </w:p>
     <w:p>
@@ -794,7 +794,7 @@
     </w:p>
     <w:p>
       <w:r>
-        <w:t>이 가운데 명시적 용량이 관찰된 문헌은 4건, 공개 원문 위치가 연결된 문헌은 1건이었다. 용량이 공란인 경우 수치가 없다고 단정하지 않고, 현재 확보한 초록에서 명시적 단위를 추출하지 못한 상태로 해석하였다.</w:t>
+        <w:t>이 가운데 명시적 용량이 관찰된 문헌은 2건, 공개 원문 위치가 연결된 문헌은 1건이었다. 용량이 공란인 경우 수치가 없다고 단정하지 않고, 현재 확보한 초록에서 명시적 단위를 추출하지 못한 상태로 해석하였다.</w:t>
       </w:r>
     </w:p>
     <w:p>
@@ -807,7 +807,7 @@
         <w:pStyle w:val="ListBullet"/>
       </w:pPr>
       <w:r>
-        <w:t>No Effect of Omega-3 Carboxylic Acids on Pharmacokinetics/Pharmacodynamics of Warfarin or on Platelet Function When Co-administered with Acetylsalicylic Acid: Results of Two Phase I Studies in Healthy Volunteers. (2017.0). 보고 용량: 25 mg | 4 g | 40 mg | 81 mg</w:t>
+        <w:t>No Effect of Omega-3 Carboxylic Acids on Pharmacokinetics/Pharmacodynamics of Warfarin or on Platelet Function When Co-administered with Acetylsalicylic Acid: Results of Two Phase I Studies in Healthy Volunteers (2017). 보고 용량: 4 g | 40 mg | 81 mg</w:t>
       </w:r>
     </w:p>
     <w:p>
@@ -815,7 +815,7 @@
         <w:pStyle w:val="ListBullet"/>
       </w:pPr>
       <w:r>
-        <w:t>Role of Fish Oil in Post-Cardiotomy Bleeding: A Summary of the Basic Science and Clinical Trials. (2018.0). 초록 내 명시적 용량 없음.</w:t>
+        <w:t>Role of Fish Oil in Post-Cardiotomy Bleeding: A Summary of the Basic Science and Clinical Trials (2018). 초록 내 명시적 용량 없음.</w:t>
       </w:r>
     </w:p>
     <w:p>
@@ -823,7 +823,7 @@
         <w:pStyle w:val="ListBullet"/>
       </w:pPr>
       <w:r>
-        <w:t>Omega-3 and fish oil supplements do not cause increased bleeding during spinal decompression surgery. (2012.0). 초록 내 명시적 용량 없음.</w:t>
+        <w:t>Omega-3 and fish oil supplements do not cause increased bleeding during spinal decompression surgery (2012). 초록 내 명시적 용량 없음.</w:t>
       </w:r>
     </w:p>
     <w:p>
@@ -831,7 +831,7 @@
         <w:pStyle w:val="ListBullet"/>
       </w:pPr>
       <w:r>
-        <w:t>The Use of Fish Oil with Warfarin Does Not Significantly Affect either the International Normalised Ratio or Incidence of Adverse Events in Patients with Atrial Fibrillation and Deep Vein Thrombosis: A Retrospective Study. (2016.0). 초록 내 명시적 용량 없음.</w:t>
+        <w:t>The Use of Fish Oil with Warfarin Does Not Significantly Affect either the International Normalised Ratio or Incidence of Adverse Events in Patients with Atrial Fibrillation and Deep Vein Thrombosis: A Retrospective Study (2016). 초록 내 명시적 용량 없음.</w:t>
       </w:r>
     </w:p>
     <w:p>
@@ -839,7 +839,7 @@
         <w:pStyle w:val="ListBullet"/>
       </w:pPr>
       <w:r>
-        <w:t>Plasma triacylglycerol and coagulation factor concentrations predict the anticoagulant effect of dietary fish oil in overweight subjects. (2007.0). 보고 용량: 3.1 g</w:t>
+        <w:t>Subdural hematoma after a fall in an elderly patient taking high-dose omega-3 fatty acids with warfarin and aspirin: case report and review of the literature (2007). 보고 용량: 6 g/day</w:t>
       </w:r>
     </w:p>
     <w:p>
@@ -857,7 +857,7 @@
     </w:p>
     <w:p>
       <w:r>
-        <w:t>이 가운데 명시적 용량이 관찰된 문헌은 22건, 공개 원문 위치가 연결된 문헌은 11건이었다. 용량이 공란인 경우 수치가 없다고 단정하지 않고, 현재 확보한 초록에서 명시적 단위를 추출하지 못한 상태로 해석하였다.</w:t>
+        <w:t>이 가운데 명시적 용량이 관찰된 문헌은 14건, 공개 원문 위치가 연결된 문헌은 10건이었다. 용량이 공란인 경우 수치가 없다고 단정하지 않고, 현재 확보한 초록에서 명시적 단위를 추출하지 못한 상태로 해석하였다.</w:t>
       </w:r>
     </w:p>
     <w:p>
@@ -870,7 +870,7 @@
         <w:pStyle w:val="ListBullet"/>
       </w:pPr>
       <w:r>
-        <w:t>Diet, fluid, or supplements for secondary prevention of nephrolithiasis: a systematic review and meta-analysis of randomized trials. (2009.0). 초록 내 명시적 용량 없음.</w:t>
+        <w:t>Diet, fluid, or supplements for secondary prevention of nephrolithiasis: a systematic review and meta-analysis of randomized trials (2009). 초록 내 명시적 용량 없음.</w:t>
       </w:r>
     </w:p>
     <w:p>
@@ -878,7 +878,7 @@
         <w:pStyle w:val="ListBullet"/>
       </w:pPr>
       <w:r>
-        <w:t>Why oral calcium supplements may reduce renal stone disease: report of a clinical pilot study. (2001.0). 보고 용량: 500 mg</w:t>
+        <w:t>Why oral calcium supplements may reduce renal stone disease: report of a clinical pilot study (2001). 보고 용량: 500 mg</w:t>
       </w:r>
     </w:p>
     <w:p>
@@ -886,7 +886,7 @@
         <w:pStyle w:val="ListBullet"/>
       </w:pPr>
       <w:r>
-        <w:t>Effect of dietary treatment and fluid intake on the prevention of recurrent calcium stones and changes in urine composition: A meta-analysis and systematic review. (2021.0). 초록 내 명시적 용량 없음.</w:t>
+        <w:t>Effect of dietary treatment and fluid intake on the prevention of recurrent calcium stones and changes in urine composition: A meta-analysis and systematic review (2021). 초록 내 명시적 용량 없음.</w:t>
       </w:r>
     </w:p>
     <w:p>
@@ -894,7 +894,7 @@
         <w:pStyle w:val="ListBullet"/>
       </w:pPr>
       <w:r>
-        <w:t>Incidence of hypercalciuria and hypercalcemia during vitamin D and calcium supplementation in older women. (2014.0). 보고 용량: 10.2 mg | 200 mg | 300 mg | 800 IU</w:t>
+        <w:t>Incidence of hypercalciuria and hypercalcemia during vitamin D and calcium supplementation in older women (2014). 보고 용량: 1,200 mg | 1,200 mg/day | 200 mg</w:t>
       </w:r>
     </w:p>
     <w:p>
@@ -902,7 +902,7 @@
         <w:pStyle w:val="ListBullet"/>
       </w:pPr>
       <w:r>
-        <w:t>Dietary and lifestyle factors for primary prevention of nephrolithiasis: a systematic review and meta-analysis. (2020.0). 초록 내 명시적 용량 없음.</w:t>
+        <w:t>Dietary and lifestyle factors for primary prevention of nephrolithiasis: a systematic review and meta-analysis (2020). 초록 내 명시적 용량 없음.</w:t>
       </w:r>
     </w:p>
     <w:p>
@@ -920,7 +920,7 @@
     </w:p>
     <w:p>
       <w:r>
-        <w:t>이 가운데 명시적 용량이 관찰된 문헌은 23건, 공개 원문 위치가 연결된 문헌은 20건이었다. 용량이 공란인 경우 수치가 없다고 단정하지 않고, 현재 확보한 초록에서 명시적 단위를 추출하지 못한 상태로 해석하였다.</w:t>
+        <w:t>이 가운데 명시적 용량이 관찰된 문헌은 15건, 공개 원문 위치가 연결된 문헌은 18건이었다. 용량이 공란인 경우 수치가 없다고 단정하지 않고, 현재 확보한 초록에서 명시적 단위를 추출하지 못한 상태로 해석하였다.</w:t>
       </w:r>
     </w:p>
     <w:p>
@@ -933,7 +933,7 @@
         <w:pStyle w:val="ListBullet"/>
       </w:pPr>
       <w:r>
-        <w:t>Effect of two vitamin D repletion protocols on 24-h urine calcium in patients with recurrent calcium kidney stones and vitamin D deficiency: a randomized clinical trial. (2023.0). 보고 용량: 000 IU | 2000 IU</w:t>
+        <w:t>Effect of two vitamin D repletion protocols on 24-h urine calcium in patients with recurrent calcium kidney stones and vitamin D deficiency: a randomized clinical trial (2023). 보고 용량: 2000 IU | 50,000 IU</w:t>
       </w:r>
     </w:p>
     <w:p>
@@ -941,7 +941,7 @@
         <w:pStyle w:val="ListBullet"/>
       </w:pPr>
       <w:r>
-        <w:t>Risk of hypercalcemia in blacks taking hydrochlorothiazide and vitamin D. (2014.0). 보고 용량: 0.2 mg | 4000 IU | 4000 international units</w:t>
+        <w:t>Risk of hypercalcemia in blacks taking hydrochlorothiazide and vitamin D (2014). 보고 용량: 4000 IU | 4000 international units</w:t>
       </w:r>
     </w:p>
     <w:p>
@@ -949,7 +949,7 @@
         <w:pStyle w:val="ListBullet"/>
       </w:pPr>
       <w:r>
-        <w:t>Incidence of hypercalciuria and hypercalcemia during vitamin D and calcium supplementation in older women. (2014.0). 보고 용량: 10.2 mg | 200 mg | 300 mg | 800 IU</w:t>
+        <w:t>Incidence of hypercalciuria and hypercalcemia during vitamin D and calcium supplementation in older women (2014). 보고 용량: 1,200 mg | 1,200 mg/day</w:t>
       </w:r>
     </w:p>
     <w:p>
@@ -957,7 +957,7 @@
         <w:pStyle w:val="ListBullet"/>
       </w:pPr>
       <w:r>
-        <w:t>Association Between Vitamin D Supplementation and Urolithiasis Recurrence Outcomes in Known Stone Formers: A Retrospective Cohort Study With Dose-Response Analysis. (2025.0). 보고 용량: 000 IU | 800 IU</w:t>
+        <w:t>A 250 μg/week dose of vitamin D was as effective as a 50 μg/d dose in healthy adults, but a regimen of four weekly followed by monthly doses of 1250 μg raised the risk of hypercalciuria (2013). 보고 용량: 1250 μg | 50 000 IU</w:t>
       </w:r>
     </w:p>
     <w:p>
@@ -965,7 +965,7 @@
         <w:pStyle w:val="ListBullet"/>
       </w:pPr>
       <w:r>
-        <w:t>A 250 μg/week dose of vitamin D was as effective as a 50 μg/d dose in healthy adults, but a regimen of four weekly followed by monthly doses of 1250 μg raised the risk of hypercalciuria. (2013.0). 보고 용량: 000 IU | 1250 μg | 1544 μg | 2000 IU | 250 mg | 250 μg | 331 μg | 50 μg | 70 μg</w:t>
+        <w:t>Monthly high-dose vitamin D supplementation does not increase kidney stone risk or serum calcium: results from a randomized controlled trial (2019). 보고 용량: 100,000 IU</w:t>
       </w:r>
     </w:p>
     <w:p>
@@ -978,12 +978,12 @@
     </w:p>
     <w:p>
       <w:r>
-        <w:t>B3 질문의 핵심 문헌은 27건이었다. 아래 문헌은 연구설계, 직접관련성, 용량·결과 및 원문 접근성을 종합해 우선 배치하였다.</w:t>
+        <w:t>B3 질문의 핵심 문헌은 26건이었다. 아래 문헌은 연구설계, 직접관련성, 용량·결과 및 원문 접근성을 종합해 우선 배치하였다.</w:t>
       </w:r>
     </w:p>
     <w:p>
       <w:r>
-        <w:t>이 가운데 명시적 용량이 관찰된 문헌은 18건, 공개 원문 위치가 연결된 문헌은 10건이었다. 용량이 공란인 경우 수치가 없다고 단정하지 않고, 현재 확보한 초록에서 명시적 단위를 추출하지 못한 상태로 해석하였다.</w:t>
+        <w:t>이 가운데 명시적 용량이 관찰된 문헌은 8건, 공개 원문 위치가 연결된 문헌은 10건이었다. 용량이 공란인 경우 수치가 없다고 단정하지 않고, 현재 확보한 초록에서 명시적 단위를 추출하지 못한 상태로 해석하였다.</w:t>
       </w:r>
     </w:p>
     <w:p>
@@ -996,7 +996,7 @@
         <w:pStyle w:val="ListBullet"/>
       </w:pPr>
       <w:r>
-        <w:t>Ascorbic Acid Supplements and Kidney Stones Incidence Among Men and Women: A systematic review and meta-analysis. (2019.0). 보고 용량: 1000-1499mg | 1500 mg | 1500mg | 250-499mg | 500-999 mg | 500-999mg</w:t>
+        <w:t>Ascorbic Acid Supplements and Kidney Stones Incidence Among Men and Women: A systematic review and meta-analysis (2019). 초록 내 명시적 용량 없음.</w:t>
       </w:r>
     </w:p>
     <w:p>
@@ -1004,7 +1004,7 @@
         <w:pStyle w:val="ListBullet"/>
       </w:pPr>
       <w:r>
-        <w:t>Ascorbate increases human oxaluria and kidney stone risk. (2005.0). 보고 용량: 1000 mg | 136 mg | 18 mg | 2000 mg</w:t>
+        <w:t>Ascorbic acid-induced oxalate nephropathy: a case report and discussion of pathologic mechanisms (2019). 보고 용량: 2 g/day</w:t>
       </w:r>
     </w:p>
     <w:p>
@@ -1012,7 +1012,7 @@
         <w:pStyle w:val="ListBullet"/>
       </w:pPr>
       <w:r>
-        <w:t>Ascorbic acid in idiopathic recurrent calcium urolithiasis in humans--does it have an abettor role in oxalate, and calcium oxalate crystallization? (2000.0). 보고 용량: 5 mg</w:t>
+        <w:t>No Reported Renal Stones with Intravenous Vitamin C Administration: A Prospective Case Series Study (2018). 초록 내 명시적 용량 없음.</w:t>
       </w:r>
     </w:p>
     <w:p>
@@ -1020,7 +1020,7 @@
         <w:pStyle w:val="ListBullet"/>
       </w:pPr>
       <w:r>
-        <w:t>Ascorbic acid overdosing: a risk factor for calcium oxalate nephrolithiasis. (1992.0). 보고 용량: 000 mg | 500 mg | 6 to 13 mg</w:t>
+        <w:t>A case report of renal oxalosis and secondary hyperoxaluria due to chronic high vitamin C consumption (2025). 보고 용량: 3 g</w:t>
       </w:r>
     </w:p>
     <w:p>
@@ -1028,7 +1028,7 @@
         <w:pStyle w:val="ListBullet"/>
       </w:pPr>
       <w:r>
-        <w:t>Ascorbic acid-induced oxalate nephropathy: a case report and discussion of pathologic mechanisms. (2019.0). 보고 용량: 2 g</w:t>
+        <w:t>Vitamin C-induced hyperoxaluria causing reversible tubulointerstitial nephritis and chronic renal failure: a case report (2007). 보고 용량: 680 mg</w:t>
       </w:r>
     </w:p>
     <w:p>
@@ -1255,7 +1255,7 @@
     </w:p>
     <w:p>
       <w:r>
-        <w:t>본 연구는 다섯 영양보충제 안전성 질문에 대해 4,593건의 PICOS 직접 후보에서 대상자·용량·안전성 결과와 근거 위치를 구조화하고 핵심 문헌 129건을 선정하였다. 이를 개인 조건 기반 웹 조회 시스템으로 구현해 Production에 배포하였다. 결과는 임상 처방을 대신하지 않지만 상담 전에 확인할 조건과 근거 문헌을 빠르게 정리하는 재현 가능한 도구를 제공한다.</w:t>
+        <w:t>본 연구는 다섯 영양보충제 안전성 질문에 대해 4,593건의 PICOS 직접 후보에서 대상자·용량·안전성 결과와 근거 위치를 구조화하고 핵심 문헌 128건을 선정하였다. 이를 개인 조건 기반 웹 조회 시스템으로 구현해 Production에 배포하였다. 결과는 임상 처방을 대신하지 않지만 상담 전에 확인할 조건과 근거 문헌을 빠르게 정리하는 재현 가능한 도구를 제공한다.</w:t>
       </w:r>
     </w:p>
     <w:p>
@@ -1271,7 +1271,7 @@
         <w:pStyle w:val="ListNumber"/>
       </w:pPr>
       <w:r>
-        <w:t>[A1] Interaction Between Dietary Vitamin K Intake and Anticoagulation by Vitamin K Antagonists: Is It Really True?: A Systematic Review.. 2016.0. 10.1097/md.0000000000002895</w:t>
+        <w:t>[A1] Interaction Between Dietary Vitamin K Intake and Anticoagulation by Vitamin K Antagonists: Is It Really True?: A Systematic Review. 2016. 10.1097/md.0000000000002895</w:t>
       </w:r>
     </w:p>
     <w:p>
@@ -1279,7 +1279,7 @@
         <w:pStyle w:val="ListNumber"/>
       </w:pPr>
       <w:r>
-        <w:t>[A1] A prospective randomized study to determine the optimal dose of intravenous vitamin K in reversal of over-warfarinization.. 2000.0. 10.1046/j.1365-2141.2000.02001.x</w:t>
+        <w:t>[A1] A prospective randomized study to determine the optimal dose of intravenous vitamin K in reversal of over-warfarinization. 2000. 10.1046/j.1365-2141.2000.02001.x</w:t>
       </w:r>
     </w:p>
     <w:p>
@@ -1287,7 +1287,7 @@
         <w:pStyle w:val="ListNumber"/>
       </w:pPr>
       <w:r>
-        <w:t>[A1] Vitamin K1 supplementation to improve the stability of anticoagulation therapy with vitamin K antagonists: a dose-finding study.. 2011.0. 10.3324/haematol.2010.035162</w:t>
+        <w:t>[A1] Vitamin K1 supplementation to improve the stability of anticoagulation therapy with vitamin K antagonists: a dose-finding study. 2011. 10.3324/haematol.2010.035162</w:t>
       </w:r>
     </w:p>
     <w:p>
@@ -1295,7 +1295,7 @@
         <w:pStyle w:val="ListNumber"/>
       </w:pPr>
       <w:r>
-        <w:t>[A1] Over-the-counter vitamin K1-containing multivitamin supplements disrupt warfarin anticoagulation in vitamin K1-depleted patients. A prospective, controlled trial.. 2004.0. 10.1160/th04-06-0346</w:t>
+        <w:t>[A1] Over-the-counter vitamin K1-containing multivitamin supplements disrupt warfarin anticoagulation in vitamin K1-depleted patients. A prospective, controlled trial. 2004. 10.1160/th04-06-0346</w:t>
       </w:r>
     </w:p>
     <w:p>
@@ -1303,7 +1303,7 @@
         <w:pStyle w:val="ListNumber"/>
       </w:pPr>
       <w:r>
-        <w:t>[A1] Nutri-pharmacogenomics of warfarin anticoagulation therapy: VKORC1 genotype-dependent influence of dietary vitamin K intake.. 2014.0. 10.1007/s11239-013-0978-9</w:t>
+        <w:t>[A1] Reversal of overanticoagulation in very elderly hospitalized patients with an INR above 5.0: 24-hour INR response after vitamin K administration. 2011. 10.1016/j.amjmed.2011.01.016</w:t>
       </w:r>
     </w:p>
     <w:p>
@@ -1311,7 +1311,7 @@
         <w:pStyle w:val="ListNumber"/>
       </w:pPr>
       <w:r>
-        <w:t>[A1] Reversal of overanticoagulation in very elderly hospitalized patients with an INR above 5.0: 24-hour INR response after vitamin K administration.. 2011.0. 10.1016/j.amjmed.2011.01.016</w:t>
+        <w:t>[A1] Role of dietary vitamin K intake in chronic oral anticoagulation: prospective evidence from observational and randomized protocols. 2004. 10.1016/j.amjmed.2003.12.036</w:t>
       </w:r>
     </w:p>
     <w:p>
@@ -1319,7 +1319,7 @@
         <w:pStyle w:val="ListNumber"/>
       </w:pPr>
       <w:r>
-        <w:t>[A1] Short-term warfarin reversal for elective surgery--using low-dose intravenous vitamin K: safe, reliable and convenient*.. 2011.0. 10.1111/j.1365-2141.2011.08787.x</w:t>
+        <w:t>[A1] The effect of low-dose oral vitamin K supplementation on INR stability in patients receiving warfarin. A randomised trial. 2016. 10.1160/th16-04-0320</w:t>
       </w:r>
     </w:p>
     <w:p>
@@ -1327,7 +1327,7 @@
         <w:pStyle w:val="ListNumber"/>
       </w:pPr>
       <w:r>
-        <w:t>[A1] Role of dietary vitamin K intake in chronic oral anticoagulation: prospective evidence from observational and randomized protocols.. 2004.0. 10.1016/j.amjmed.2003.12.036</w:t>
+        <w:t>[A1] Vitamin K for improved anticoagulation control in patients receiving warfarin. 2014. 10.1002/14651858.cd009917.pub2</w:t>
       </w:r>
     </w:p>
     <w:p>
@@ -1335,7 +1335,7 @@
         <w:pStyle w:val="ListNumber"/>
       </w:pPr>
       <w:r>
-        <w:t>[A1] The effect of low-dose oral vitamin K supplementation on INR stability in patients receiving warfarin. A randomised trial.. 2016.0. 10.1160/th16-04-0320</w:t>
+        <w:t>[A1] Antagonism of warfarin-induced hypoprothrombinemia with use of low-dose subcutaneous vitamin K1. 1997. 10.1002/j.1552-4604.1997.tb04363.x</w:t>
       </w:r>
     </w:p>
     <w:p>
@@ -1343,7 +1343,7 @@
         <w:pStyle w:val="ListNumber"/>
       </w:pPr>
       <w:r>
-        <w:t>[A1] Vitamin K for improved anticoagulation control in patients receiving warfarin.. 2014.0. 10.1002/14651858.cd009917.pub2</w:t>
+        <w:t>[A1] Reversal of excessive effect of regular anticoagulation: low oral dose of phytonadione (vitamin K1) compared with warfarin discontinuation. 1993. https://pubmed.ncbi.nlm.nih.gov/8292723/</w:t>
       </w:r>
     </w:p>
     <w:p>
@@ -1351,7 +1351,7 @@
         <w:pStyle w:val="ListNumber"/>
       </w:pPr>
       <w:r>
-        <w:t>[A1] Antagonism of warfarin-induced hypoprothrombinemia with use of low-dose subcutaneous vitamin K1.. 1997.0. 10.1002/j.1552-4604.1997.tb04363.x</w:t>
+        <w:t>[A1] Nutri-pharmacogenomics of warfarin anticoagulation therapy: VKORC1 genotype-dependent influence of dietary vitamin K intake. 2014. 10.1007/s11239-013-0978-9</w:t>
       </w:r>
     </w:p>
     <w:p>
@@ -1359,7 +1359,7 @@
         <w:pStyle w:val="ListNumber"/>
       </w:pPr>
       <w:r>
-        <w:t>[A1] [Oral administration of intravenous preparation of Vitamin K for excessive anticoagulation due to warfarin].. 2012.0. https://pubmed.ncbi.nlm.nih.gov/22522851/</w:t>
+        <w:t>[A1] Short-term warfarin reversal for elective surgery--using low-dose intravenous vitamin K: safe, reliable and convenient*. 2011. 10.1111/j.1365-2141.2011.08787.x</w:t>
       </w:r>
     </w:p>
     <w:p>
@@ -1367,7 +1367,7 @@
         <w:pStyle w:val="ListNumber"/>
       </w:pPr>
       <w:r>
-        <w:t>[A1] Comparison of oral vs intravenous phytonadione (vitamin K1) in patients with excessive anticoagulation: a prospective randomized controlled study.. 2003.0. 10.1001/archinte.163.20.2469</w:t>
+        <w:t>[A1] A single dose of oral vitamin K effectively reverses oral anticoagulation with phenprocoumon during heart catheterisation. 2006. 10.4414/smw.2006.11452</w:t>
       </w:r>
     </w:p>
     <w:p>
@@ -1375,7 +1375,7 @@
         <w:pStyle w:val="ListNumber"/>
       </w:pPr>
       <w:r>
-        <w:t>[A1] Reversal of excessive effect of regular anticoagulation: low oral dose of phytonadione (vitamin K1) compared with warfarin discontinuation.. 1993.0. https://pubmed.ncbi.nlm.nih.gov/8292723/</w:t>
+        <w:t>[A1] Low-dose oral vitamin K reliably reverses over-anticoagulation due to warfarin. 1998. https://pubmed.ncbi.nlm.nih.gov/9657434/</w:t>
       </w:r>
     </w:p>
     <w:p>
@@ -1383,7 +1383,7 @@
         <w:pStyle w:val="ListNumber"/>
       </w:pPr>
       <w:r>
-        <w:t>[A1] A single dose of oral vitamin K effectively reverses oral anticoagulation with phenprocoumon during heart catheterisation.. 2006.0. 10.4414/smw.2006.11452</w:t>
+        <w:t>[A1] Vitamin K for reversal of excessive vitamin K antagonist anticoagulation: a systematic review and meta-analysis. 2019. 10.1182/bloodadvances.2018025163</w:t>
       </w:r>
     </w:p>
     <w:p>
@@ -1391,7 +1391,7 @@
         <w:pStyle w:val="ListNumber"/>
       </w:pPr>
       <w:r>
-        <w:t>[A1] Low-dose oral vitamin K reliably reverses over-anticoagulation due to warfarin.. 1998.0. https://pubmed.ncbi.nlm.nih.gov/9657434/</w:t>
+        <w:t>[A1] Association Between Usual Vitamin K Intake and Anticoagulation in Patients Under Warfarin Therapy. 2015. 10.7762/cnr.2015.4.4.235</w:t>
       </w:r>
     </w:p>
     <w:p>
@@ -1399,7 +1399,7 @@
         <w:pStyle w:val="ListNumber"/>
       </w:pPr>
       <w:r>
-        <w:t>[A1] Vitamin K for reversal of excessive vitamin K antagonist anticoagulation: a systematic review and meta-analysis.. 2019.0. 10.1182/bloodadvances.2018025163</w:t>
+        <w:t>[A1] Vitamin K supplementation can improve stability of anticoagulation for patients with unexplained variability in response to warfarin. 2007. 10.1182/blood-2006-09-049262</w:t>
       </w:r>
     </w:p>
     <w:p>
@@ -1407,7 +1407,7 @@
         <w:pStyle w:val="ListNumber"/>
       </w:pPr>
       <w:r>
-        <w:t>[A1] Association Between Usual Vitamin K Intake and Anticoagulation in Patients Under Warfarin Therapy.. 2015.0. 10.7762/cnr.2015.4.4.235</w:t>
+        <w:t>[A1] Daily vitamin K supplementation improves anticoagulant stability. 2007. 10.1111/j.1538-7836.2007.02715.x</w:t>
       </w:r>
     </w:p>
     <w:p>
@@ -1415,7 +1415,7 @@
         <w:pStyle w:val="ListNumber"/>
       </w:pPr>
       <w:r>
-        <w:t>[A1] Vitamin K supplementation can improve stability of anticoagulation for patients with unexplained variability in response to warfarin.. 2007.0. 10.1182/blood-2006-09-049262</w:t>
+        <w:t>[A1] Effect of 200μG/day of vitamin K1 on the variability of anticoagulation control in patients on warfarin: a randomized controlled trial. 2013. 10.1016/j.thromres.2013.07.019</w:t>
       </w:r>
     </w:p>
     <w:p>
@@ -1423,7 +1423,7 @@
         <w:pStyle w:val="ListNumber"/>
       </w:pPr>
       <w:r>
-        <w:t>[A1] Daily vitamin K supplementation improves anticoagulant stability.. 2007.0. 10.1111/j.1538-7836.2007.02715.x</w:t>
+        <w:t>[A1] [Oral administration of intravenous preparation of Vitamin K for excessive anticoagulation due to warfarin]. 2012. https://pubmed.ncbi.nlm.nih.gov/22522851/</w:t>
       </w:r>
     </w:p>
     <w:p>
@@ -1431,7 +1431,7 @@
         <w:pStyle w:val="ListNumber"/>
       </w:pPr>
       <w:r>
-        <w:t>[A1] Effect of 200μG/day of vitamin K1 on the variability of anticoagulation control in patients on warfarin: a randomized controlled trial.. 2013.0. 10.1016/j.thromres.2013.07.019</w:t>
+        <w:t>[A1] Comparison of oral vs intravenous phytonadione (vitamin K1) in patients with excessive anticoagulation: a prospective randomized controlled study. 2003. 10.1001/archinte.163.20.2469</w:t>
       </w:r>
     </w:p>
     <w:p>
@@ -1439,7 +1439,7 @@
         <w:pStyle w:val="ListNumber"/>
       </w:pPr>
       <w:r>
-        <w:t>[A1] Treatment of warfarin-associated coagulopathy with oral vitamin K: a randomised controlled trial.. 2000.0. 10.1016/s0140-6736(00)03125-1</w:t>
+        <w:t>[A1] Treatment of warfarin-associated coagulopathy with oral vitamin K: a randomised controlled trial. 2000. 10.1016/s0140-6736(00)03125-1</w:t>
       </w:r>
     </w:p>
     <w:p>
@@ -1447,7 +1447,7 @@
         <w:pStyle w:val="ListNumber"/>
       </w:pPr>
       <w:r>
-        <w:t>[A1] Randomized, placebo-controlled trial of orally administered vitamin K1 for warfarin-associated coagulopathy in Chinese patients with mechanical heart valves.. 2021.0. 10.1007/s00228-021-03127-8</w:t>
+        <w:t>[A1] Randomized, placebo-controlled trial of orally administered vitamin K1 for warfarin-associated coagulopathy in Chinese patients with mechanical heart valves. 2021. 10.1007/s00228-021-03127-8</w:t>
       </w:r>
     </w:p>
     <w:p>
@@ -1455,7 +1455,7 @@
         <w:pStyle w:val="ListNumber"/>
       </w:pPr>
       <w:r>
-        <w:t>[A1] Management of Supratherapeutic International Normalized Ratio without Bleeding after Warfarin Use: An Evaluation of Vitamin K Administration (SUPRA-WAR-K Study).. 2017.0. 10.4212/cjhp.v70i3.1660</w:t>
+        <w:t>[A1] Management of Supratherapeutic International Normalized Ratio without Bleeding after Warfarin Use: An Evaluation of Vitamin K Administration (SUPRA-WAR-K Study). 2017. 10.4212/cjhp.v70i3.1660</w:t>
       </w:r>
     </w:p>
     <w:p>
@@ -1463,7 +1463,7 @@
         <w:pStyle w:val="ListNumber"/>
       </w:pPr>
       <w:r>
-        <w:t>[A1] Effect of low-dose supplements of menaquinone-7 (vitamin K2 ) on the stability of oral anticoagulant treatment: dose-response relationship in healthy volunteers.. 2013.0. 10.1111/jth.12203</w:t>
+        <w:t>[A1] Warfarin and vitamin K intake in the era of pharmacogenetics. 2010. 10.1111/j.1365-2125.2010.03672.x</w:t>
       </w:r>
     </w:p>
     <w:p>
@@ -1471,7 +1471,7 @@
         <w:pStyle w:val="ListNumber"/>
       </w:pPr>
       <w:r>
-        <w:t>[A1] Warfarin and vitamin K intake in the era of pharmacogenetics.. 2010.0. 10.1111/j.1365-2125.2010.03672.x</w:t>
+        <w:t>[A1] Oral vitamin K versus placebo to correct excessive anticoagulation in patients receiving warfarin: a randomized trial. 2009. 10.7326/0003-4819-150-5-200903030-00005</w:t>
       </w:r>
     </w:p>
     <w:p>
@@ -1479,7 +1479,7 @@
         <w:pStyle w:val="ListNumber"/>
       </w:pPr>
       <w:r>
-        <w:t>[A1] Oral vitamin K versus placebo to correct excessive anticoagulation in patients receiving warfarin: a randomized trial.. 2009.0. 10.7326/0003-4819-150-5-200903030-00005</w:t>
+        <w:t>[A1] Low-dose oral vitamin K to normalize the international normalized ratio prior to surgery in patients who require temporary interruption of warfarin. 2007. 10.1007/s11239-007-0022-z</w:t>
       </w:r>
     </w:p>
     <w:p>
@@ -1487,7 +1487,7 @@
         <w:pStyle w:val="ListNumber"/>
       </w:pPr>
       <w:r>
-        <w:t>[A1] Low-dose oral vitamin K to normalize the international normalized ratio prior to surgery in patients who require temporary interruption of warfarin.. 2007.0. 10.1007/s11239-007-0022-z</w:t>
+        <w:t>[A1] Warfarin cessation before cardiopulmonary bypass: lessons learned from a randomized controlled trial of oral vitamin K. 2007. 10.1016/j.athoracsur.2007.03.014</w:t>
       </w:r>
     </w:p>
     <w:p>
@@ -1495,7 +1495,7 @@
         <w:pStyle w:val="ListNumber"/>
       </w:pPr>
       <w:r>
-        <w:t>[A1] Warfarin cessation before cardiopulmonary bypass: lessons learned from a randomized controlled trial of oral vitamin K.. 2007.0. 10.1016/j.athoracsur.2007.03.014</w:t>
+        <w:t>[A1] Oral vitamin K produces a normal INR within 24 hours of its administration in most patients discontinuing warfarin. 2005. https://pubmed.ncbi.nlm.nih.gov/15642685/</w:t>
       </w:r>
     </w:p>
     <w:p>
@@ -1503,7 +1503,7 @@
         <w:pStyle w:val="ListNumber"/>
       </w:pPr>
       <w:r>
-        <w:t>[A1] Oral vitamin K produces a normal INR within 24 hours of its administration in most patients discontinuing warfarin.. 2005.0. https://pubmed.ncbi.nlm.nih.gov/15642685/</w:t>
+        <w:t>[A1] Impaired warfarin response secondary to high-dose vitamin K1 for rapid anticoagulation reversal: case series and literature review. 2004. 10.1592/phco.24.13.1213.38080</w:t>
       </w:r>
     </w:p>
     <w:p>
@@ -1511,7 +1511,7 @@
         <w:pStyle w:val="ListNumber"/>
       </w:pPr>
       <w:r>
-        <w:t>[A2] No Effect of Omega-3 Carboxylic Acids on Pharmacokinetics/Pharmacodynamics of Warfarin or on Platelet Function When Co-administered with Acetylsalicylic Acid: Results of Two Phase I Studies in Healthy Volunteers.. 2017.0. 10.1007/s40256-017-0217-4</w:t>
+        <w:t>[A2] No Effect of Omega-3 Carboxylic Acids on Pharmacokinetics/Pharmacodynamics of Warfarin or on Platelet Function When Co-administered with Acetylsalicylic Acid: Results of Two Phase I Studies in Healthy Volunteers. 2017. 10.1007/s40256-017-0217-4</w:t>
       </w:r>
     </w:p>
     <w:p>
@@ -1519,7 +1519,7 @@
         <w:pStyle w:val="ListNumber"/>
       </w:pPr>
       <w:r>
-        <w:t>[A2] Role of Fish Oil in Post-Cardiotomy Bleeding: A Summary of the Basic Science and Clinical Trials.. 2018.0. 10.1016/j.athoracsur.2018.01.041</w:t>
+        <w:t>[A2] Role of Fish Oil in Post-Cardiotomy Bleeding: A Summary of the Basic Science and Clinical Trials. 2018. 10.1016/j.athoracsur.2018.01.041</w:t>
       </w:r>
     </w:p>
     <w:p>
@@ -1527,7 +1527,7 @@
         <w:pStyle w:val="ListNumber"/>
       </w:pPr>
       <w:r>
-        <w:t>[A2] Omega-3 and fish oil supplements do not cause increased bleeding during spinal decompression surgery.. 2012.0. 10.1097/bsd.0b013e3182120227</w:t>
+        <w:t>[A2] Omega-3 and fish oil supplements do not cause increased bleeding during spinal decompression surgery. 2012. 10.1097/bsd.0b013e3182120227</w:t>
       </w:r>
     </w:p>
     <w:p>
@@ -1535,7 +1535,7 @@
         <w:pStyle w:val="ListNumber"/>
       </w:pPr>
       <w:r>
-        <w:t>[A2] The Use of Fish Oil with Warfarin Does Not Significantly Affect either the International Normalised Ratio or Incidence of Adverse Events in Patients with Atrial Fibrillation and Deep Vein Thrombosis: A Retrospective Study.. 2016.0. 10.3390/nu8090578</w:t>
+        <w:t>[A2] The Use of Fish Oil with Warfarin Does Not Significantly Affect either the International Normalised Ratio or Incidence of Adverse Events in Patients with Atrial Fibrillation and Deep Vein Thrombosis: A Retrospective Study. 2016. 10.3390/nu8090578</w:t>
       </w:r>
     </w:p>
     <w:p>
@@ -1543,7 +1543,7 @@
         <w:pStyle w:val="ListNumber"/>
       </w:pPr>
       <w:r>
-        <w:t>[A2] Plasma triacylglycerol and coagulation factor concentrations predict the anticoagulant effect of dietary fish oil in overweight subjects.. 2007.0. 10.1093/jn/137.1.7</w:t>
+        <w:t>[A2] Subdural hematoma after a fall in an elderly patient taking high-dose omega-3 fatty acids with warfarin and aspirin: case report and review of the literature. 2007. 10.1592/phco.27.1.152</w:t>
       </w:r>
     </w:p>
     <w:p>
@@ -1551,7 +1551,7 @@
         <w:pStyle w:val="ListNumber"/>
       </w:pPr>
       <w:r>
-        <w:t>[A2] Subdural hematoma after a fall in an elderly patient taking high-dose omega-3 fatty acids with warfarin and aspirin: case report and review of the literature.. 2007.0. 10.1592/phco.27.1.152</w:t>
+        <w:t>[A2] Nasal Bleeding as a Potential Side Effect of Omega-3 Fatty Acids: A Case Report. 2026. 10.2174/0115748863448971260303083058</w:t>
       </w:r>
     </w:p>
     <w:p>
@@ -1559,7 +1559,7 @@
         <w:pStyle w:val="ListNumber"/>
       </w:pPr>
       <w:r>
-        <w:t>[A2] Fish oil interaction with warfarin.. 2004.0. 10.1345/aph.1d007</w:t>
+        <w:t>[A2] The assessment of risk for gastrointestinal injury with anticoagulant and antiplatelet drugs: the possible beneficial effect of eicosapentaenoic Acid for the risk of gastrointestinal injury. 2013. 10.1248/bpb.b12-00584</w:t>
       </w:r>
     </w:p>
     <w:p>
@@ -1567,7 +1567,7 @@
         <w:pStyle w:val="ListNumber"/>
       </w:pPr>
       <w:r>
-        <w:t>[A2] Nasal Bleeding as a Potential Side Effect of Omega-3 Fatty Acids: A Case Report.. 2026.0. 10.2174/0115748863448971260303083058</w:t>
+        <w:t>[A2] Plasma triacylglycerol and coagulation factor concentrations predict the anticoagulant effect of dietary fish oil in overweight subjects. 2007. 10.1093/jn/137.1.7</w:t>
       </w:r>
     </w:p>
     <w:p>
@@ -1575,7 +1575,7 @@
         <w:pStyle w:val="ListNumber"/>
       </w:pPr>
       <w:r>
-        <w:t>[A2] The assessment of risk for gastrointestinal injury with anticoagulant and antiplatelet drugs: the possible beneficial effect of eicosapentaenoic Acid for the risk of gastrointestinal injury.. 2013.0. 10.1248/bpb.b12-00584</w:t>
+        <w:t>[A2] Extremely prolonged INR associated with warfarin in combination with both trazodone and omega-3 fatty acids. 2007. 10.1016/j.arcmed.2007.05.004</w:t>
       </w:r>
     </w:p>
     <w:p>
@@ -1583,7 +1583,7 @@
         <w:pStyle w:val="ListNumber"/>
       </w:pPr>
       <w:r>
-        <w:t>[A2] Extremely prolonged INR associated with warfarin in combination with both trazodone and omega-3 fatty acids.. 2007.0. 10.1016/j.arcmed.2007.05.004</w:t>
+        <w:t>[A2] Fish oil interaction with warfarin. 2004. 10.1345/aph.1d007</w:t>
       </w:r>
     </w:p>
     <w:p>
@@ -1591,7 +1591,7 @@
         <w:pStyle w:val="ListNumber"/>
       </w:pPr>
       <w:r>
-        <w:t>[A2] Effects of Marine Fish Oils on the Anticoagulation Status of Patients Receiving Chronic Warfarin Therapy.. 1998.0. 10.1023/a:1008852127668</w:t>
+        <w:t>[A2] Effects of Marine Fish Oils on the Anticoagulation Status of Patients Receiving Chronic Warfarin Therapy. 1998. 10.1023/a:1008852127668</w:t>
       </w:r>
     </w:p>
     <w:p>
@@ -1599,7 +1599,7 @@
         <w:pStyle w:val="ListNumber"/>
       </w:pPr>
       <w:r>
-        <w:t>[A2] Omega-3 Fatty Acid Supplementation and Warfarin: A Lethal Combination in Traumatic Brain Injury.. 2017.0. 10.1097/jtn.0000000000000256</w:t>
+        <w:t>[A2] Omega-3 Fatty Acid Supplementation and Warfarin: A Lethal Combination in Traumatic Brain Injury. 2017. 10.1097/jtn.0000000000000256</w:t>
       </w:r>
     </w:p>
     <w:p>
@@ -1607,7 +1607,7 @@
         <w:pStyle w:val="ListNumber"/>
       </w:pPr>
       <w:r>
-        <w:t>[B1] Diet, fluid, or supplements for secondary prevention of nephrolithiasis: a systematic review and meta-analysis of randomized trials.. 2009.0. 10.1016/j.eururo.2009.03.031</w:t>
+        <w:t>[B1] Diet, fluid, or supplements for secondary prevention of nephrolithiasis: a systematic review and meta-analysis of randomized trials. 2009. 10.1016/j.eururo.2009.03.031</w:t>
       </w:r>
     </w:p>
     <w:p>
@@ -1615,7 +1615,7 @@
         <w:pStyle w:val="ListNumber"/>
       </w:pPr>
       <w:r>
-        <w:t>[B1] Why oral calcium supplements may reduce renal stone disease: report of a clinical pilot study.. 2001.0. 10.1136/jcp.54.1.54</w:t>
+        <w:t>[B1] Why oral calcium supplements may reduce renal stone disease: report of a clinical pilot study. 2001. 10.1136/jcp.54.1.54</w:t>
       </w:r>
     </w:p>
     <w:p>
@@ -1623,7 +1623,7 @@
         <w:pStyle w:val="ListNumber"/>
       </w:pPr>
       <w:r>
-        <w:t>[B1] Effect of dietary treatment and fluid intake on the prevention of recurrent calcium stones and changes in urine composition: A meta-analysis and systematic review.. 2021.0. 10.1371/journal.pone.0250257</w:t>
+        <w:t>[B1] Effect of dietary treatment and fluid intake on the prevention of recurrent calcium stones and changes in urine composition: A meta-analysis and systematic review. 2021. 10.1371/journal.pone.0250257</w:t>
       </w:r>
     </w:p>
     <w:p>
@@ -1631,7 +1631,7 @@
         <w:pStyle w:val="ListNumber"/>
       </w:pPr>
       <w:r>
-        <w:t>[B1] Incidence of hypercalciuria and hypercalcemia during vitamin D and calcium supplementation in older women.. 2014.0. 10.1097/gme.0000000000000270</w:t>
+        <w:t>[B1] Incidence of hypercalciuria and hypercalcemia during vitamin D and calcium supplementation in older women. 2014. 10.1097/gme.0000000000000270</w:t>
       </w:r>
     </w:p>
     <w:p>
@@ -1639,7 +1639,7 @@
         <w:pStyle w:val="ListNumber"/>
       </w:pPr>
       <w:r>
-        <w:t>[B1] Dietary and lifestyle factors for primary prevention of nephrolithiasis: a systematic review and meta-analysis.. 2020.0. 10.1186/s12882-020-01925-3</w:t>
+        <w:t>[B1] Dietary and lifestyle factors for primary prevention of nephrolithiasis: a systematic review and meta-analysis. 2020. 10.1186/s12882-020-01925-3</w:t>
       </w:r>
     </w:p>
     <w:p>
@@ -1647,7 +1647,7 @@
         <w:pStyle w:val="ListNumber"/>
       </w:pPr>
       <w:r>
-        <w:t>[B1] Pathophysiology of renal calcium handling in acromegaly: what lies behind hypercalciuria?. 2012.0. 10.1210/jc.2011-3188</w:t>
+        <w:t>[B1] Pathophysiology of renal calcium handling in acromegaly: what lies behind hypercalciuria?. 2012. 10.1210/jc.2011-3188</w:t>
       </w:r>
     </w:p>
     <w:p>
@@ -1655,7 +1655,7 @@
         <w:pStyle w:val="ListNumber"/>
       </w:pPr>
       <w:r>
-        <w:t>[B1] Risk of calcium oxalate nephrolithiasis in postmenopausal women supplemented with calcium or combined calcium and estrogen.. 2002.0. 10.1016/s0378-5122(01)00277-8</w:t>
+        <w:t>[B1] Risk of calcium oxalate nephrolithiasis in postmenopausal women supplemented with calcium or combined calcium and estrogen. 2002. 10.1016/s0378-5122(01)00277-8</w:t>
       </w:r>
     </w:p>
     <w:p>
@@ -1663,7 +1663,7 @@
         <w:pStyle w:val="ListNumber"/>
       </w:pPr>
       <w:r>
-        <w:t>[B1] Diets with either beef or plant proteins reduce risk of calcium oxalate precipitation in patients with a history of calcium kidney stones.. 2001.0. 10.1016/s0002-8223(01)00085-2</w:t>
+        <w:t>[B1] Substituting milk for apple juice does not increase kidney stone risk in most normocalciuric adults who form calcium oxalate stones. 1998. 10.1016/s0002-8223(98)00071-6</w:t>
       </w:r>
     </w:p>
     <w:p>
@@ -1671,7 +1671,7 @@
         <w:pStyle w:val="ListNumber"/>
       </w:pPr>
       <w:r>
-        <w:t>[B1] Substituting milk for apple juice does not increase kidney stone risk in most normocalciuric adults who form calcium oxalate stones.. 1998.0. 10.1016/s0002-8223(98)00071-6</w:t>
+        <w:t>[B1] Randomized controlled trial of a low animal protein, high fiber diet in the prevention of recurrent calcium oxalate kidney stones. 1996. 10.1093/oxfordjournals.aje.a008851</w:t>
       </w:r>
     </w:p>
     <w:p>
@@ -1679,7 +1679,7 @@
         <w:pStyle w:val="ListNumber"/>
       </w:pPr>
       <w:r>
-        <w:t>[B1] Randomized controlled trial of a low animal protein, high fiber diet in the prevention of recurrent calcium oxalate kidney stones.. 1996.0. 10.1093/oxfordjournals.aje.a008851</w:t>
+        <w:t>[B1] Hypercalcemia, hypercalciuria, and kidney stones in long-term studies of vitamin D supplementation: a systematic review and meta-analysis. 2016. 10.3945/ajcn.116.134981</w:t>
       </w:r>
     </w:p>
     <w:p>
@@ -1687,7 +1687,7 @@
         <w:pStyle w:val="ListNumber"/>
       </w:pPr>
       <w:r>
-        <w:t>[B1] Hypercalcemia, hypercalciuria, and kidney stones in long-term studies of vitamin D supplementation: a systematic review and meta-analysis.. 2016.0. 10.3945/ajcn.116.134981</w:t>
+        <w:t>[B1] Calcium supplementation and kidney stone risk in osteoporosis: a systematic literature review. 2012. https://pubmed.ncbi.nlm.nih.gov/23137489/</w:t>
       </w:r>
     </w:p>
     <w:p>
@@ -1695,7 +1695,7 @@
         <w:pStyle w:val="ListNumber"/>
       </w:pPr>
       <w:r>
-        <w:t>[B1] Calcium supplementation and kidney stone risk in osteoporosis: a systematic literature review.. 2012.0. https://pubmed.ncbi.nlm.nih.gov/23137489/</w:t>
+        <w:t>[B1] Calcium supplementation and incident kidney stone risk: a systematic review. 2008. 10.1080/07315724.2008.10719734</w:t>
       </w:r>
     </w:p>
     <w:p>
@@ -1703,7 +1703,7 @@
         <w:pStyle w:val="ListNumber"/>
       </w:pPr>
       <w:r>
-        <w:t>[B1] Calcium supplementation and incident kidney stone risk: a systematic review.. 2008.0. 10.1080/07315724.2008.10719734</w:t>
+        <w:t>[B1] Comparison of two diets for the prevention of recurrent stones in idiopathic hypercalciuria. 2002. 10.1056/nejmoa010369</w:t>
       </w:r>
     </w:p>
     <w:p>
@@ -1711,7 +1711,7 @@
         <w:pStyle w:val="ListNumber"/>
       </w:pPr>
       <w:r>
-        <w:t>[B1] Schedule of taking calcium supplement and the risk of nephrolithiasis.. 2004.0. 10.1111/j.1523-1755.2004.00587.x</w:t>
+        <w:t>[B1] Risk of calcium oxalate nephrolithiasis after calcium or combined calcium and calcitriol supplementation in postmenopausal women. 2000. 10.1007/s001980070090</w:t>
       </w:r>
     </w:p>
     <w:p>
@@ -1719,7 +1719,7 @@
         <w:pStyle w:val="ListNumber"/>
       </w:pPr>
       <w:r>
-        <w:t>[B1] Effect of dietary calcium on stone forming propensity.. 2003.0. 10.1097/01.ju.0000043669.63989.22</w:t>
+        <w:t>[B1] Stone-forming potential of milk or calcium-fortified orange juice in idiopathic hypercalciuric adults. 1992. 10.1038/ki.1992.18</w:t>
       </w:r>
     </w:p>
     <w:p>
@@ -1727,7 +1727,7 @@
         <w:pStyle w:val="ListNumber"/>
       </w:pPr>
       <w:r>
-        <w:t>[B1] Comparison of two diets for the prevention of recurrent stones in idiopathic hypercalciuria.. 2002.0. 10.1056/nejmoa010369</w:t>
+        <w:t>[B1] The impact of vitamin D supplementation on vitamin D level, urinary calcium excretion and bone density in patients with hypercalciuria and vitamin D deficiency - preliminary report. 2018. 10.34763/devperiodmed.20182202.144152</w:t>
       </w:r>
     </w:p>
     <w:p>
@@ -1735,7 +1735,7 @@
         <w:pStyle w:val="ListNumber"/>
       </w:pPr>
       <w:r>
-        <w:t>[B1] Low-calcium diet in hypercalciuric enuretic children restores AQP2 excretion and improves clinical symptoms.. 2002.0. 10.1152/ajprenal.00354.2001</w:t>
+        <w:t>[B1] Association between calcium and vitamin D supplementation and increased risk of kidney stone formation in patients with osteoporosis in Southwest China: a cross-sectional study. 2025. 10.1136/bmjopen-2024-092901</w:t>
       </w:r>
     </w:p>
     <w:p>
@@ -1743,7 +1743,7 @@
         <w:pStyle w:val="ListNumber"/>
       </w:pPr>
       <w:r>
-        <w:t>[B1] Prolonged dietary calcium restriction: a diagnostic approach in idiopathic hypercalciuria.. 2001.0. 10.1159/000046108</w:t>
+        <w:t>[B1] Heritability of dietary traits that contribute to nephrolithiasis in a cohort of adult sibships. 2016. 10.1007/s40620-015-0204-2</w:t>
       </w:r>
     </w:p>
     <w:p>
@@ -1751,7 +1751,7 @@
         <w:pStyle w:val="ListNumber"/>
       </w:pPr>
       <w:r>
-        <w:t>[B1] Risk of calcium oxalate nephrolithiasis after calcium or combined calcium and calcitriol supplementation in postmenopausal women.. 2000.0. 10.1007/s001980070090</w:t>
+        <w:t>[B1] Renal response to lithogenic and anti-lithogenic supplement challenges in a stone-free population group. 2004. 10.1053/j.jrn.2004.04.007</w:t>
       </w:r>
     </w:p>
     <w:p>
@@ -1759,7 +1759,7 @@
         <w:pStyle w:val="ListNumber"/>
       </w:pPr>
       <w:r>
-        <w:t>[B1] Sensitivity to calcium intake in calcium stone forming patients.. 1996.0. 10.1159/000189031</w:t>
+        <w:t>[B1] Diets with either beef or plant proteins reduce risk of calcium oxalate precipitation in patients with a history of calcium kidney stones. 2001. 10.1016/s0002-8223(01)00085-2</w:t>
       </w:r>
     </w:p>
     <w:p>
@@ -1767,7 +1767,7 @@
         <w:pStyle w:val="ListNumber"/>
       </w:pPr>
       <w:r>
-        <w:t>[B1] Stone-forming potential of milk or calcium-fortified orange juice in idiopathic hypercalciuric adults.. 1992.0. 10.1038/ki.1992.18</w:t>
+        <w:t>[B1] Magnesium, citrate, magnesium citrate and magnesium-alkali citrate as modulators of calcium oxalate crystallization in urine: observations in patients with recurrent idiopathic calcium urolithiasis. 1999. 10.1007/s002400050097</w:t>
       </w:r>
     </w:p>
     <w:p>
@@ -1775,7 +1775,7 @@
         <w:pStyle w:val="ListNumber"/>
       </w:pPr>
       <w:r>
-        <w:t>[B1] The impact of vitamin D supplementation on vitamin D level, urinary calcium excretion and bone density in patients with hypercalciuria and vitamin D deficiency - preliminary report.. 2018.0. 10.34763/devperiodmed.20182202.144152</w:t>
+        <w:t>[B1] Relationship of hypercalciuria to diet and bladder stone formation in spinal cord injury patients. 1984. https://pubmed.ncbi.nlm.nih.gov/6380301/</w:t>
       </w:r>
     </w:p>
     <w:p>
@@ -1783,7 +1783,7 @@
         <w:pStyle w:val="ListNumber"/>
       </w:pPr>
       <w:r>
-        <w:t>[B1] Urinary calcium-to-citrate ratio predicts kidney stone risk in children under the age of two years.. 2026.0. 10.1007/s00467-026-07191-z</w:t>
+        <w:t>[B1] Lowering urinary oxalate excretion to decrease calcium oxalate stone disease. 2016. 10.1007/s00240-015-0839-4</w:t>
       </w:r>
     </w:p>
     <w:p>
@@ -1791,7 +1791,7 @@
         <w:pStyle w:val="ListNumber"/>
       </w:pPr>
       <w:r>
-        <w:t>[B1] Association between calcium and vitamin D supplementation and increased risk of kidney stone formation in patients with osteoporosis in Southwest China: a cross-sectional study.. 2025.0. 10.1136/bmjopen-2024-092901</w:t>
+        <w:t>[B1] Biochemical control of bone loss and stone-forming propensity by potassium-calcium citrate after bariatric surgery. 2012. 10.1016/j.soard.2011.05.001</w:t>
       </w:r>
     </w:p>
     <w:p>
@@ -1799,7 +1799,7 @@
         <w:pStyle w:val="ListNumber"/>
       </w:pPr>
       <w:r>
-        <w:t>[B1] Effectiveness of Subap Plus, a Polyherbal Medicine, on 24-Hour Urinalysis and Early Morning Urine pH in Recurrent Calcium Oxalate Stone Formers: A Pilot Study.. 2025.0. 10.7759/cureus.87764</w:t>
+        <w:t>[B1] Schedule of taking calcium supplement and the risk of nephrolithiasis. 2004. 10.1111/j.1523-1755.2004.00587.x</w:t>
       </w:r>
     </w:p>
     <w:p>
@@ -1807,7 +1807,7 @@
         <w:pStyle w:val="ListNumber"/>
       </w:pPr>
       <w:r>
-        <w:t>[B1] Temporal Trends of Dietary Risk Factors after a Diagnosis of Kidney Stones.. 2022.0. 10.2215/cjn.09200721</w:t>
+        <w:t>[B1] Effect of dietary calcium on stone forming propensity. 2003. 10.1097/01.ju.0000043669.63989.22</w:t>
       </w:r>
     </w:p>
     <w:p>
@@ -1815,7 +1815,7 @@
         <w:pStyle w:val="ListNumber"/>
       </w:pPr>
       <w:r>
-        <w:t>[B1] Heritability of dietary traits that contribute to nephrolithiasis in a cohort of adult sibships.. 2016.0. 10.1007/s40620-015-0204-2</w:t>
+        <w:t>[B1] Prolonged dietary calcium restriction: a diagnostic approach in idiopathic hypercalciuria. 2001. 10.1159/000046108</w:t>
       </w:r>
     </w:p>
     <w:p>
@@ -1823,7 +1823,7 @@
         <w:pStyle w:val="ListNumber"/>
       </w:pPr>
       <w:r>
-        <w:t>[B1] Calcium and vitamin D supplementation and risk of kidney stone formation in postmenopausal women.. 2013.0. https://pubmed.ncbi.nlm.nih.gov/23689153/</w:t>
+        <w:t>[B1] Effect of mineral water containing calcium and magnesium on calcium oxalate urolithiasis risk factors. 1997. 10.1159/000282958</w:t>
       </w:r>
     </w:p>
     <w:p>
@@ -1831,7 +1831,7 @@
         <w:pStyle w:val="ListNumber"/>
       </w:pPr>
       <w:r>
-        <w:t>[B1] Renal response to lithogenic and anti-lithogenic supplement challenges in a stone-free population group.. 2004.0. 10.1053/j.jrn.2004.04.007</w:t>
+        <w:t>[B1] Sensitivity to calcium intake in calcium stone forming patients. 1996. 10.1159/000189031</w:t>
       </w:r>
     </w:p>
     <w:p>
@@ -1839,7 +1839,7 @@
         <w:pStyle w:val="ListNumber"/>
       </w:pPr>
       <w:r>
-        <w:t>[B1] Magnesium, citrate, magnesium citrate and magnesium-alkali citrate as modulators of calcium oxalate crystallization in urine: observations in patients with recurrent idiopathic calcium urolithiasis.. 1999.0. 10.1007/s002400050097</w:t>
+        <w:t>[B1] Dietary Recommendations for Bariatric Patients to Prevent Kidney Stone Formation. 2020. 10.3390/nu12051442</w:t>
       </w:r>
     </w:p>
     <w:p>
@@ -1847,7 +1847,7 @@
         <w:pStyle w:val="ListNumber"/>
       </w:pPr>
       <w:r>
-        <w:t>[B2] Effect of two vitamin D repletion protocols on 24-h urine calcium in patients with recurrent calcium kidney stones and vitamin D deficiency: a randomized clinical trial.. 2023.0. 10.1186/s40001-023-01226-z</w:t>
+        <w:t>[B2] Effect of two vitamin D repletion protocols on 24-h urine calcium in patients with recurrent calcium kidney stones and vitamin D deficiency: a randomized clinical trial. 2023. 10.1186/s40001-023-01226-z</w:t>
       </w:r>
     </w:p>
     <w:p>
@@ -1855,7 +1855,7 @@
         <w:pStyle w:val="ListNumber"/>
       </w:pPr>
       <w:r>
-        <w:t>[B2] Risk of hypercalcemia in blacks taking hydrochlorothiazide and vitamin D.. 2014.0. 10.1016/j.amjmed.2014.02.044</w:t>
+        <w:t>[B2] Risk of hypercalcemia in blacks taking hydrochlorothiazide and vitamin D. 2014. 10.1016/j.amjmed.2014.02.044</w:t>
       </w:r>
     </w:p>
     <w:p>
@@ -1863,7 +1863,7 @@
         <w:pStyle w:val="ListNumber"/>
       </w:pPr>
       <w:r>
-        <w:t>[B2] Incidence of hypercalciuria and hypercalcemia during vitamin D and calcium supplementation in older women.. 2014.0. 10.1097/gme.0000000000000270</w:t>
+        <w:t>[B2] Incidence of hypercalciuria and hypercalcemia during vitamin D and calcium supplementation in older women. 2014. 10.1097/gme.0000000000000270</w:t>
       </w:r>
     </w:p>
     <w:p>
@@ -1871,7 +1871,7 @@
         <w:pStyle w:val="ListNumber"/>
       </w:pPr>
       <w:r>
-        <w:t>[B2] Association Between Vitamin D Supplementation and Urolithiasis Recurrence Outcomes in Known Stone Formers: A Retrospective Cohort Study With Dose-Response Analysis.. 2025.0. 10.7759/cureus.90853</w:t>
+        <w:t>[B2] A 250 μg/week dose of vitamin D was as effective as a 50 μg/d dose in healthy adults, but a regimen of four weekly followed by monthly doses of 1250 μg raised the risk of hypercalciuria. 2013. 10.1017/s000711451300113x</w:t>
       </w:r>
     </w:p>
     <w:p>
@@ -1879,7 +1879,7 @@
         <w:pStyle w:val="ListNumber"/>
       </w:pPr>
       <w:r>
-        <w:t>[B2] A 250 μg/week dose of vitamin D was as effective as a 50 μg/d dose in healthy adults, but a regimen of four weekly followed by monthly doses of 1250 μg raised the risk of hypercalciuria.. 2013.0. 10.1017/s000711451300113x</w:t>
+        <w:t>[B2] Monthly high-dose vitamin D supplementation does not increase kidney stone risk or serum calcium: results from a randomized controlled trial. 2019. 10.1093/ajcn/nqy378</w:t>
       </w:r>
     </w:p>
     <w:p>
@@ -1887,7 +1887,7 @@
         <w:pStyle w:val="ListNumber"/>
       </w:pPr>
       <w:r>
-        <w:t>[B2] Monthly high-dose vitamin D supplementation does not increase kidney stone risk or serum calcium: results from a randomized controlled trial.. 2019.0. 10.1093/ajcn/nqy378</w:t>
+        <w:t>[B2] Vitamin D Repletion in Kidney Stone Formers: A Randomized Controlled Trial. 2017. 10.1016/j.juro.2016.10.057</w:t>
       </w:r>
     </w:p>
     <w:p>
@@ -1895,7 +1895,7 @@
         <w:pStyle w:val="ListNumber"/>
       </w:pPr>
       <w:r>
-        <w:t>[B2] Vitamin D Repletion in Kidney Stone Formers: A Randomized Controlled Trial.. 2017.0. 10.1016/j.juro.2016.10.057</w:t>
+        <w:t>[B2] No Severe Hypercalcemia with Daily Vitamin D3 Supplementation of up to 30 µg during the First Year of Life. 2017. 10.1159/000477298</w:t>
       </w:r>
     </w:p>
     <w:p>
@@ -1903,7 +1903,7 @@
         <w:pStyle w:val="ListNumber"/>
       </w:pPr>
       <w:r>
-        <w:t>[B2] No Severe Hypercalcemia with Daily Vitamin D3 Supplementation of up to 30 µg during the First Year of Life.. 2017.0. 10.1159/000477298</w:t>
+        <w:t>[B2] Hypercalcemia, hypercalciuria, and kidney stones in long-term studies of vitamin D supplementation: a systematic review and meta-analysis. 2016. 10.3945/ajcn.116.134981</w:t>
       </w:r>
     </w:p>
     <w:p>
@@ -1911,7 +1911,7 @@
         <w:pStyle w:val="ListNumber"/>
       </w:pPr>
       <w:r>
-        <w:t>[B2] Hypercalcemia, hypercalciuria, and kidney stones in long-term studies of vitamin D supplementation: a systematic review and meta-analysis.. 2016.0. 10.3945/ajcn.116.134981</w:t>
+        <w:t>[B2] Association Between Vitamin D Supplementation and Urolithiasis Recurrence Outcomes in Known Stone Formers: A Retrospective Cohort Study With Dose-Response Analysis. 2025. 10.7759/cureus.90853</w:t>
       </w:r>
     </w:p>
     <w:p>
@@ -1919,7 +1919,7 @@
         <w:pStyle w:val="ListNumber"/>
       </w:pPr>
       <w:r>
-        <w:t>[B2] Effect of vitamin D repletion on urinary calcium excretion among kidney stone formers.. 2012.0. 10.2215/cjn.11331111</w:t>
+        <w:t>[B2] The impact of vitamin D supplementation on vitamin D level, urinary calcium excretion and bone density in patients with hypercalciuria and vitamin D deficiency - preliminary report. 2018. 10.34763/devperiodmed.20182202.144152</w:t>
       </w:r>
     </w:p>
     <w:p>
@@ -1927,7 +1927,7 @@
         <w:pStyle w:val="ListNumber"/>
       </w:pPr>
       <w:r>
-        <w:t>[B2] The impact of vitamin D supplementation on vitamin D level, urinary calcium excretion and bone density in patients with hypercalciuria and vitamin D deficiency - preliminary report.. 2018.0. 10.34763/devperiodmed.20182202.144152</w:t>
+        <w:t>[B2] Reduction in Hypercalcemia Following Readjustment of Target Serum 25-Hydroxy Vitamin D Concentration during Cholecalciferol Therapy in Vitamin D-Deficient Critically Ill Patients. 2022. 10.3390/nu14081650</w:t>
       </w:r>
     </w:p>
     <w:p>
@@ -1935,7 +1935,7 @@
         <w:pStyle w:val="ListNumber"/>
       </w:pPr>
       <w:r>
-        <w:t>[B2] Association between calcium and vitamin D supplementation and increased risk of kidney stone formation in patients with osteoporosis in Southwest China: a cross-sectional study.. 2025.0. 10.1136/bmjopen-2024-092901</w:t>
+        <w:t>[B2] Hypercalcemia during pulse vitamin D3 therapy in CAPD patients treated with low calcium dialysate: the role of the decreasing serum parathyroid hormone level. 1997. 10.1681/asn.v8101579</w:t>
       </w:r>
     </w:p>
     <w:p>
@@ -1943,7 +1943,7 @@
         <w:pStyle w:val="ListNumber"/>
       </w:pPr>
       <w:r>
-        <w:t>[B2] Reduction in Hypercalcemia Following Readjustment of Target Serum 25-Hydroxy Vitamin D Concentration during Cholecalciferol Therapy in Vitamin D-Deficient Critically Ill Patients.. 2022.0. 10.3390/nu14081650</w:t>
+        <w:t>[B2] Exacerbated hypercalcemia, nephrolithiasis, and renal impairment after vitamin D supplementation in granulomatous disease: a case report. 2025. 10.1186/s13256-025-05078-5</w:t>
       </w:r>
     </w:p>
     <w:p>
@@ -1951,7 +1951,7 @@
         <w:pStyle w:val="ListNumber"/>
       </w:pPr>
       <w:r>
-        <w:t>[B2] Comparison of Treatment Regimens in Management of Severe Hypercalcemia Due to Vitamin D Intoxication in Children.. 2019.0. 10.4274/jcrpe.galenos.2018.2018.0131</w:t>
+        <w:t>[B2] Vitamin D Intake and the Risk of Incident Kidney Stones. 2017. 10.1016/j.juro.2016.08.084</w:t>
       </w:r>
     </w:p>
     <w:p>
@@ -1959,7 +1959,7 @@
         <w:pStyle w:val="ListNumber"/>
       </w:pPr>
       <w:r>
-        <w:t>[B2] Calcium and vitamin D supplementation and risk of kidney stone formation in postmenopausal women.. 2013.0. https://pubmed.ncbi.nlm.nih.gov/23689153/</w:t>
+        <w:t>[B2] Effect of vitamin D repletion on urinary calcium excretion among kidney stone formers. 2012. 10.2215/cjn.11331111</w:t>
       </w:r>
     </w:p>
     <w:p>
@@ -1967,7 +1967,7 @@
         <w:pStyle w:val="ListNumber"/>
       </w:pPr>
       <w:r>
-        <w:t>[B2] Hypercalcemia during pulse vitamin D3 therapy in CAPD patients treated with low calcium dialysate: the role of the decreasing serum parathyroid hormone level.. 1997.0. 10.1681/asn.v8101579</w:t>
+        <w:t>[B2] Association between calcium and vitamin D supplementation and increased risk of kidney stone formation in patients with osteoporosis in Southwest China: a cross-sectional study. 2025. 10.1136/bmjopen-2024-092901</w:t>
       </w:r>
     </w:p>
     <w:p>
@@ -1975,7 +1975,7 @@
         <w:pStyle w:val="ListNumber"/>
       </w:pPr>
       <w:r>
-        <w:t>[B2] Idiopathic infantile hypercalcemia with a CYP24A1 variant triggered by vitamin D supplementation in fortified milk: A case report.. 2025.0. 10.1297/cpe.2024-0049</w:t>
+        <w:t>[B2] The Safety Profile of Vitamin D Supplements Using Real-World Data from 445,493 Participants of the UK Biobank: Slightly Higher Hypercalcemia Prevalence but Neither Increased Risks of Kidney Stones nor Atherosclerosis. 2024. 10.3390/nu16142251</w:t>
       </w:r>
     </w:p>
     <w:p>
@@ -1983,7 +1983,7 @@
         <w:pStyle w:val="ListNumber"/>
       </w:pPr>
       <w:r>
-        <w:t>[B2] Exacerbated hypercalcemia, nephrolithiasis, and renal impairment after vitamin D supplementation in granulomatous disease: a case report.. 2025.0. 10.1186/s13256-025-05078-5</w:t>
+        <w:t>[B2] Vitamin D and Calcium Supplementation and Urolithiasis: A Controversial and Multifaceted Relationship. 2023. 10.3390/nu15071724</w:t>
       </w:r>
     </w:p>
     <w:p>
@@ -1991,7 +1991,7 @@
         <w:pStyle w:val="ListNumber"/>
       </w:pPr>
       <w:r>
-        <w:t>[B2] Successful treatment with denosumab for two cases with hypercalcemia due to vitamin D intoxication and associated acute kidney injury.. 2022.0. 10.1007/s13730-021-00643-5</w:t>
+        <w:t>[B2] Safety of megadose of vitamin D in patients with nephrolithiasis. 2021. 10.1016/j.nut.2021.111201</w:t>
       </w:r>
     </w:p>
     <w:p>
@@ -1999,7 +1999,7 @@
         <w:pStyle w:val="ListNumber"/>
       </w:pPr>
       <w:r>
-        <w:t>[B2] Association of hypercalciuria with vitamin D supplementation in patients undergoing ketogenic dietary therapy.. 2022.0. 10.3389/fnut.2022.970467</w:t>
+        <w:t>[B2] Calcium and Vitamin D Supplementation and Their Association with Kidney Stone Disease: A Narrative Review. 2021. 10.3390/nu13124363</w:t>
       </w:r>
     </w:p>
     <w:p>
@@ -2007,7 +2007,7 @@
         <w:pStyle w:val="ListNumber"/>
       </w:pPr>
       <w:r>
-        <w:t>[B2] Effect of Vitamin D Treatment on Dynamics of Stones Formation in the Urinary Tract and Bone Density in Children with Idiopathic Hypercalciuria.. 2020.0. 10.3390/nu12092521</w:t>
+        <w:t>[B2] Combined vitamin D and calcium supplementation in vitamin D inadequate patients with urolithiasis: Impact on hypercalciuria and de novo stone formation. 2015. 10.5489/cuaj.3332</w:t>
       </w:r>
     </w:p>
     <w:p>
@@ -2015,7 +2015,7 @@
         <w:pStyle w:val="ListNumber"/>
       </w:pPr>
       <w:r>
-        <w:t>[B2] Effect of vitamin D supplementation on 24-hour urine calcium in patients with calcium Urolithiasis and vitamin D deficiency.. 2019.0. 10.1590/s1677-5538.ibju.2018.0522</w:t>
+        <w:t>[B2] Calcium and vitamin D supplementation and risk of kidney stone formation in postmenopausal women. 2013. https://pubmed.ncbi.nlm.nih.gov/23689153/</w:t>
       </w:r>
     </w:p>
     <w:p>
@@ -2023,7 +2023,7 @@
         <w:pStyle w:val="ListNumber"/>
       </w:pPr>
       <w:r>
-        <w:t>[B2] Vitamin D Intake and the Risk of Incident Kidney Stones.. 2017.0. 10.1016/j.juro.2016.08.084</w:t>
+        <w:t>[B2] Idiopathic infantile hypercalcemia with a CYP24A1 variant triggered by vitamin D supplementation in fortified milk: A case report. 2025. 10.1297/cpe.2024-0049</w:t>
       </w:r>
     </w:p>
     <w:p>
@@ -2031,7 +2031,7 @@
         <w:pStyle w:val="ListNumber"/>
       </w:pPr>
       <w:r>
-        <w:t>[B2] The Safety Profile of Vitamin D Supplements Using Real-World Data from 445,493 Participants of the UK Biobank: Slightly Higher Hypercalcemia Prevalence but Neither Increased Risks of Kidney Stones nor Atherosclerosis.. 2024.0. 10.3390/nu16142251</w:t>
+        <w:t>[B2] Hypercalcemia with the Oral Administration of Active Vitamin D3 and Chinese Herbal Medicine. 2025. 10.2169/internalmedicine.4431-24</w:t>
       </w:r>
     </w:p>
     <w:p>
@@ -2039,7 +2039,7 @@
         <w:pStyle w:val="ListNumber"/>
       </w:pPr>
       <w:r>
-        <w:t>[B2] Vitamin D and Calcium Supplementation and Urolithiasis: A Controversial and Multifaceted Relationship.. 2023.0. 10.3390/nu15071724</w:t>
+        <w:t>[B2] Normal 24-hour urine calcium concentrations after long-term daily oral intake of vitamin D in doses ranging from 5000 to 50,000 international units in 14 adult hospitalized psychiatric patients. 2023. 10.1016/j.jsbmb.2023.106329</w:t>
       </w:r>
     </w:p>
     <w:p>
@@ -2047,7 +2047,7 @@
         <w:pStyle w:val="ListNumber"/>
       </w:pPr>
       <w:r>
-        <w:t>[B2] Safety of megadose of vitamin D in patients with nephrolithiasis.. 2021.0. 10.1016/j.nut.2021.111201</w:t>
+        <w:t>[B2] Successful treatment with denosumab for two cases with hypercalcemia due to vitamin D intoxication and associated acute kidney injury. 2022. 10.1007/s13730-021-00643-5</w:t>
       </w:r>
     </w:p>
     <w:p>
@@ -2055,7 +2055,7 @@
         <w:pStyle w:val="ListNumber"/>
       </w:pPr>
       <w:r>
-        <w:t>[B2] Calcium and Vitamin D Supplementation and Their Association with Kidney Stone Disease: A Narrative Review.. 2021.0. 10.3390/nu13124363</w:t>
+        <w:t>[B2] Association of hypercalciuria with vitamin D supplementation in patients undergoing ketogenic dietary therapy. 2022. 10.3389/fnut.2022.970467</w:t>
       </w:r>
     </w:p>
     <w:p>
@@ -2063,7 +2063,7 @@
         <w:pStyle w:val="ListNumber"/>
       </w:pPr>
       <w:r>
-        <w:t>[B2] Combined vitamin D and calcium supplementation in vitamin D inadequate patients with urolithiasis: Impact on hypercalciuria and de novo stone formation.. 2015.0. 10.5489/cuaj.3332</w:t>
+        <w:t>[B2] Hypercalcemia worsened after vitamin D supplementation in a sarcoidosis patient: A case report. 2022. 10.1097/md.0000000000030883</w:t>
       </w:r>
     </w:p>
     <w:p>
@@ -2071,7 +2071,7 @@
         <w:pStyle w:val="ListNumber"/>
       </w:pPr>
       <w:r>
-        <w:t>[B2] Hypercalcemia in children receiving pharmacologic doses of vitamin D.. 2012.0. 10.1542/peds.2011-1663</w:t>
+        <w:t>[B2] Metabolic effects of cholecalciferol supplementation in patients with calcium nephrolithiasis and vitamin D deficiency. 2021. 10.1007/s00345-020-03222-y</w:t>
       </w:r>
     </w:p>
     <w:p>
@@ -2079,7 +2079,7 @@
         <w:pStyle w:val="ListNumber"/>
       </w:pPr>
       <w:r>
-        <w:t>[B2] Effect of combination treatment with a vitamin D analog (OCT) and a bisphosphonate (AHPrBP) in a nude mouse model of cancer-associated hypercalcemia.. 1998.0. 10.1359/jbmr.1998.13.9.1378</w:t>
+        <w:t>[B2] Hypercalcemia Without Hypervitaminosis D During Cholecalciferol Supplementation in Critically Ill Patients. 2020. 10.1002/ncp.10407</w:t>
       </w:r>
     </w:p>
     <w:p>
@@ -2087,7 +2087,7 @@
         <w:pStyle w:val="ListNumber"/>
       </w:pPr>
       <w:r>
-        <w:t>[B3] Ascorbic Acid Supplements and Kidney Stones Incidence Among Men and Women: A systematic review and meta-analysis.. 2019.0. 10.22037/uj.v0i0.4275</w:t>
+        <w:t>[B3] Ascorbic Acid Supplements and Kidney Stones Incidence Among Men and Women: A systematic review and meta-analysis. 2019. 10.22037/uj.v0i0.4275</w:t>
       </w:r>
     </w:p>
     <w:p>
@@ -2095,7 +2095,7 @@
         <w:pStyle w:val="ListNumber"/>
       </w:pPr>
       <w:r>
-        <w:t>[B3] Ascorbate increases human oxaluria and kidney stone risk.. 2005.0. 10.1093/jn/135.7.1673</w:t>
+        <w:t>[B3] Ascorbic acid-induced oxalate nephropathy: a case report and discussion of pathologic mechanisms. 2019. 10.1007/s13730-018-0366-6</w:t>
       </w:r>
     </w:p>
     <w:p>
@@ -2103,7 +2103,7 @@
         <w:pStyle w:val="ListNumber"/>
       </w:pPr>
       <w:r>
-        <w:t>[B3] Ascorbic acid in idiopathic recurrent calcium urolithiasis in humans--does it have an abettor role in oxalate, and calcium oxalate crystallization?. 2000.0. 10.1007/s002400000101</w:t>
+        <w:t>[B3] No Reported Renal Stones with Intravenous Vitamin C Administration: A Prospective Case Series Study. 2018. 10.3390/antiox7050068</w:t>
       </w:r>
     </w:p>
     <w:p>
@@ -2111,7 +2111,7 @@
         <w:pStyle w:val="ListNumber"/>
       </w:pPr>
       <w:r>
-        <w:t>[B3] Ascorbic acid overdosing: a risk factor for calcium oxalate nephrolithiasis.. 1992.0. 10.1016/s0022-5347(17)37521-3</w:t>
+        <w:t>[B3] A case report of renal oxalosis and secondary hyperoxaluria due to chronic high vitamin C consumption. 2025. 10.5414/cncs111462</w:t>
       </w:r>
     </w:p>
     <w:p>
@@ -2119,7 +2119,7 @@
         <w:pStyle w:val="ListNumber"/>
       </w:pPr>
       <w:r>
-        <w:t>[B3] Ascorbic acid-induced oxalate nephropathy: a case report and discussion of pathologic mechanisms.. 2019.0. 10.1007/s13730-018-0366-6</w:t>
+        <w:t>[B3] Vitamin C-induced hyperoxaluria causing reversible tubulointerstitial nephritis and chronic renal failure: a case report. 2007. 10.1186/1752-1947-1-155</w:t>
       </w:r>
     </w:p>
     <w:p>
@@ -2127,7 +2127,7 @@
         <w:pStyle w:val="ListNumber"/>
       </w:pPr>
       <w:r>
-        <w:t>[B3] No Reported Renal Stones with Intravenous Vitamin C Administration: A Prospective Case Series Study.. 2018.0. 10.3390/antiox7050068</w:t>
+        <w:t>[B3] Ascorbate increases human oxaluria and kidney stone risk. 2005. 10.1093/jn/135.7.1673</w:t>
       </w:r>
     </w:p>
     <w:p>
@@ -2135,7 +2135,7 @@
         <w:pStyle w:val="ListNumber"/>
       </w:pPr>
       <w:r>
-        <w:t>[B3] A case report of renal oxalosis and secondary hyperoxaluria due to chronic high vitamin C consumption.. 2025.0. 10.5414/cncs111462</w:t>
+        <w:t>[B3] Ascorbic acid in idiopathic recurrent calcium urolithiasis in humans--does it have an abettor role in oxalate, and calcium oxalate crystallization?. 2000. 10.1007/s002400000101</w:t>
       </w:r>
     </w:p>
     <w:p>
@@ -2143,7 +2143,7 @@
         <w:pStyle w:val="ListNumber"/>
       </w:pPr>
       <w:r>
-        <w:t>[B3] Is it safe to prescribe ascorbic acid for urinary acidification in stone-forming patients with alkaline urine?. 2017.0. 10.5152/tud.2017.02700</w:t>
+        <w:t>[B3] Ascorbic acid overdosing: a risk factor for calcium oxalate nephrolithiasis. 1992. 10.1016/s0022-5347(17)37521-3</w:t>
       </w:r>
     </w:p>
     <w:p>
@@ -2151,7 +2151,7 @@
         <w:pStyle w:val="ListNumber"/>
       </w:pPr>
       <w:r>
-        <w:t>[B3] Total, Dietary, and Supplemental Vitamin C Intake and Risk of Incident Kidney Stones.. 2016.0. 10.1053/j.ajkd.2015.09.005</w:t>
+        <w:t>[B3] Public Interest in Vitamin C Supplementation During the COVID-19 Pandemic as a Potential Risk for Oxalate Nephrolithiasis. 2025. 10.7759/cureus.79452</w:t>
       </w:r>
     </w:p>
     <w:p>
@@ -2159,7 +2159,7 @@
         <w:pStyle w:val="ListNumber"/>
       </w:pPr>
       <w:r>
-        <w:t>[B3] Vitamin C-induced hyperoxaluria causing reversible tubulointerstitial nephritis and chronic renal failure: a case report.. 2007.0. 10.1186/1752-1947-1-155</w:t>
+        <w:t>[B3] Vitamin C with metabolites reduce oxalate levels compared to ascorbic acid: a preliminary and novel clinical urologic finding. 2009. https://pubmed.ncbi.nlm.nih.gov/19507407/</w:t>
       </w:r>
     </w:p>
     <w:p>
@@ -2167,7 +2167,7 @@
         <w:pStyle w:val="ListNumber"/>
       </w:pPr>
       <w:r>
-        <w:t>[B3] Public Interest in Vitamin C Supplementation During the COVID-19 Pandemic as a Potential Risk for Oxalate Nephrolithiasis.. 2025.0. 10.7759/cureus.79452</w:t>
+        <w:t>[B3] No contribution of ascorbic acid to renal calcium oxalate stones. 1997. 10.1159/000177954</w:t>
       </w:r>
     </w:p>
     <w:p>
@@ -2175,7 +2175,7 @@
         <w:pStyle w:val="ListNumber"/>
       </w:pPr>
       <w:r>
-        <w:t>[B3] Vitamin C with metabolites reduce oxalate levels compared to ascorbic acid: a preliminary and novel clinical urologic finding.. 2009.0. https://pubmed.ncbi.nlm.nih.gov/19507407/</w:t>
+        <w:t>[B3] Acute oxalate nephropathy due to high vitamin C doses and exocrine pancreatic insufficiency. 2019. 10.1136/bcr-2019-231504</w:t>
       </w:r>
     </w:p>
     <w:p>
@@ -2183,7 +2183,7 @@
         <w:pStyle w:val="ListNumber"/>
       </w:pPr>
       <w:r>
-        <w:t>[B3] Oxalate absorption and endogenous oxalate synthesis from ascorbate in calcium oxalate stone formers and non-stone formers.. 2004.0. 10.1053/j.ajkd.2004.08.028</w:t>
+        <w:t>[B3] Is it safe to prescribe ascorbic acid for urinary acidification in stone-forming patients with alkaline urine?. 2017. 10.5152/tud.2017.02700</w:t>
       </w:r>
     </w:p>
     <w:p>
@@ -2191,7 +2191,7 @@
         <w:pStyle w:val="ListNumber"/>
       </w:pPr>
       <w:r>
-        <w:t>[B3] The effect of ascorbic acid ingestion on the biochemical and physicochemical risk factors associated with calcium oxalate kidney stone formation.. 1998.0. 10.1515/cclm.1998.027</w:t>
+        <w:t>[B3] Total, Dietary, and Supplemental Vitamin C Intake and Risk of Incident Kidney Stones. 2016. 10.1053/j.ajkd.2015.09.005</w:t>
       </w:r>
     </w:p>
     <w:p>
@@ -2199,7 +2199,7 @@
         <w:pStyle w:val="ListNumber"/>
       </w:pPr>
       <w:r>
-        <w:t>[B3] Postprandial hyperinsulinaemia, insulin resistance and inappropriately high phosphaturia are features of younger males with idiopathic calcium urolithiasis: attenuation by ascorbic acid supplementation of a test meal.. 1997.0. 10.1007/bf00941906</w:t>
+        <w:t>[B3] A case of reversible hyperoxaluria nephropathy early after roux-en-y-gastric bypass induced by vitamin C intake. 2016. 10.1093/omcr/omw054</w:t>
       </w:r>
     </w:p>
     <w:p>
@@ -2207,7 +2207,7 @@
         <w:pStyle w:val="ListNumber"/>
       </w:pPr>
       <w:r>
-        <w:t>[B3] No contribution of ascorbic acid to renal calcium oxalate stones.. 1997.0. 10.1159/000177954</w:t>
+        <w:t>[B3] Urinary oxalate excretion increases in home parenteral nutrition patients on a higher intravenous ascorbic acid dose. 2004. 10.1177/0148607104028006435</w:t>
       </w:r>
     </w:p>
     <w:p>
@@ -2215,7 +2215,7 @@
         <w:pStyle w:val="ListNumber"/>
       </w:pPr>
       <w:r>
-        <w:t>[B3] Acute oxalate nephropathy due to high vitamin C doses and exocrine pancreatic insufficiency.. 2019.0. 10.1136/bcr-2019-231504</w:t>
+        <w:t>[B3] Effect of megadoses of ascorbic acid on serum and urinary oxalate. 1980. 10.1159/000473318</w:t>
       </w:r>
     </w:p>
     <w:p>
@@ -2223,7 +2223,7 @@
         <w:pStyle w:val="ListNumber"/>
       </w:pPr>
       <w:r>
-        <w:t>[B3] A case of reversible hyperoxaluria nephropathy early after roux-en-y-gastric bypass induced by vitamin C intake.. 2016.0. 10.1093/omcr/omw054</w:t>
+        <w:t>[B3] Vitamin C-induced oxalate nephropathy. 2011. 10.4061/2011/146927</w:t>
       </w:r>
     </w:p>
     <w:p>
@@ -2231,7 +2231,7 @@
         <w:pStyle w:val="ListNumber"/>
       </w:pPr>
       <w:r>
-        <w:t>[B3] Urinary oxalate excretion increases in home parenteral nutrition patients on a higher intravenous ascorbic acid dose.. 2004.0. 10.1177/0148607104028006435</w:t>
+        <w:t>[B3] Ascorbic acid is an abettor in calcium urolithiasis: an experimental study. 1993. https://pubmed.ncbi.nlm.nih.gov/8146605/</w:t>
       </w:r>
     </w:p>
     <w:p>
@@ -2239,7 +2239,7 @@
         <w:pStyle w:val="ListNumber"/>
       </w:pPr>
       <w:r>
-        <w:t>[B3] Relation of serum ascorbic acid to serum vitamin B12, serum ferritin, and kidney stones in US adults.. 1999.0. 10.1001/archinte.159.6.619</w:t>
+        <w:t>[B3] Oxalate absorption and endogenous oxalate synthesis from ascorbate in calcium oxalate stone formers and non-stone formers. 2004. 10.1053/j.ajkd.2004.08.028</w:t>
       </w:r>
     </w:p>
     <w:p>
@@ -2247,7 +2247,7 @@
         <w:pStyle w:val="ListNumber"/>
       </w:pPr>
       <w:r>
-        <w:t>[B3] Effect of megadoses of ascorbic acid on serum and urinary oxalate.. 1980.0. 10.1159/000473318</w:t>
+        <w:t>[B3] The effect of ascorbic acid ingestion on the biochemical and physicochemical risk factors associated with calcium oxalate kidney stone formation. 1998. 10.1515/cclm.1998.027</w:t>
       </w:r>
     </w:p>
     <w:p>
@@ -2255,7 +2255,7 @@
         <w:pStyle w:val="ListNumber"/>
       </w:pPr>
       <w:r>
-        <w:t>[B3] Vitamin C-induced oxalate nephropathy.. 2011.0. 10.4061/2011/146927</w:t>
+        <w:t>[B3] Postprandial hyperinsulinaemia, insulin resistance and inappropriately high phosphaturia are features of younger males with idiopathic calcium urolithiasis: attenuation by ascorbic acid supplementation of a test meal. 1997. 10.1007/bf00941906</w:t>
       </w:r>
     </w:p>
     <w:p>
@@ -2263,7 +2263,7 @@
         <w:pStyle w:val="ListNumber"/>
       </w:pPr>
       <w:r>
-        <w:t>[B3] Ascorbic acid is an abettor in calcium urolithiasis: an experimental study.. 1993.0. https://pubmed.ncbi.nlm.nih.gov/8146605/</w:t>
+        <w:t>[B3] Relation of serum ascorbic acid to serum vitamin B12, serum ferritin, and kidney stones in US adults. 1999. 10.1001/archinte.159.6.619</w:t>
       </w:r>
     </w:p>
     <w:p>
@@ -2271,7 +2271,7 @@
         <w:pStyle w:val="ListNumber"/>
       </w:pPr>
       <w:r>
-        <w:t>[B3] High-dose supplementation with vitamin C--induced pediatric urolithiasis: the first case report in a child and literature review.. 2014.0. 10.1016/j.urology.2014.07.021</w:t>
+        <w:t>[B3] Relative hyperoxaluria, crystalluria and haematuria after megadose ingestion of vitamin C. 1998. 10.1046/j.1365-2362.1998.00349.x</w:t>
       </w:r>
     </w:p>
     <w:p>
@@ -2279,7 +2279,7 @@
         <w:pStyle w:val="ListNumber"/>
       </w:pPr>
       <w:r>
-        <w:t>[B3] Relative hyperoxaluria, crystalluria and haematuria after megadose ingestion of vitamin C.. 1998.0. 10.1046/j.1365-2362.1998.00349.x</w:t>
+        <w:t>[B3] Oxalate metabolism in end-stage renal disease: the effect of ascorbic acid and pyridoxine. 1988. https://pubmed.ncbi.nlm.nih.gov/3132636/</w:t>
       </w:r>
     </w:p>
     <w:p>
@@ -2287,15 +2287,7 @@
         <w:pStyle w:val="ListNumber"/>
       </w:pPr>
       <w:r>
-        <w:t>[B3] Oxalate metabolism in end-stage renal disease: the effect of ascorbic acid and pyridoxine.. 1988.0. https://pubmed.ncbi.nlm.nih.gov/3132636/</w:t>
-      </w:r>
-    </w:p>
-    <w:p>
-      <w:pPr>
-        <w:pStyle w:val="ListNumber"/>
-      </w:pPr>
-      <w:r>
-        <w:t>[B3] The diurnal urinary excretion of oxalate and the effect of pyridoxine and ascorbate on oxalate excretion.. 1977.0. 10.1159/000472053</w:t>
+        <w:t>[B3] The diurnal urinary excretion of oxalate and the effect of pyridoxine and ascorbate on oxalate excretion. 1977. 10.1159/000472053</w:t>
       </w:r>
     </w:p>
     <w:p>
@@ -2355,7 +2347,7 @@
           </w:tcPr>
           <w:p>
             <w:r>
-              <w:t>5668d5ce14f32e6e0cdae405402a2c1efdcdd21ec803bfd1626e9aee1e8de0b0</w:t>
+              <w:t>83c8679b8c2baba3b2b235ebba3b596637919d2a410ac90ee0624048aa39efa1</w:t>
             </w:r>
           </w:p>
         </w:tc>
@@ -2377,7 +2369,7 @@
           </w:tcPr>
           <w:p>
             <w:r>
-              <w:t>510b08046a9580568f767db662c68c73b31a406f2a12d023b67f78dc088be318</w:t>
+              <w:t>1b2a58494dabbd7849b9265106951521a641caf2134e6cdc6548b454606055a0</w:t>
             </w:r>
           </w:p>
         </w:tc>
@@ -2399,7 +2391,7 @@
           </w:tcPr>
           <w:p>
             <w:r>
-              <w:t>8ca8ac3df31c6a74246fa6f2eaa3c619171b6d333e2f31dc9cc990f6ff6b7111</w:t>
+              <w:t>a130fc2e67db027943bf90ea4d9c71759ac3e8004e21f2ab387856b202045dd3</w:t>
             </w:r>
           </w:p>
         </w:tc>
@@ -2421,7 +2413,7 @@
           </w:tcPr>
           <w:p>
             <w:r>
-              <w:t>b7de34dd435da19346b8c173c46980bff0bdf1a1c5fae63e024625894c4046b1</w:t>
+              <w:t>5b0b2be068363d3df1d183a6c10a88b118640ed94609c7daf7bfe48ce3517d92</w:t>
             </w:r>
           </w:p>
         </w:tc>

</xml_diff>

<commit_message>
fix: enforce direct exposure evidence scope
</commit_message>
<xml_diff>
--- a/research/thesis/systematic_review_thesis_v3.docx
+++ b/research/thesis/systematic_review_thesis_v3.docx
@@ -46,7 +46,7 @@
     </w:p>
     <w:p>
       <w:r>
-        <w:t>본 연구는 항응고제를 복용하는 성인과 신장결석·고칼슘뇨 등 신장 관련 고위험군에서 비타민 K, 오메가-3, 칼슘, 비타민 D 및 비타민 C 보충제의 안전성 근거를 체계적으로 검색·구조화하고, 개인의 복용 조건에 따라 확인사항과 근거 문헌을 제시하는 웹 시스템을 구축하는 것을 목적으로 하였다. PubMed, ClinicalTrials.gov와 KoreaMed에서 수집한 공개 서지자료를 연구계획서의 PICOS에 따라 자동 선별하고 대상자, 보충제, 용량, 안전성 결과와 근거 위치를 추출하였다. 직접 관련 후보는 4,593건이었고, 용량 정보가 확인된 문헌은 369건, 공개 원문 위치가 연결된 문헌은 1,507건이었다. 제목 직접관련성, 연구설계, 용량·결과 및 원문 접근성을 기준으로 핵심 근거 128건을 선정하였다. 조회 시스템은 보충제, 일일 용량, 병용 약물, 질환·결석 병력과 검사값을 입력받아 질문별 확인사항, 맞춤형 요약과 근거 원문을 제공하도록 구현하였다. 62개 자동 테스트, TypeScript 검사와 Production 빌드를 통과한 버전을 Vercel 고정 주소에 배포하였다. 본 연구는 체계적인 검색·선별·추출과 소프트웨어 검증을 수행했으나 독립된 두 명의 사람 선별자가 없으므로 자동 선별 결과를 최종 임상 권고로 해석할 수 없다.</w:t>
+        <w:t>본 연구는 항응고제를 복용하는 성인과 신장결석·고칼슘뇨 등 신장 관련 고위험군에서 비타민 K, 오메가-3, 칼슘, 비타민 D 및 비타민 C 보충제의 안전성 근거를 체계적으로 검색·구조화하고, 개인의 복용 조건에 따라 확인사항과 근거 문헌을 제시하는 웹 시스템을 구축하는 것을 목적으로 하였다. PubMed, ClinicalTrials.gov와 KoreaMed에서 수집한 공개 서지자료를 연구계획서의 PICOS에 따라 자동 선별하고 대상자, 보충제, 용량, 안전성 결과와 근거 위치를 추출하였다. 직접 관련 후보는 4,593건이었고, 용량 정보가 확인된 문헌은 369건, 공개 원문 위치가 연결된 문헌은 1,507건이었다. 제목 직접관련성, 연구설계, 용량·결과 및 원문 접근성을 기준으로 핵심 근거 121건을 선정하였다. 조회 시스템은 보충제, 일일 용량, 병용 약물, 질환·결석 병력과 검사값을 입력받아 질문별 확인사항, 맞춤형 요약과 근거 원문을 제공하도록 구현하였다. 62개 자동 테스트, TypeScript 검사와 Production 빌드를 통과한 버전을 Vercel 고정 주소에 배포하였다. 본 연구는 체계적인 검색·선별·추출과 소프트웨어 검증을 수행했으나 독립된 두 명의 사람 선별자가 없으므로 자동 선별 결과를 최종 임상 권고로 해석할 수 없다.</w:t>
       </w:r>
     </w:p>
     <w:p>
@@ -207,7 +207,7 @@
     </w:p>
     <w:p>
       <w:r>
-        <w:t>PICOS 직접 후보는 4,593건이었다. 이 중 369건에서 단위가 있는 용량을 관찰했고 1,507건에 공개 원문 위치를 연결하였다. 제목 직접관련성 필터를 통과한 핵심 문헌은 128건이었다.</w:t>
+        <w:t>PICOS 직접 후보는 4,593건이었다. 이 중 369건에서 단위가 있는 용량을 관찰했고 1,507건에 공개 원문 위치를 연결하였다. 제목 직접관련성 필터를 통과한 핵심 문헌은 121건이었다.</w:t>
       </w:r>
     </w:p>
     <w:tbl>
@@ -366,7 +366,7 @@
           </w:tcPr>
           <w:p>
             <w:r>
-              <w:t>128</w:t>
+              <w:t>121</w:t>
             </w:r>
           </w:p>
         </w:tc>
@@ -484,7 +484,7 @@
           </w:tcPr>
           <w:p>
             <w:r>
-              <w:t>18</w:t>
+              <w:t>10</w:t>
             </w:r>
           </w:p>
         </w:tc>
@@ -494,7 +494,7 @@
           </w:tcPr>
           <w:p>
             <w:r>
-              <w:t>7</w:t>
+              <w:t>8</w:t>
             </w:r>
           </w:p>
         </w:tc>
@@ -526,17 +526,7 @@
           </w:tcPr>
           <w:p>
             <w:r>
-              <w:t>12</w:t>
-            </w:r>
-          </w:p>
-        </w:tc>
-        <w:tc>
-          <w:tcPr>
-            <w:tcW w:type="dxa" w:w="1806"/>
-          </w:tcPr>
-          <w:p>
-            <w:r>
-              <w:t>2</w:t>
+              <w:t>5</w:t>
             </w:r>
           </w:p>
         </w:tc>
@@ -547,6 +537,16 @@
           <w:p>
             <w:r>
               <w:t>1</w:t>
+            </w:r>
+          </w:p>
+        </w:tc>
+        <w:tc>
+          <w:tcPr>
+            <w:tcW w:type="dxa" w:w="1806"/>
+          </w:tcPr>
+          <w:p>
+            <w:r>
+              <w:t>0</w:t>
             </w:r>
           </w:p>
         </w:tc>
@@ -588,7 +588,7 @@
           </w:tcPr>
           <w:p>
             <w:r>
-              <w:t>14</w:t>
+              <w:t>9</w:t>
             </w:r>
           </w:p>
         </w:tc>
@@ -598,7 +598,7 @@
           </w:tcPr>
           <w:p>
             <w:r>
-              <w:t>10</w:t>
+              <w:t>11</w:t>
             </w:r>
           </w:p>
         </w:tc>
@@ -731,7 +731,7 @@
     </w:p>
     <w:p>
       <w:r>
-        <w:t>이 가운데 명시적 용량이 관찰된 문헌은 18건, 공개 원문 위치가 연결된 문헌은 7건이었다. 용량이 공란인 경우 수치가 없다고 단정하지 않고, 현재 확보한 초록에서 명시적 단위를 추출하지 못한 상태로 해석하였다.</w:t>
+        <w:t>이 가운데 명시적 용량이 관찰된 문헌은 10건, 공개 원문 위치가 연결된 문헌은 8건이었다. 용량이 공란인 경우 수치가 없다고 단정하지 않고, 현재 확보한 초록에서 명시적 단위를 추출하지 못한 상태로 해석하였다.</w:t>
       </w:r>
     </w:p>
     <w:p>
@@ -752,14 +752,6 @@
         <w:pStyle w:val="ListBullet"/>
       </w:pPr>
       <w:r>
-        <w:t>A prospective randomized study to determine the optimal dose of intravenous vitamin K in reversal of over-warfarinization (2000). 보고 용량: 0.5 mg | 1 mg | 2 mg</w:t>
-      </w:r>
-    </w:p>
-    <w:p>
-      <w:pPr>
-        <w:pStyle w:val="ListBullet"/>
-      </w:pPr>
-      <w:r>
         <w:t>Vitamin K1 supplementation to improve the stability of anticoagulation therapy with vitamin K antagonists: a dose-finding study (2011). 보고 용량: 100 μg | 150 μg | 200 μg</w:t>
       </w:r>
     </w:p>
@@ -776,7 +768,15 @@
         <w:pStyle w:val="ListBullet"/>
       </w:pPr>
       <w:r>
-        <w:t>Reversal of overanticoagulation in very elderly hospitalized patients with an INR above 5.0: 24-hour INR response after vitamin K administration (2011). 보고 용량: 1 mg</w:t>
+        <w:t>Anticoagulation control with daily low-dose vitamin k to reduce clinically adverse outcomes and international normalized ratio variability: a systematic review and meta-analysis (2013). 보고 용량: 100 to 200 μg</w:t>
+      </w:r>
+    </w:p>
+    <w:p>
+      <w:pPr>
+        <w:pStyle w:val="ListBullet"/>
+      </w:pPr>
+      <w:r>
+        <w:t>Role of dietary vitamin K intake in chronic oral anticoagulation: prospective evidence from observational and randomized protocols (2004). 초록 내 명시적 용량 없음.</w:t>
       </w:r>
     </w:p>
     <w:p>
@@ -789,12 +789,12 @@
     </w:p>
     <w:p>
       <w:r>
-        <w:t>A2 질문의 핵심 문헌은 12건이었다. 아래 문헌은 연구설계, 직접관련성, 용량·결과 및 원문 접근성을 종합해 우선 배치하였다.</w:t>
+        <w:t>A2 질문의 핵심 문헌은 5건이었다. 아래 문헌은 연구설계, 직접관련성, 용량·결과 및 원문 접근성을 종합해 우선 배치하였다.</w:t>
       </w:r>
     </w:p>
     <w:p>
       <w:r>
-        <w:t>이 가운데 명시적 용량이 관찰된 문헌은 2건, 공개 원문 위치가 연결된 문헌은 1건이었다. 용량이 공란인 경우 수치가 없다고 단정하지 않고, 현재 확보한 초록에서 명시적 단위를 추출하지 못한 상태로 해석하였다.</w:t>
+        <w:t>이 가운데 명시적 용량이 관찰된 문헌은 1건, 공개 원문 위치가 연결된 문헌은 0건이었다. 용량이 공란인 경우 수치가 없다고 단정하지 않고, 현재 확보한 초록에서 명시적 단위를 추출하지 못한 상태로 해석하였다.</w:t>
       </w:r>
     </w:p>
     <w:p>
@@ -815,7 +815,7 @@
         <w:pStyle w:val="ListBullet"/>
       </w:pPr>
       <w:r>
-        <w:t>Role of Fish Oil in Post-Cardiotomy Bleeding: A Summary of the Basic Science and Clinical Trials (2018). 초록 내 명시적 용량 없음.</w:t>
+        <w:t>The assessment of risk for gastrointestinal injury with anticoagulant and antiplatelet drugs: the possible beneficial effect of eicosapentaenoic Acid for the risk of gastrointestinal injury (2013). 초록 내 명시적 용량 없음.</w:t>
       </w:r>
     </w:p>
     <w:p>
@@ -823,7 +823,7 @@
         <w:pStyle w:val="ListBullet"/>
       </w:pPr>
       <w:r>
-        <w:t>Omega-3 and fish oil supplements do not cause increased bleeding during spinal decompression surgery (2012). 초록 내 명시적 용량 없음.</w:t>
+        <w:t>Plasma triacylglycerol and coagulation factor concentrations predict the anticoagulant effect of dietary fish oil in overweight subjects (2007). 초록 내 명시적 용량 없음.</w:t>
       </w:r>
     </w:p>
     <w:p>
@@ -831,7 +831,7 @@
         <w:pStyle w:val="ListBullet"/>
       </w:pPr>
       <w:r>
-        <w:t>The Use of Fish Oil with Warfarin Does Not Significantly Affect either the International Normalised Ratio or Incidence of Adverse Events in Patients with Atrial Fibrillation and Deep Vein Thrombosis: A Retrospective Study (2016). 초록 내 명시적 용량 없음.</w:t>
+        <w:t>Extremely prolonged INR associated with warfarin in combination with both trazodone and omega-3 fatty acids (2007). 초록 내 명시적 용량 없음.</w:t>
       </w:r>
     </w:p>
     <w:p>
@@ -839,7 +839,7 @@
         <w:pStyle w:val="ListBullet"/>
       </w:pPr>
       <w:r>
-        <w:t>Subdural hematoma after a fall in an elderly patient taking high-dose omega-3 fatty acids with warfarin and aspirin: case report and review of the literature (2007). 보고 용량: 6 g/day</w:t>
+        <w:t>Effects of Marine Fish Oils on the Anticoagulation Status of Patients Receiving Chronic Warfarin Therapy (1998). 초록 내 명시적 용량 없음.</w:t>
       </w:r>
     </w:p>
     <w:p>
@@ -857,7 +857,7 @@
     </w:p>
     <w:p>
       <w:r>
-        <w:t>이 가운데 명시적 용량이 관찰된 문헌은 14건, 공개 원문 위치가 연결된 문헌은 10건이었다. 용량이 공란인 경우 수치가 없다고 단정하지 않고, 현재 확보한 초록에서 명시적 단위를 추출하지 못한 상태로 해석하였다.</w:t>
+        <w:t>이 가운데 명시적 용량이 관찰된 문헌은 9건, 공개 원문 위치가 연결된 문헌은 11건이었다. 용량이 공란인 경우 수치가 없다고 단정하지 않고, 현재 확보한 초록에서 명시적 단위를 추출하지 못한 상태로 해석하였다.</w:t>
       </w:r>
     </w:p>
     <w:p>
@@ -870,23 +870,7 @@
         <w:pStyle w:val="ListBullet"/>
       </w:pPr>
       <w:r>
-        <w:t>Diet, fluid, or supplements for secondary prevention of nephrolithiasis: a systematic review and meta-analysis of randomized trials (2009). 초록 내 명시적 용량 없음.</w:t>
-      </w:r>
-    </w:p>
-    <w:p>
-      <w:pPr>
-        <w:pStyle w:val="ListBullet"/>
-      </w:pPr>
-      <w:r>
         <w:t>Why oral calcium supplements may reduce renal stone disease: report of a clinical pilot study (2001). 보고 용량: 500 mg</w:t>
-      </w:r>
-    </w:p>
-    <w:p>
-      <w:pPr>
-        <w:pStyle w:val="ListBullet"/>
-      </w:pPr>
-      <w:r>
-        <w:t>Effect of dietary treatment and fluid intake on the prevention of recurrent calcium stones and changes in urine composition: A meta-analysis and systematic review (2021). 초록 내 명시적 용량 없음.</w:t>
       </w:r>
     </w:p>
     <w:p>
@@ -902,7 +886,23 @@
         <w:pStyle w:val="ListBullet"/>
       </w:pPr>
       <w:r>
-        <w:t>Dietary and lifestyle factors for primary prevention of nephrolithiasis: a systematic review and meta-analysis (2020). 초록 내 명시적 용량 없음.</w:t>
+        <w:t>Risk of calcium oxalate nephrolithiasis in postmenopausal women supplemented with calcium or combined calcium and estrogen (2002). 보고 용량: 0.625 mg/day | 250 mg | 5 mg | 625 mg</w:t>
+      </w:r>
+    </w:p>
+    <w:p>
+      <w:pPr>
+        <w:pStyle w:val="ListBullet"/>
+      </w:pPr>
+      <w:r>
+        <w:t>Substituting milk for apple juice does not increase kidney stone risk in most normocalciuric adults who form calcium oxalate stones (1998). 보고 용량: 400 mg | 800 mg</w:t>
+      </w:r>
+    </w:p>
+    <w:p>
+      <w:pPr>
+        <w:pStyle w:val="ListBullet"/>
+      </w:pPr>
+      <w:r>
+        <w:t>Calcium supplementation and kidney stone risk in osteoporosis: a systematic literature review (2012). 보고 용량: 1.500 mg | 120 mg</w:t>
       </w:r>
     </w:p>
     <w:p>
@@ -1255,7 +1255,7 @@
     </w:p>
     <w:p>
       <w:r>
-        <w:t>본 연구는 다섯 영양보충제 안전성 질문에 대해 4,593건의 PICOS 직접 후보에서 대상자·용량·안전성 결과와 근거 위치를 구조화하고 핵심 문헌 128건을 선정하였다. 이를 개인 조건 기반 웹 조회 시스템으로 구현해 Production에 배포하였다. 결과는 임상 처방을 대신하지 않지만 상담 전에 확인할 조건과 근거 문헌을 빠르게 정리하는 재현 가능한 도구를 제공한다.</w:t>
+        <w:t>본 연구는 다섯 영양보충제 안전성 질문에 대해 4,593건의 PICOS 직접 후보에서 대상자·용량·안전성 결과와 근거 위치를 구조화하고 핵심 문헌 121건을 선정하였다. 이를 개인 조건 기반 웹 조회 시스템으로 구현해 Production에 배포하였다. 결과는 임상 처방을 대신하지 않지만 상담 전에 확인할 조건과 근거 문헌을 빠르게 정리하는 재현 가능한 도구를 제공한다.</w:t>
       </w:r>
     </w:p>
     <w:p>
@@ -1279,14 +1279,6 @@
         <w:pStyle w:val="ListNumber"/>
       </w:pPr>
       <w:r>
-        <w:t>[A1] A prospective randomized study to determine the optimal dose of intravenous vitamin K in reversal of over-warfarinization. 2000. 10.1046/j.1365-2141.2000.02001.x</w:t>
-      </w:r>
-    </w:p>
-    <w:p>
-      <w:pPr>
-        <w:pStyle w:val="ListNumber"/>
-      </w:pPr>
-      <w:r>
         <w:t>[A1] Vitamin K1 supplementation to improve the stability of anticoagulation therapy with vitamin K antagonists: a dose-finding study. 2011. 10.3324/haematol.2010.035162</w:t>
       </w:r>
     </w:p>
@@ -1303,7 +1295,7 @@
         <w:pStyle w:val="ListNumber"/>
       </w:pPr>
       <w:r>
-        <w:t>[A1] Reversal of overanticoagulation in very elderly hospitalized patients with an INR above 5.0: 24-hour INR response after vitamin K administration. 2011. 10.1016/j.amjmed.2011.01.016</w:t>
+        <w:t>[A1] Anticoagulation control with daily low-dose vitamin k to reduce clinically adverse outcomes and international normalized ratio variability: a systematic review and meta-analysis. 2013. 10.1002/phar.1302</w:t>
       </w:r>
     </w:p>
     <w:p>
@@ -1319,6 +1311,14 @@
         <w:pStyle w:val="ListNumber"/>
       </w:pPr>
       <w:r>
+        <w:t>[A1] Effect of Vitamin K Intake on the Stability of Treatment with Vitamin K Antagonists: A Systematic Review of the Literature. 2016. 10.1055/s-0036-1581105</w:t>
+      </w:r>
+    </w:p>
+    <w:p>
+      <w:pPr>
+        <w:pStyle w:val="ListNumber"/>
+      </w:pPr>
+      <w:r>
         <w:t>[A1] The effect of low-dose oral vitamin K supplementation on INR stability in patients receiving warfarin. A randomised trial. 2016. 10.1160/th16-04-0320</w:t>
       </w:r>
     </w:p>
@@ -1335,15 +1335,7 @@
         <w:pStyle w:val="ListNumber"/>
       </w:pPr>
       <w:r>
-        <w:t>[A1] Antagonism of warfarin-induced hypoprothrombinemia with use of low-dose subcutaneous vitamin K1. 1997. 10.1002/j.1552-4604.1997.tb04363.x</w:t>
-      </w:r>
-    </w:p>
-    <w:p>
-      <w:pPr>
-        <w:pStyle w:val="ListNumber"/>
-      </w:pPr>
-      <w:r>
-        <w:t>[A1] Reversal of excessive effect of regular anticoagulation: low oral dose of phytonadione (vitamin K1) compared with warfarin discontinuation. 1993. https://pubmed.ncbi.nlm.nih.gov/8292723/</w:t>
+        <w:t>[A1] Does vitamin K supplementation improve vitamin K antagonist therapy? A case report and update of the literature. 2022. 10.1016/j.jccase.2021.12.011</w:t>
       </w:r>
     </w:p>
     <w:p>
@@ -1359,38 +1351,6 @@
         <w:pStyle w:val="ListNumber"/>
       </w:pPr>
       <w:r>
-        <w:t>[A1] Short-term warfarin reversal for elective surgery--using low-dose intravenous vitamin K: safe, reliable and convenient*. 2011. 10.1111/j.1365-2141.2011.08787.x</w:t>
-      </w:r>
-    </w:p>
-    <w:p>
-      <w:pPr>
-        <w:pStyle w:val="ListNumber"/>
-      </w:pPr>
-      <w:r>
-        <w:t>[A1] A single dose of oral vitamin K effectively reverses oral anticoagulation with phenprocoumon during heart catheterisation. 2006. 10.4414/smw.2006.11452</w:t>
-      </w:r>
-    </w:p>
-    <w:p>
-      <w:pPr>
-        <w:pStyle w:val="ListNumber"/>
-      </w:pPr>
-      <w:r>
-        <w:t>[A1] Low-dose oral vitamin K reliably reverses over-anticoagulation due to warfarin. 1998. https://pubmed.ncbi.nlm.nih.gov/9657434/</w:t>
-      </w:r>
-    </w:p>
-    <w:p>
-      <w:pPr>
-        <w:pStyle w:val="ListNumber"/>
-      </w:pPr>
-      <w:r>
-        <w:t>[A1] Vitamin K for reversal of excessive vitamin K antagonist anticoagulation: a systematic review and meta-analysis. 2019. 10.1182/bloodadvances.2018025163</w:t>
-      </w:r>
-    </w:p>
-    <w:p>
-      <w:pPr>
-        <w:pStyle w:val="ListNumber"/>
-      </w:pPr>
-      <w:r>
         <w:t>[A1] Association Between Usual Vitamin K Intake and Anticoagulation in Patients Under Warfarin Therapy. 2015. 10.7762/cnr.2015.4.4.235</w:t>
       </w:r>
     </w:p>
@@ -1423,46 +1383,6 @@
         <w:pStyle w:val="ListNumber"/>
       </w:pPr>
       <w:r>
-        <w:t>[A1] [Oral administration of intravenous preparation of Vitamin K for excessive anticoagulation due to warfarin]. 2012. https://pubmed.ncbi.nlm.nih.gov/22522851/</w:t>
-      </w:r>
-    </w:p>
-    <w:p>
-      <w:pPr>
-        <w:pStyle w:val="ListNumber"/>
-      </w:pPr>
-      <w:r>
-        <w:t>[A1] Comparison of oral vs intravenous phytonadione (vitamin K1) in patients with excessive anticoagulation: a prospective randomized controlled study. 2003. 10.1001/archinte.163.20.2469</w:t>
-      </w:r>
-    </w:p>
-    <w:p>
-      <w:pPr>
-        <w:pStyle w:val="ListNumber"/>
-      </w:pPr>
-      <w:r>
-        <w:t>[A1] Treatment of warfarin-associated coagulopathy with oral vitamin K: a randomised controlled trial. 2000. 10.1016/s0140-6736(00)03125-1</w:t>
-      </w:r>
-    </w:p>
-    <w:p>
-      <w:pPr>
-        <w:pStyle w:val="ListNumber"/>
-      </w:pPr>
-      <w:r>
-        <w:t>[A1] Randomized, placebo-controlled trial of orally administered vitamin K1 for warfarin-associated coagulopathy in Chinese patients with mechanical heart valves. 2021. 10.1007/s00228-021-03127-8</w:t>
-      </w:r>
-    </w:p>
-    <w:p>
-      <w:pPr>
-        <w:pStyle w:val="ListNumber"/>
-      </w:pPr>
-      <w:r>
-        <w:t>[A1] Management of Supratherapeutic International Normalized Ratio without Bleeding after Warfarin Use: An Evaluation of Vitamin K Administration (SUPRA-WAR-K Study). 2017. 10.4212/cjhp.v70i3.1660</w:t>
-      </w:r>
-    </w:p>
-    <w:p>
-      <w:pPr>
-        <w:pStyle w:val="ListNumber"/>
-      </w:pPr>
-      <w:r>
         <w:t>[A1] Warfarin and vitamin K intake in the era of pharmacogenetics. 2010. 10.1111/j.1365-2125.2010.03672.x</w:t>
       </w:r>
     </w:p>
@@ -1471,7 +1391,7 @@
         <w:pStyle w:val="ListNumber"/>
       </w:pPr>
       <w:r>
-        <w:t>[A1] Oral vitamin K versus placebo to correct excessive anticoagulation in patients receiving warfarin: a randomized trial. 2009. 10.7326/0003-4819-150-5-200903030-00005</w:t>
+        <w:t>[A1] Vitamin K-dependent anticoagulant use and level of anticoagulation control in sub-Saharan Africa: protocol for a retrospective cohort study. 2022. 10.1136/bmjopen-2021-057166</w:t>
       </w:r>
     </w:p>
     <w:p>
@@ -1479,7 +1399,7 @@
         <w:pStyle w:val="ListNumber"/>
       </w:pPr>
       <w:r>
-        <w:t>[A1] Low-dose oral vitamin K to normalize the international normalized ratio prior to surgery in patients who require temporary interruption of warfarin. 2007. 10.1007/s11239-007-0022-z</w:t>
+        <w:t>[A1] Relationship between dietary vitamin K intake and the stability of anticoagulation effect in patients taking long-term warfarin. 2010. 10.1160/th10-04-0257</w:t>
       </w:r>
     </w:p>
     <w:p>
@@ -1487,7 +1407,7 @@
         <w:pStyle w:val="ListNumber"/>
       </w:pPr>
       <w:r>
-        <w:t>[A1] Warfarin cessation before cardiopulmonary bypass: lessons learned from a randomized controlled trial of oral vitamin K. 2007. 10.1016/j.athoracsur.2007.03.014</w:t>
+        <w:t>[A1] Assessment of the Quality of Chronic Anticoagulation Control With Time in Therapeutic Range in Atrial Fibrillation Patients Treated With Vitamin K Antagonists by Hemostasis Specialists: The TERRA Registry: Tiempo en rango en la República Argentina. 2017. 10.1177/1076029615623378</w:t>
       </w:r>
     </w:p>
     <w:p>
@@ -1495,7 +1415,7 @@
         <w:pStyle w:val="ListNumber"/>
       </w:pPr>
       <w:r>
-        <w:t>[A1] Oral vitamin K produces a normal INR within 24 hours of its administration in most patients discontinuing warfarin. 2005. https://pubmed.ncbi.nlm.nih.gov/15642685/</w:t>
+        <w:t>[A1] Vitamin K intake, body mass index and warfarin maintenance dose. 2013. 10.1159/000354218</w:t>
       </w:r>
     </w:p>
     <w:p>
@@ -1503,7 +1423,87 @@
         <w:pStyle w:val="ListNumber"/>
       </w:pPr>
       <w:r>
-        <w:t>[A1] Impaired warfarin response secondary to high-dose vitamin K1 for rapid anticoagulation reversal: case series and literature review. 2004. 10.1592/phco.24.13.1213.38080</w:t>
+        <w:t>[A1] Influence of dietary vitamin K intake on subtherapeutic oral anticoagulant therapy. 2010. 10.1111/j.1365-2141.2010.08108.x</w:t>
+      </w:r>
+    </w:p>
+    <w:p>
+      <w:pPr>
+        <w:pStyle w:val="ListNumber"/>
+      </w:pPr>
+      <w:r>
+        <w:t>[A1] The effect of dietary vitamin K on warfarin-induced anticoagulation. 1991. 10.1111/j.1365-2796.1991.tb00388.x</w:t>
+      </w:r>
+    </w:p>
+    <w:p>
+      <w:pPr>
+        <w:pStyle w:val="ListNumber"/>
+      </w:pPr>
+      <w:r>
+        <w:t>[A1] Proposed Criteria for the Use of Low-Dose Vitamin K Supplementation in Patients Using Vitamin K Antagonists: A Literature Review of a Clinical Controversy. 2018. 10.1177/0897190017711518</w:t>
+      </w:r>
+    </w:p>
+    <w:p>
+      <w:pPr>
+        <w:pStyle w:val="ListNumber"/>
+      </w:pPr>
+      <w:r>
+        <w:t>[A1] Vitamin K supplementation to decrease variability of International Normalized Ratio in patients on vitamin K antagonists: a literature review. 2008. 10.1097/moh.0b013e328304b3c5</w:t>
+      </w:r>
+    </w:p>
+    <w:p>
+      <w:pPr>
+        <w:pStyle w:val="ListNumber"/>
+      </w:pPr>
+      <w:r>
+        <w:t>[A1] Dietary vitamin K intake and anticoagulation in elderly patients. 2007. 10.1097/mco.0b013e328011c46c</w:t>
+      </w:r>
+    </w:p>
+    <w:p>
+      <w:pPr>
+        <w:pStyle w:val="ListNumber"/>
+      </w:pPr>
+      <w:r>
+        <w:t>[A1] Low-dose vitamin K to augment anticoagulation control. 2005. 10.1592/phco.2005.25.12.1746</w:t>
+      </w:r>
+    </w:p>
+    <w:p>
+      <w:pPr>
+        <w:pStyle w:val="ListNumber"/>
+      </w:pPr>
+      <w:r>
+        <w:t>[A1] Vitamin K intake and sensitivity to warfarin in patients consuming regular diets. 1999. https://pubmed.ncbi.nlm.nih.gov/10102468/</w:t>
+      </w:r>
+    </w:p>
+    <w:p>
+      <w:pPr>
+        <w:pStyle w:val="ListNumber"/>
+      </w:pPr>
+      <w:r>
+        <w:t>[A1] Subtherapeutic Anticoagulation Control under Treatment with Vitamin K-Antagonists-Data from a Specialized Coagulation Service. 2019. 10.1055/s-0039-1692175</w:t>
+      </w:r>
+    </w:p>
+    <w:p>
+      <w:pPr>
+        <w:pStyle w:val="ListNumber"/>
+      </w:pPr>
+      <w:r>
+        <w:t>[A1] The role of dietary vitamin K in the management of oral vitamin K antagonists. 2012. 10.1016/j.blre.2011.07.002</w:t>
+      </w:r>
+    </w:p>
+    <w:p>
+      <w:pPr>
+        <w:pStyle w:val="ListNumber"/>
+      </w:pPr>
+      <w:r>
+        <w:t>[A1] Dietary vitamin K variability affects International Normalized Ratio (INR) coagulation indices. 2006. 10.1024/0300-9831.76.2.65</w:t>
+      </w:r>
+    </w:p>
+    <w:p>
+      <w:pPr>
+        <w:pStyle w:val="ListNumber"/>
+      </w:pPr>
+      <w:r>
+        <w:t>[A1] Dietary vitamin K influences intra-individual variability in anticoagulant response to warfarin. 2004. 10.1046/j.1365-2141.2003.04787.x</w:t>
       </w:r>
     </w:p>
     <w:p>
@@ -1519,46 +1519,6 @@
         <w:pStyle w:val="ListNumber"/>
       </w:pPr>
       <w:r>
-        <w:t>[A2] Role of Fish Oil in Post-Cardiotomy Bleeding: A Summary of the Basic Science and Clinical Trials. 2018. 10.1016/j.athoracsur.2018.01.041</w:t>
-      </w:r>
-    </w:p>
-    <w:p>
-      <w:pPr>
-        <w:pStyle w:val="ListNumber"/>
-      </w:pPr>
-      <w:r>
-        <w:t>[A2] Omega-3 and fish oil supplements do not cause increased bleeding during spinal decompression surgery. 2012. 10.1097/bsd.0b013e3182120227</w:t>
-      </w:r>
-    </w:p>
-    <w:p>
-      <w:pPr>
-        <w:pStyle w:val="ListNumber"/>
-      </w:pPr>
-      <w:r>
-        <w:t>[A2] The Use of Fish Oil with Warfarin Does Not Significantly Affect either the International Normalised Ratio or Incidence of Adverse Events in Patients with Atrial Fibrillation and Deep Vein Thrombosis: A Retrospective Study. 2016. 10.3390/nu8090578</w:t>
-      </w:r>
-    </w:p>
-    <w:p>
-      <w:pPr>
-        <w:pStyle w:val="ListNumber"/>
-      </w:pPr>
-      <w:r>
-        <w:t>[A2] Subdural hematoma after a fall in an elderly patient taking high-dose omega-3 fatty acids with warfarin and aspirin: case report and review of the literature. 2007. 10.1592/phco.27.1.152</w:t>
-      </w:r>
-    </w:p>
-    <w:p>
-      <w:pPr>
-        <w:pStyle w:val="ListNumber"/>
-      </w:pPr>
-      <w:r>
-        <w:t>[A2] Nasal Bleeding as a Potential Side Effect of Omega-3 Fatty Acids: A Case Report. 2026. 10.2174/0115748863448971260303083058</w:t>
-      </w:r>
-    </w:p>
-    <w:p>
-      <w:pPr>
-        <w:pStyle w:val="ListNumber"/>
-      </w:pPr>
-      <w:r>
         <w:t>[A2] The assessment of risk for gastrointestinal injury with anticoagulant and antiplatelet drugs: the possible beneficial effect of eicosapentaenoic Acid for the risk of gastrointestinal injury. 2013. 10.1248/bpb.b12-00584</w:t>
       </w:r>
     </w:p>
@@ -1583,31 +1543,7 @@
         <w:pStyle w:val="ListNumber"/>
       </w:pPr>
       <w:r>
-        <w:t>[A2] Fish oil interaction with warfarin. 2004. 10.1345/aph.1d007</w:t>
-      </w:r>
-    </w:p>
-    <w:p>
-      <w:pPr>
-        <w:pStyle w:val="ListNumber"/>
-      </w:pPr>
-      <w:r>
         <w:t>[A2] Effects of Marine Fish Oils on the Anticoagulation Status of Patients Receiving Chronic Warfarin Therapy. 1998. 10.1023/a:1008852127668</w:t>
-      </w:r>
-    </w:p>
-    <w:p>
-      <w:pPr>
-        <w:pStyle w:val="ListNumber"/>
-      </w:pPr>
-      <w:r>
-        <w:t>[A2] Omega-3 Fatty Acid Supplementation and Warfarin: A Lethal Combination in Traumatic Brain Injury. 2017. 10.1097/jtn.0000000000000256</w:t>
-      </w:r>
-    </w:p>
-    <w:p>
-      <w:pPr>
-        <w:pStyle w:val="ListNumber"/>
-      </w:pPr>
-      <w:r>
-        <w:t>[B1] Diet, fluid, or supplements for secondary prevention of nephrolithiasis: a systematic review and meta-analysis of randomized trials. 2009. 10.1016/j.eururo.2009.03.031</w:t>
       </w:r>
     </w:p>
     <w:p>
@@ -1623,31 +1559,7 @@
         <w:pStyle w:val="ListNumber"/>
       </w:pPr>
       <w:r>
-        <w:t>[B1] Effect of dietary treatment and fluid intake on the prevention of recurrent calcium stones and changes in urine composition: A meta-analysis and systematic review. 2021. 10.1371/journal.pone.0250257</w:t>
-      </w:r>
-    </w:p>
-    <w:p>
-      <w:pPr>
-        <w:pStyle w:val="ListNumber"/>
-      </w:pPr>
-      <w:r>
         <w:t>[B1] Incidence of hypercalciuria and hypercalcemia during vitamin D and calcium supplementation in older women. 2014. 10.1097/gme.0000000000000270</w:t>
-      </w:r>
-    </w:p>
-    <w:p>
-      <w:pPr>
-        <w:pStyle w:val="ListNumber"/>
-      </w:pPr>
-      <w:r>
-        <w:t>[B1] Dietary and lifestyle factors for primary prevention of nephrolithiasis: a systematic review and meta-analysis. 2020. 10.1186/s12882-020-01925-3</w:t>
-      </w:r>
-    </w:p>
-    <w:p>
-      <w:pPr>
-        <w:pStyle w:val="ListNumber"/>
-      </w:pPr>
-      <w:r>
-        <w:t>[B1] Pathophysiology of renal calcium handling in acromegaly: what lies behind hypercalciuria?. 2012. 10.1210/jc.2011-3188</w:t>
       </w:r>
     </w:p>
     <w:p>
@@ -1671,22 +1583,6 @@
         <w:pStyle w:val="ListNumber"/>
       </w:pPr>
       <w:r>
-        <w:t>[B1] Randomized controlled trial of a low animal protein, high fiber diet in the prevention of recurrent calcium oxalate kidney stones. 1996. 10.1093/oxfordjournals.aje.a008851</w:t>
-      </w:r>
-    </w:p>
-    <w:p>
-      <w:pPr>
-        <w:pStyle w:val="ListNumber"/>
-      </w:pPr>
-      <w:r>
-        <w:t>[B1] Hypercalcemia, hypercalciuria, and kidney stones in long-term studies of vitamin D supplementation: a systematic review and meta-analysis. 2016. 10.3945/ajcn.116.134981</w:t>
-      </w:r>
-    </w:p>
-    <w:p>
-      <w:pPr>
-        <w:pStyle w:val="ListNumber"/>
-      </w:pPr>
-      <w:r>
         <w:t>[B1] Calcium supplementation and kidney stone risk in osteoporosis: a systematic literature review. 2012. https://pubmed.ncbi.nlm.nih.gov/23137489/</w:t>
       </w:r>
     </w:p>
@@ -1703,87 +1599,7 @@
         <w:pStyle w:val="ListNumber"/>
       </w:pPr>
       <w:r>
-        <w:t>[B1] Comparison of two diets for the prevention of recurrent stones in idiopathic hypercalciuria. 2002. 10.1056/nejmoa010369</w:t>
-      </w:r>
-    </w:p>
-    <w:p>
-      <w:pPr>
-        <w:pStyle w:val="ListNumber"/>
-      </w:pPr>
-      <w:r>
-        <w:t>[B1] Risk of calcium oxalate nephrolithiasis after calcium or combined calcium and calcitriol supplementation in postmenopausal women. 2000. 10.1007/s001980070090</w:t>
-      </w:r>
-    </w:p>
-    <w:p>
-      <w:pPr>
-        <w:pStyle w:val="ListNumber"/>
-      </w:pPr>
-      <w:r>
         <w:t>[B1] Stone-forming potential of milk or calcium-fortified orange juice in idiopathic hypercalciuric adults. 1992. 10.1038/ki.1992.18</w:t>
-      </w:r>
-    </w:p>
-    <w:p>
-      <w:pPr>
-        <w:pStyle w:val="ListNumber"/>
-      </w:pPr>
-      <w:r>
-        <w:t>[B1] The impact of vitamin D supplementation on vitamin D level, urinary calcium excretion and bone density in patients with hypercalciuria and vitamin D deficiency - preliminary report. 2018. 10.34763/devperiodmed.20182202.144152</w:t>
-      </w:r>
-    </w:p>
-    <w:p>
-      <w:pPr>
-        <w:pStyle w:val="ListNumber"/>
-      </w:pPr>
-      <w:r>
-        <w:t>[B1] Association between calcium and vitamin D supplementation and increased risk of kidney stone formation in patients with osteoporosis in Southwest China: a cross-sectional study. 2025. 10.1136/bmjopen-2024-092901</w:t>
-      </w:r>
-    </w:p>
-    <w:p>
-      <w:pPr>
-        <w:pStyle w:val="ListNumber"/>
-      </w:pPr>
-      <w:r>
-        <w:t>[B1] Heritability of dietary traits that contribute to nephrolithiasis in a cohort of adult sibships. 2016. 10.1007/s40620-015-0204-2</w:t>
-      </w:r>
-    </w:p>
-    <w:p>
-      <w:pPr>
-        <w:pStyle w:val="ListNumber"/>
-      </w:pPr>
-      <w:r>
-        <w:t>[B1] Renal response to lithogenic and anti-lithogenic supplement challenges in a stone-free population group. 2004. 10.1053/j.jrn.2004.04.007</w:t>
-      </w:r>
-    </w:p>
-    <w:p>
-      <w:pPr>
-        <w:pStyle w:val="ListNumber"/>
-      </w:pPr>
-      <w:r>
-        <w:t>[B1] Diets with either beef or plant proteins reduce risk of calcium oxalate precipitation in patients with a history of calcium kidney stones. 2001. 10.1016/s0002-8223(01)00085-2</w:t>
-      </w:r>
-    </w:p>
-    <w:p>
-      <w:pPr>
-        <w:pStyle w:val="ListNumber"/>
-      </w:pPr>
-      <w:r>
-        <w:t>[B1] Magnesium, citrate, magnesium citrate and magnesium-alkali citrate as modulators of calcium oxalate crystallization in urine: observations in patients with recurrent idiopathic calcium urolithiasis. 1999. 10.1007/s002400050097</w:t>
-      </w:r>
-    </w:p>
-    <w:p>
-      <w:pPr>
-        <w:pStyle w:val="ListNumber"/>
-      </w:pPr>
-      <w:r>
-        <w:t>[B1] Relationship of hypercalciuria to diet and bladder stone formation in spinal cord injury patients. 1984. https://pubmed.ncbi.nlm.nih.gov/6380301/</w:t>
-      </w:r>
-    </w:p>
-    <w:p>
-      <w:pPr>
-        <w:pStyle w:val="ListNumber"/>
-      </w:pPr>
-      <w:r>
-        <w:t>[B1] Lowering urinary oxalate excretion to decrease calcium oxalate stone disease. 2016. 10.1007/s00240-015-0839-4</w:t>
       </w:r>
     </w:p>
     <w:p>
@@ -1839,7 +1655,135 @@
         <w:pStyle w:val="ListNumber"/>
       </w:pPr>
       <w:r>
-        <w:t>[B1] Dietary Recommendations for Bariatric Patients to Prevent Kidney Stone Formation. 2020. 10.3390/nu12051442</w:t>
+        <w:t>[B1] Vitamin D and Calcium Supplementation and Urolithiasis: A Controversial and Multifaceted Relationship. 2023. 10.3390/nu15071724</w:t>
+      </w:r>
+    </w:p>
+    <w:p>
+      <w:pPr>
+        <w:pStyle w:val="ListNumber"/>
+      </w:pPr>
+      <w:r>
+        <w:t>[B1] Combined vitamin D and calcium supplementation in vitamin D inadequate patients with urolithiasis: Impact on hypercalciuria and de novo stone formation. 2015. 10.5489/cuaj.3332</w:t>
+      </w:r>
+    </w:p>
+    <w:p>
+      <w:pPr>
+        <w:pStyle w:val="ListNumber"/>
+      </w:pPr>
+      <w:r>
+        <w:t>[B1] Effects of calcium supplements on the risk of renal stone formation in a population with low oxalate intake. 2004. https://pubmed.ncbi.nlm.nih.gov/15916110/</w:t>
+      </w:r>
+    </w:p>
+    <w:p>
+      <w:pPr>
+        <w:pStyle w:val="ListNumber"/>
+      </w:pPr>
+      <w:r>
+        <w:t>[B1] A prospective study of dietary calcium and other nutrients and the risk of symptomatic kidney stones. 1993. 10.1056/nejm199303253281203</w:t>
+      </w:r>
+    </w:p>
+    <w:p>
+      <w:pPr>
+        <w:pStyle w:val="ListNumber"/>
+      </w:pPr>
+      <w:r>
+        <w:t>[B1] Effect of high-calcium diet on urinary oxalate excretion in urinary stone formers. 1988. 10.1159/000473449</w:t>
+      </w:r>
+    </w:p>
+    <w:p>
+      <w:pPr>
+        <w:pStyle w:val="ListNumber"/>
+      </w:pPr>
+      <w:r>
+        <w:t>[B1] Measurement of precipitated calcium citrate in 24-hour urine samples is clinically useful for ruling out calcium oxalate urolithiasis. 2026. 10.1177/00368504251363660</w:t>
+      </w:r>
+    </w:p>
+    <w:p>
+      <w:pPr>
+        <w:pStyle w:val="ListNumber"/>
+      </w:pPr>
+      <w:r>
+        <w:t>[B1] High dietary calcium to phosphorus ratio is associated with high prevalence of kidney stone. 2024. 10.1097/md.0000000000040778</w:t>
+      </w:r>
+    </w:p>
+    <w:p>
+      <w:pPr>
+        <w:pStyle w:val="ListNumber"/>
+      </w:pPr>
+      <w:r>
+        <w:t>[B1] Plant-Based Milk Alternatives and Risk Factors for Kidney Stones and Chronic Kidney Disease. 2022. 10.1053/j.jrn.2021.03.011</w:t>
+      </w:r>
+    </w:p>
+    <w:p>
+      <w:pPr>
+        <w:pStyle w:val="ListNumber"/>
+      </w:pPr>
+      <w:r>
+        <w:t>[B1] Staged treatment for substantial bilateral calcium carbonate nephrolithiasis in vegan patient. 2021. 10.1016/j.eucr.2021.101831</w:t>
+      </w:r>
+    </w:p>
+    <w:p>
+      <w:pPr>
+        <w:pStyle w:val="ListNumber"/>
+      </w:pPr>
+      <w:r>
+        <w:t>[B1] Changes in urinary risk profile after short-term low sodium and low calcium diet in recurrent Swiss kidney stone formers. 2017. 10.1186/s12882-017-0755-7</w:t>
+      </w:r>
+    </w:p>
+    <w:p>
+      <w:pPr>
+        <w:pStyle w:val="ListNumber"/>
+      </w:pPr>
+      <w:r>
+        <w:t>[B1] Dietary calcium from dairy and nondairy sources, and risk of symptomatic kidney stones. 2013. 10.1016/j.juro.2013.03.074</w:t>
+      </w:r>
+    </w:p>
+    <w:p>
+      <w:pPr>
+        <w:pStyle w:val="ListNumber"/>
+      </w:pPr>
+      <w:r>
+        <w:t>[B1] Impact of calcium intake and intestinal calcium absorption on kidney stones in older women: the study of osteoporotic fractures. 2012. 10.1016/j.juro.2011.11.109</w:t>
+      </w:r>
+    </w:p>
+    <w:p>
+      <w:pPr>
+        <w:pStyle w:val="ListNumber"/>
+      </w:pPr>
+      <w:r>
+        <w:t>[B1] Effect of calcium intake on urinary oxalate excretion in calcium stone-forming patients. 2002. 10.1590/s0100-879x2002000600006</w:t>
+      </w:r>
+    </w:p>
+    <w:p>
+      <w:pPr>
+        <w:pStyle w:val="ListNumber"/>
+      </w:pPr>
+      <w:r>
+        <w:t>[B1] Calcium citrate: reduced propensity for the crystallization of calcium oxalate in urine resulting from induced hypercalciuria of calcium supplementation. 1985. 10.1210/jcem-61-6-1223</w:t>
+      </w:r>
+    </w:p>
+    <w:p>
+      <w:pPr>
+        <w:pStyle w:val="ListNumber"/>
+      </w:pPr>
+      <w:r>
+        <w:t>[B1] Effect of calcium restriction on renal excretion of oxalate and the probability of stones in the various pathophysiological groups with calcium stones. 1983. 10.1016/s0022-5347(17)51073-3</w:t>
+      </w:r>
+    </w:p>
+    <w:p>
+      <w:pPr>
+        <w:pStyle w:val="ListNumber"/>
+      </w:pPr>
+      <w:r>
+        <w:t>[B1] Biochemical and molecular investigation of oxidative stress associated with urolithiasis induced by increased dietary calcium or protein in chickens. 2021. 10.1111/jpn.13436</w:t>
+      </w:r>
+    </w:p>
+    <w:p>
+      <w:pPr>
+        <w:pStyle w:val="ListNumber"/>
+      </w:pPr>
+      <w:r>
+        <w:t>[B1] Effects of calcium carbonate, magnesium oxide and sodium citrate bicarbonate health supplements on the urinary risk factors for kidney stone formation. 2003. 10.1515/cclm.2003.008</w:t>
       </w:r>
     </w:p>
     <w:p>
@@ -2369,7 +2313,7 @@
           </w:tcPr>
           <w:p>
             <w:r>
-              <w:t>1b2a58494dabbd7849b9265106951521a641caf2134e6cdc6548b454606055a0</w:t>
+              <w:t>d9d80dc3d8d9bba4c938f26630736c1d0e49e386de78cd97441566c5b76ea643</w:t>
             </w:r>
           </w:p>
         </w:tc>
@@ -2391,7 +2335,7 @@
           </w:tcPr>
           <w:p>
             <w:r>
-              <w:t>a130fc2e67db027943bf90ea4d9c71759ac3e8004e21f2ab387856b202045dd3</w:t>
+              <w:t>71463915a948779653426e79557674213cbf96c3ab924b4f6f1250ac61516370</w:t>
             </w:r>
           </w:p>
         </w:tc>

</xml_diff>

<commit_message>
fix: validate AI summary grounding
</commit_message>
<xml_diff>
--- a/research/thesis/systematic_review_thesis_v3.docx
+++ b/research/thesis/systematic_review_thesis_v3.docx
@@ -46,7 +46,7 @@
     </w:p>
     <w:p>
       <w:r>
-        <w:t>본 연구는 항응고제를 복용하는 성인과 신장결석·고칼슘뇨 등 신장 관련 고위험군에서 비타민 K, 오메가-3, 칼슘, 비타민 D 및 비타민 C 보충제의 안전성 근거를 체계적으로 검색·구조화하고, 개인의 복용 조건에 따라 확인사항과 근거 문헌을 제시하는 웹 시스템을 구축하는 것을 목적으로 하였다. PubMed, ClinicalTrials.gov와 KoreaMed에서 수집한 공개 서지자료를 연구계획서의 PICOS에 따라 자동 선별하고 대상자, 보충제, 용량, 안전성 결과와 근거 위치를 추출하였다. 직접 관련 후보는 4,593건이었고, 용량 정보가 확인된 문헌은 369건, 공개 원문 위치가 연결된 문헌은 1,507건이었다. 제목 직접관련성, 연구설계, 용량·결과 및 원문 접근성을 기준으로 핵심 근거 121건을 선정하였다. 조회 시스템은 보충제, 일일 용량, 병용 약물, 질환·결석 병력과 검사값을 입력받아 질문별 확인사항, 맞춤형 요약과 근거 원문을 제공하도록 구현하였다. 62개 자동 테스트, TypeScript 검사와 Production 빌드를 통과한 버전을 Vercel 고정 주소에 배포하였다. 본 연구는 체계적인 검색·선별·추출과 소프트웨어 검증을 수행했으나 독립된 두 명의 사람 선별자가 없으므로 자동 선별 결과를 최종 임상 권고로 해석할 수 없다.</w:t>
+        <w:t>본 연구는 항응고제를 복용하는 성인과 신장결석·고칼슘뇨 등 신장 관련 고위험군에서 비타민 K, 오메가-3, 칼슘, 비타민 D 및 비타민 C 보충제의 안전성 근거를 체계적으로 검색·구조화하고, 개인의 복용 조건에 따라 확인사항과 근거 문헌을 제시하는 웹 시스템을 구축하는 것을 목적으로 하였다. PubMed, ClinicalTrials.gov와 KoreaMed에서 수집한 공개 서지자료를 연구계획서의 PICOS에 따라 자동 선별하고 대상자, 보충제, 용량, 안전성 결과와 근거 위치를 추출하였다. 직접 관련 후보는 4,593건이었고, 용량 정보가 확인된 문헌은 369건, 공개 원문 위치가 연결된 문헌은 1,507건이었다. 제목 직접관련성, 연구설계, 용량·결과 및 원문 접근성을 기준으로 핵심 근거 121건을 선정하였다. 조회 시스템은 보충제, 일일 용량, 병용 약물, 질환·결석 병력과 검사값을 입력받아 질문별 확인사항, 맞춤형 요약과 근거 원문을 제공하도록 구현하였다. 64개 자동 테스트, TypeScript 검사와 Production 빌드를 통과한 버전을 Vercel 고정 주소에 배포하였다. 본 연구는 체계적인 검색·선별·추출과 소프트웨어 검증을 수행했으나 독립된 두 명의 사람 선별자가 없으므로 자동 선별 결과를 최종 임상 권고로 해석할 수 없다.</w:t>
       </w:r>
     </w:p>
     <w:p>
@@ -173,7 +173,7 @@
     </w:p>
     <w:p>
       <w:r>
-        <w:t>Next.js App Router로 구현하였다. 입력은 보충제, 일일 용량, 병용 약물, 질환·결석 병력과 검사값이며, 출력은 현재 상태의 쉬운 요약, 우선 확인사항, 다음 단계와 근거 문헌이다. AI API는 구조화된 근거를 쉬운 한국어로 요약하는 데만 사용하고 입력 수치 보존을 코드로 재검사하였다.</w:t>
+        <w:t>Next.js App Router로 구현하였다. 입력은 보충제, 일일 용량, 병용 약물, 질환·결석 병력과 검사값이며, 출력은 현재 상태의 쉬운 요약, 우선 확인사항, 다음 단계와 근거 문헌이다. AI API는 구조화된 근거를 쉬운 한국어로 문장화하는 데만 사용하였다. 생성문에 입력·근거에 없는 숫자, URL, 안전성 단정 또는 복용 시작·중단·증감 지시가 있으면 폐기하고 결정론적 요약으로 대체하였다. 화면에는 개인식별정보를 입력하지 않도록 안내하였다.</w:t>
       </w:r>
     </w:p>
     <w:p>
@@ -186,7 +186,7 @@
     </w:p>
     <w:p>
       <w:r>
-        <w:t>단위·계약·경계·개인맞춤 API 테스트 62개, lint, TypeScript 검사와 Production 빌드를 수행하였다. 최종 시스템은 https://nutrition-safety-engine.vercel.app 에 배포하였다.</w:t>
+        <w:t>단위·계약·경계·개인맞춤 API 테스트 64개, lint, TypeScript 검사와 Production 빌드를 수행하였다. 최종 시스템은 https://nutrition-safety-engine.vercel.app 에 배포하였다.</w:t>
       </w:r>
     </w:p>
     <w:p>
@@ -1101,7 +1101,7 @@
           </w:tcPr>
           <w:p>
             <w:r>
-              <w:t>62개 통과</w:t>
+              <w:t>64개 통과</w:t>
             </w:r>
           </w:p>
         </w:tc>

</xml_diff>

<commit_message>
feat: strengthen evidence lineage and thesis
</commit_message>
<xml_diff>
--- a/research/thesis/systematic_review_thesis_v3.docx
+++ b/research/thesis/systematic_review_thesis_v3.docx
@@ -187,6 +187,97 @@
     <w:p>
       <w:r>
         <w:t>단위·계약·경계·개인맞춤 API 테스트 64개, lint, TypeScript 검사와 Production 빌드를 수행하였다. 최종 시스템은 https://nutrition-safety-engine.vercel.app 에 배포하였다.</w:t>
+      </w:r>
+    </w:p>
+    <w:p>
+      <w:pPr>
+        <w:pStyle w:val="Heading2"/>
+      </w:pPr>
+      <w:r>
+        <w:t>2.9 자동화 절차를 선택한 이유</w:t>
+      </w:r>
+    </w:p>
+    <w:p>
+      <w:r>
+        <w:t>본 연구는 독립된 두 명의 사람 선별자를 확보하지 못한 상황에서 자동화 결과를 사람의 최종 포함 결정으로 바꾸어 표시하지 않았다. 대신 모든 검색 레코드를 보존한 상태에서 대상자, 노출, 안전성 결과가 함께 관찰되는지를 재현 가능한 규칙으로 분류하고, 그 결과를 ‘직접 후보’와 ‘핵심 근거 후보’로 구분하였다. 이 선택은 사람 선별을 대체하기 위한 것이 아니라 어떤 기준이 어떤 레코드에 적용됐는지 다시 계산할 수 있게 하기 위한 것이다. 따라서 자동화된 적격성 값은 임상적 최종 포함이 아니며, 사람 검토가 수행되면 원래 자동화 값과 별도 열에서 비교되어야 한다.</w:t>
+      </w:r>
+    </w:p>
+    <w:p>
+      <w:pPr>
+        <w:pStyle w:val="Heading2"/>
+      </w:pPr>
+      <w:r>
+        <w:t>2.10 데이터 계보와 불변성</w:t>
+      </w:r>
+    </w:p>
+    <w:p>
+      <w:r>
+        <w:t>원자료에서 생성 자료까지의 계보는 record_id와 SHA-256으로 유지하였다. 원 evidence map은 수정하지 않고, PICOS 추출표와 핵심 근거표를 생성 스크립트로 다시 만들었다. 핵심 근거 수, 질문별 분포, 용량 관찰 수와 공개 원문 연결 수는 CSV를 읽어 manifest에서 계산했으며 논문과 웹 화면은 같은 manifest를 사용하였다. 이 구조에서는 숫자가 바뀔 때 문서나 화면을 직접 고치는 대신 원자료 또는 변환 규칙을 수정하고 전체 산출물을 재생성해야 한다. 구버전 자료는 legacy_unverified 경계에 남겨 현재 연구 결과와 혼합하지 않았다.</w:t>
+      </w:r>
+    </w:p>
+    <w:p>
+      <w:pPr>
+        <w:pStyle w:val="Heading2"/>
+      </w:pPr>
+      <w:r>
+        <w:t>2.11 직접성 필터와 거짓양성 교정</w:t>
+      </w:r>
+    </w:p>
+    <w:p>
+      <w:r>
+        <w:t>초기 자동 후보에는 용어가 같지만 연구질문과 다른 문헌이 포함될 수 있었다. 예를 들어 vitamin K antagonist라는 약물 분류만 언급한 논문, 영양 섭취가 아닌 과다항응고 역전치료, 항응고제를 사용하지 않은 수술 출혈, 칼슘결석 기전만 다루고 칼슘 노출이 없는 연구가 이에 해당했다. 이에 A1은 식이·보충·항응고 안정성 노출을, A2는 항응고제와 출혈·응고 결과의 동시 표기를, B1은 경구·식이·보충 칼슘 노출을 요구하도록 직접성 규칙을 강화하였다. 소아·임신·동물 제목은 성인 핵심 집합에서 제외하되 원 검색 후보에서는 삭제하지 않았다. 질문별 30건을 채우기 위해 직접성이 낮은 문헌을 보충하지 않았다.</w:t>
+      </w:r>
+    </w:p>
+    <w:p>
+      <w:pPr>
+        <w:pStyle w:val="Heading2"/>
+      </w:pPr>
+      <w:r>
+        <w:t>2.12 용량 추출과 단위 정규화</w:t>
+      </w:r>
+    </w:p>
+    <w:p>
+      <w:r>
+        <w:t>용량은 성분명과 투여·섭취 맥락이 같은 문장에 있을 때만 관찰값으로 기록하였다. 숫자 뒤의 mg, mcg, µg, μg, g 또는 IU를 인식하되 검사 농도인 mg/dL은 제외하였다. 천 단위 쉼표와 공백을 모두 인식해 50,000 IU 또는 50 000 IU가 000 IU로 잘리는 오류를 막았고, 유전자 대립유전자 표기인 대문자 G는 gram으로 해석하지 않았다. 이 교정으로 과도하게 넓었던 용량 관찰 수는 987건에서 369건으로 바뀌었다. 이 값은 ‘유효하거나 안전한 용량’이 아니라 초록에서 성분 투여 맥락과 단위를 함께 관찰한 레코드 수다.</w:t>
+      </w:r>
+    </w:p>
+    <w:p>
+      <w:pPr>
+        <w:pStyle w:val="Heading2"/>
+      </w:pPr>
+      <w:r>
+        <w:t>2.13 합성 방법과 메타분석 결정</w:t>
+      </w:r>
+    </w:p>
+    <w:p>
+      <w:r>
+        <w:t>질문별 문헌은 대상자, 노출 형태, 연구설계와 결과 정의가 이질적이었고 사람 원문 선별·중복 보고 연결·비뚤림 위험 평가가 완료되지 않았다. 따라서 효과크기를 임의로 통합하거나 검색 레코드 수를 임상 효과의 크기로 해석하지 않았다. 본 단계의 합성은 질문별 직접 후보 수, 용량 관찰 여부, 원문 locator와 연구설계 후보를 구조화해 보여주는 방식으로 제한하였다. 향후 원문 이중 선별과 study-report 연결이 완료된 뒤, 동일한 비교와 결과를 보고한 독립 연구가 충분한 질문에서만 별도의 메타분석 적합성을 검토해야 한다.</w:t>
+      </w:r>
+    </w:p>
+    <w:p>
+      <w:pPr>
+        <w:pStyle w:val="Heading2"/>
+      </w:pPr>
+      <w:r>
+        <w:t>2.14 AI 문장화의 안전 경계</w:t>
+      </w:r>
+    </w:p>
+    <w:p>
+      <w:r>
+        <w:t>생성형 모델은 검색·포함 판단이나 임상 규칙을 만들지 않고 이미 구조화된 확인사항을 일반 사용자가 읽기 쉬운 한국어 한 문단으로 바꾸는 데만 사용하였다. 서버는 생성문에 나타난 숫자를 입력·근거의 숫자 집합과 비교하고, 새 숫자·URL·안전성 단정·복용 시작·중단·증량·감량 지시가 있으면 생성문을 폐기한다. 모델 호출 실패나 검증 실패 시에는 고정된 결정론적 문장을 반환한다. 사용자가 입력한 조건은 영구 저장하거나 애플리케이션 로그에 남기지 않으며, 화면에서 이름·연락처·주민등록번호 등 개인식별정보를 입력하지 않도록 안내하였다.</w:t>
+      </w:r>
+    </w:p>
+    <w:p>
+      <w:pPr>
+        <w:pStyle w:val="Heading2"/>
+      </w:pPr>
+      <w:r>
+        <w:t>2.15 검증 전략</w:t>
+      </w:r>
+    </w:p>
+    <w:p>
+      <w:r>
+        <w:t>검증은 연구 데이터와 소프트웨어를 분리해 수행하였다. 데이터 validator는 필수 열, 질문 집합, record 중복, DOI·provider ID·URL 형식, extraction authority, 사람 선별 허위표기, 질문별 직접성, 규칙과 문헌의 참조 무결성을 검사하였다. API 회귀검사는 다섯 질문의 routing, 입력 수치 보존, 지원하지 않는 성분, 잘못된 JSON, 과도한 입력, 비문자 필드와 생성형 모델의 허위 수치·복용 지시를 확인하였다. 브라우저 검증에서는 예시 입력, 결과 접힘, 키보드 접근, 모바일 390×844 화면과 개인정보 안내를 확인하였다. 이러한 기술 검증은 전문가 내용 타당도나 실제 환자 결과 검증을 의미하지 않는다.</w:t>
       </w:r>
     </w:p>
     <w:p>
@@ -1271,7 +1362,7 @@
         <w:pStyle w:val="ListNumber"/>
       </w:pPr>
       <w:r>
-        <w:t>[A1] Interaction Between Dietary Vitamin K Intake and Anticoagulation by Vitamin K Antagonists: Is It Really True?: A Systematic Review. 2016. 10.1097/md.0000000000002895</w:t>
+        <w:t>[A1] Violi F, Lip GY, Pignatelli P, Pastori D. Interaction Between Dietary Vitamin K Intake and Anticoagulation by Vitamin K Antagonists: Is It Really True?: A Systematic Review. Medicine. 2016. doi: 10.1097/md.0000000000002895</w:t>
       </w:r>
     </w:p>
     <w:p>
@@ -1279,7 +1370,7 @@
         <w:pStyle w:val="ListNumber"/>
       </w:pPr>
       <w:r>
-        <w:t>[A1] Vitamin K1 supplementation to improve the stability of anticoagulation therapy with vitamin K antagonists: a dose-finding study. 2011. 10.3324/haematol.2010.035162</w:t>
+        <w:t>[A1] Gebuis EP, Rosendaal FR, van Meegen E, van der Meer FJ. Vitamin K1 supplementation to improve the stability of anticoagulation therapy with vitamin K antagonists: a dose-finding study. Haematologica. 2011. doi: 10.3324/haematol.2010.035162</w:t>
       </w:r>
     </w:p>
     <w:p>
@@ -1287,7 +1378,7 @@
         <w:pStyle w:val="ListNumber"/>
       </w:pPr>
       <w:r>
-        <w:t>[A1] Over-the-counter vitamin K1-containing multivitamin supplements disrupt warfarin anticoagulation in vitamin K1-depleted patients. A prospective, controlled trial. 2004. 10.1160/th04-06-0346</w:t>
+        <w:t>[A1] Kurnik D, Loebstein R, Rabinovitz H, Austerweil N, Halkin H, Almog S. Over-the-counter vitamin K1-containing multivitamin supplements disrupt warfarin anticoagulation in vitamin K1-depleted patients. A prospective, controlled trial. Thrombosis and haemostasis. 2004. doi: 10.1160/th04-06-0346</w:t>
       </w:r>
     </w:p>
     <w:p>
@@ -1295,7 +1386,7 @@
         <w:pStyle w:val="ListNumber"/>
       </w:pPr>
       <w:r>
-        <w:t>[A1] Anticoagulation control with daily low-dose vitamin k to reduce clinically adverse outcomes and international normalized ratio variability: a systematic review and meta-analysis. 2013. 10.1002/phar.1302</w:t>
+        <w:t>[A1] Lam J, Schulman S, Witt DM, Vandvik PO, Qayyum F, Holbrook AM. Anticoagulation control with daily low-dose vitamin k to reduce clinically adverse outcomes and international normalized ratio variability: a systematic review and meta-analysis. Pharmacotherapy. 2013. doi: 10.1002/phar.1302</w:t>
       </w:r>
     </w:p>
     <w:p>
@@ -1303,7 +1394,7 @@
         <w:pStyle w:val="ListNumber"/>
       </w:pPr>
       <w:r>
-        <w:t>[A1] Role of dietary vitamin K intake in chronic oral anticoagulation: prospective evidence from observational and randomized protocols. 2004. 10.1016/j.amjmed.2003.12.036</w:t>
+        <w:t>[A1] Franco V, Polanczyk CA, Clausell N, Rohde LE. Role of dietary vitamin K intake in chronic oral anticoagulation: prospective evidence from observational and randomized protocols. The American journal of medicine. 2004. doi: 10.1016/j.amjmed.2003.12.036</w:t>
       </w:r>
     </w:p>
     <w:p>
@@ -1311,7 +1402,7 @@
         <w:pStyle w:val="ListNumber"/>
       </w:pPr>
       <w:r>
-        <w:t>[A1] Effect of Vitamin K Intake on the Stability of Treatment with Vitamin K Antagonists: A Systematic Review of the Literature. 2016. 10.1055/s-0036-1581105</w:t>
+        <w:t>[A1] Dentali F, Crowther M, Galli M, Pomero F, Garcia D, Clark N 외. Effect of Vitamin K Intake on the Stability of Treatment with Vitamin K Antagonists: A Systematic Review of the Literature. Seminars in thrombosis and hemostasis. 2016. doi: 10.1055/s-0036-1581105</w:t>
       </w:r>
     </w:p>
     <w:p>
@@ -1319,7 +1410,7 @@
         <w:pStyle w:val="ListNumber"/>
       </w:pPr>
       <w:r>
-        <w:t>[A1] The effect of low-dose oral vitamin K supplementation on INR stability in patients receiving warfarin. A randomised trial. 2016. 10.1160/th16-04-0320</w:t>
+        <w:t>[A1] Boonyawat K, Wang L, Lazo-Langner A, Kovacs MJ, Yeo E, Schnurr T 외. The effect of low-dose oral vitamin K supplementation on INR stability in patients receiving warfarin. A randomised trial. Thrombosis and haemostasis. 2016. doi: 10.1160/th16-04-0320</w:t>
       </w:r>
     </w:p>
     <w:p>
@@ -1327,7 +1418,7 @@
         <w:pStyle w:val="ListNumber"/>
       </w:pPr>
       <w:r>
-        <w:t>[A1] Vitamin K for improved anticoagulation control in patients receiving warfarin. 2014. 10.1002/14651858.cd009917.pub2</w:t>
+        <w:t>[A1] Mahtani KR, Heneghan CJ, Nunan D, Roberts NW. Vitamin K for improved anticoagulation control in patients receiving warfarin. The Cochrane database of systematic reviews. 2014. doi: 10.1002/14651858.cd009917.pub2</w:t>
       </w:r>
     </w:p>
     <w:p>
@@ -1335,7 +1426,7 @@
         <w:pStyle w:val="ListNumber"/>
       </w:pPr>
       <w:r>
-        <w:t>[A1] Does vitamin K supplementation improve vitamin K antagonist therapy? A case report and update of the literature. 2022. 10.1016/j.jccase.2021.12.011</w:t>
+        <w:t>[A1] Amiri SV, Sidelmann JJ, Bor MV. Does vitamin K supplementation improve vitamin K antagonist therapy? A case report and update of the literature. Journal of cardiology cases. 2022. doi: 10.1016/j.jccase.2021.12.011</w:t>
       </w:r>
     </w:p>
     <w:p>
@@ -1343,7 +1434,7 @@
         <w:pStyle w:val="ListNumber"/>
       </w:pPr>
       <w:r>
-        <w:t>[A1] Nutri-pharmacogenomics of warfarin anticoagulation therapy: VKORC1 genotype-dependent influence of dietary vitamin K intake. 2014. 10.1007/s11239-013-0978-9</w:t>
+        <w:t>[A1] Saito R, Takeda K, Yamamoto K, Nakagawa A, Aoki H, Fujibayashi K 외. Nutri-pharmacogenomics of warfarin anticoagulation therapy: VKORC1 genotype-dependent influence of dietary vitamin K intake. Journal of thrombosis and thrombolysis. 2014. doi: 10.1007/s11239-013-0978-9</w:t>
       </w:r>
     </w:p>
     <w:p>
@@ -1351,7 +1442,7 @@
         <w:pStyle w:val="ListNumber"/>
       </w:pPr>
       <w:r>
-        <w:t>[A1] Association Between Usual Vitamin K Intake and Anticoagulation in Patients Under Warfarin Therapy. 2015. 10.7762/cnr.2015.4.4.235</w:t>
+        <w:t>[A1] Park JN, Lee JS, Noh MY, Sung MK. Association Between Usual Vitamin K Intake and Anticoagulation in Patients Under Warfarin Therapy. Clinical nutrition research. 2015. doi: 10.7762/cnr.2015.4.4.235</w:t>
       </w:r>
     </w:p>
     <w:p>
@@ -1359,7 +1450,7 @@
         <w:pStyle w:val="ListNumber"/>
       </w:pPr>
       <w:r>
-        <w:t>[A1] Vitamin K supplementation can improve stability of anticoagulation for patients with unexplained variability in response to warfarin. 2007. 10.1182/blood-2006-09-049262</w:t>
+        <w:t>[A1] Sconce E, Avery P, Wynne H, Kamali F. Vitamin K supplementation can improve stability of anticoagulation for patients with unexplained variability in response to warfarin. Blood. 2007. doi: 10.1182/blood-2006-09-049262</w:t>
       </w:r>
     </w:p>
     <w:p>
@@ -1367,7 +1458,7 @@
         <w:pStyle w:val="ListNumber"/>
       </w:pPr>
       <w:r>
-        <w:t>[A1] Daily vitamin K supplementation improves anticoagulant stability. 2007. 10.1111/j.1538-7836.2007.02715.x</w:t>
+        <w:t>[A1] Rombouts EK, Rosendaal FR, Van Der Meer FJ. Daily vitamin K supplementation improves anticoagulant stability. Journal of thrombosis and haemostasis : JTH. 2007. doi: 10.1111/j.1538-7836.2007.02715.x</w:t>
       </w:r>
     </w:p>
     <w:p>
@@ -1375,7 +1466,7 @@
         <w:pStyle w:val="ListNumber"/>
       </w:pPr>
       <w:r>
-        <w:t>[A1] Effect of 200μG/day of vitamin K1 on the variability of anticoagulation control in patients on warfarin: a randomized controlled trial. 2013. 10.1016/j.thromres.2013.07.019</w:t>
+        <w:t>[A1] Majeed H, Rodger M, Forgie M, Carrier M, Taljaard M, Scarvelis D 외. Effect of 200μG/day of vitamin K1 on the variability of anticoagulation control in patients on warfarin: a randomized controlled trial. Thrombosis research. 2013. doi: 10.1016/j.thromres.2013.07.019</w:t>
       </w:r>
     </w:p>
     <w:p>
@@ -1383,7 +1474,7 @@
         <w:pStyle w:val="ListNumber"/>
       </w:pPr>
       <w:r>
-        <w:t>[A1] Warfarin and vitamin K intake in the era of pharmacogenetics. 2010. 10.1111/j.1365-2125.2010.03672.x</w:t>
+        <w:t>[A1] Lurie Y, Loebstein R, Kurnik D, Almog S, Halkin H. Warfarin and vitamin K intake in the era of pharmacogenetics. British journal of clinical pharmacology. 2010. doi: 10.1111/j.1365-2125.2010.03672.x</w:t>
       </w:r>
     </w:p>
     <w:p>
@@ -1391,7 +1482,7 @@
         <w:pStyle w:val="ListNumber"/>
       </w:pPr>
       <w:r>
-        <w:t>[A1] Vitamin K-dependent anticoagulant use and level of anticoagulation control in sub-Saharan Africa: protocol for a retrospective cohort study. 2022. 10.1136/bmjopen-2021-057166</w:t>
+        <w:t>[A1] Mwita JC, Damasceno A, Chillo P, Ogah OS, Cohen K, Oyekunle A 외. Vitamin K-dependent anticoagulant use and level of anticoagulation control in sub-Saharan Africa: protocol for a retrospective cohort study. BMJ open. 2022. doi: 10.1136/bmjopen-2021-057166</w:t>
       </w:r>
     </w:p>
     <w:p>
@@ -1399,7 +1490,7 @@
         <w:pStyle w:val="ListNumber"/>
       </w:pPr>
       <w:r>
-        <w:t>[A1] Relationship between dietary vitamin K intake and the stability of anticoagulation effect in patients taking long-term warfarin. 2010. 10.1160/th10-04-0257</w:t>
+        <w:t>[A1] Kim KH, Choi WS, Lee JH, Lee H, Yang DH, Chae SC. Relationship between dietary vitamin K intake and the stability of anticoagulation effect in patients taking long-term warfarin. Thrombosis and haemostasis. 2010. doi: 10.1160/th10-04-0257</w:t>
       </w:r>
     </w:p>
     <w:p>
@@ -1407,7 +1498,7 @@
         <w:pStyle w:val="ListNumber"/>
       </w:pPr>
       <w:r>
-        <w:t>[A1] Assessment of the Quality of Chronic Anticoagulation Control With Time in Therapeutic Range in Atrial Fibrillation Patients Treated With Vitamin K Antagonists by Hemostasis Specialists: The TERRA Registry: Tiempo en rango en la República Argentina. 2017. 10.1177/1076029615623378</w:t>
+        <w:t>[A1] Tajer C, Ceresetto J, Bottaro FJ, Martí A, Casey M, TERRA Trial investigators. Assessment of the Quality of Chronic Anticoagulation Control With Time in Therapeutic Range in Atrial Fibrillation Patients Treated With Vitamin K Antagonists by Hemostasis Specialists: The TERRA Registry: Tiempo en rango en la República Argentina. Clinical and applied thrombosis/hemostasis : official journal of the International Academy of Clinical and Applied Thrombosis/Hemostasis. 2017. doi: 10.1177/1076029615623378</w:t>
       </w:r>
     </w:p>
     <w:p>
@@ -1415,7 +1506,7 @@
         <w:pStyle w:val="ListNumber"/>
       </w:pPr>
       <w:r>
-        <w:t>[A1] Vitamin K intake, body mass index and warfarin maintenance dose. 2013. 10.1159/000354218</w:t>
+        <w:t>[A1] Kabagambe EK, Beasley TM, Limdi NA. Vitamin K intake, body mass index and warfarin maintenance dose. Cardiology. 2013. doi: 10.1159/000354218</w:t>
       </w:r>
     </w:p>
     <w:p>
@@ -1423,7 +1514,7 @@
         <w:pStyle w:val="ListNumber"/>
       </w:pPr>
       <w:r>
-        <w:t>[A1] Influence of dietary vitamin K intake on subtherapeutic oral anticoagulant therapy. 2010. 10.1111/j.1365-2141.2010.08108.x</w:t>
+        <w:t>[A1] Rombouts EK, Rosendaal FR, van der Meer FJ. Influence of dietary vitamin K intake on subtherapeutic oral anticoagulant therapy. British journal of haematology. 2010. doi: 10.1111/j.1365-2141.2010.08108.x</w:t>
       </w:r>
     </w:p>
     <w:p>
@@ -1431,7 +1522,7 @@
         <w:pStyle w:val="ListNumber"/>
       </w:pPr>
       <w:r>
-        <w:t>[A1] The effect of dietary vitamin K on warfarin-induced anticoagulation. 1991. 10.1111/j.1365-2796.1991.tb00388.x</w:t>
+        <w:t>[A1] Pedersen FM, Hamberg O, Hess K, Ovesen L. The effect of dietary vitamin K on warfarin-induced anticoagulation. Journal of internal medicine. 1991. doi: 10.1111/j.1365-2796.1991.tb00388.x</w:t>
       </w:r>
     </w:p>
     <w:p>
@@ -1439,7 +1530,7 @@
         <w:pStyle w:val="ListNumber"/>
       </w:pPr>
       <w:r>
-        <w:t>[A1] Proposed Criteria for the Use of Low-Dose Vitamin K Supplementation in Patients Using Vitamin K Antagonists: A Literature Review of a Clinical Controversy. 2018. 10.1177/0897190017711518</w:t>
+        <w:t>[A1] Evans CE, Getchell KE, Ivy DR. Proposed Criteria for the Use of Low-Dose Vitamin K Supplementation in Patients Using Vitamin K Antagonists: A Literature Review of a Clinical Controversy. Journal of pharmacy practice. 2018. doi: 10.1177/0897190017711518</w:t>
       </w:r>
     </w:p>
     <w:p>
@@ -1447,7 +1538,7 @@
         <w:pStyle w:val="ListNumber"/>
       </w:pPr>
       <w:r>
-        <w:t>[A1] Vitamin K supplementation to decrease variability of International Normalized Ratio in patients on vitamin K antagonists: a literature review. 2008. 10.1097/moh.0b013e328304b3c5</w:t>
+        <w:t>[A1] Ford SK, Moll S. Vitamin K supplementation to decrease variability of International Normalized Ratio in patients on vitamin K antagonists: a literature review. Current opinion in hematology. 2008. doi: 10.1097/moh.0b013e328304b3c5</w:t>
       </w:r>
     </w:p>
     <w:p>
@@ -1455,7 +1546,7 @@
         <w:pStyle w:val="ListNumber"/>
       </w:pPr>
       <w:r>
-        <w:t>[A1] Dietary vitamin K intake and anticoagulation in elderly patients. 2007. 10.1097/mco.0b013e328011c46c</w:t>
+        <w:t>[A1] Rohde LE, de Assis MC, Rabelo ER. Dietary vitamin K intake and anticoagulation in elderly patients. Current opinion in clinical nutrition and metabolic care. 2007. doi: 10.1097/mco.0b013e328011c46c</w:t>
       </w:r>
     </w:p>
     <w:p>
@@ -1463,7 +1554,7 @@
         <w:pStyle w:val="ListNumber"/>
       </w:pPr>
       <w:r>
-        <w:t>[A1] Low-dose vitamin K to augment anticoagulation control. 2005. 10.1592/phco.2005.25.12.1746</w:t>
+        <w:t>[A1] Reese AM, Farnett LE, Lyons RM, Patel B, Morgan L, Bussey HI. Low-dose vitamin K to augment anticoagulation control. Pharmacotherapy. 2005. doi: 10.1592/phco.2005.25.12.1746</w:t>
       </w:r>
     </w:p>
     <w:p>
@@ -1471,7 +1562,7 @@
         <w:pStyle w:val="ListNumber"/>
       </w:pPr>
       <w:r>
-        <w:t>[A1] Vitamin K intake and sensitivity to warfarin in patients consuming regular diets. 1999. https://pubmed.ncbi.nlm.nih.gov/10102468/</w:t>
+        <w:t>[A1] Lubetsky A, Dekel-Stern E, Chetrit A, Lubin F, Halkin H. Vitamin K intake and sensitivity to warfarin in patients consuming regular diets. Thrombosis and haemostasis. 1999. https://pubmed.ncbi.nlm.nih.gov/10102468/</w:t>
       </w:r>
     </w:p>
     <w:p>
@@ -1479,7 +1570,7 @@
         <w:pStyle w:val="ListNumber"/>
       </w:pPr>
       <w:r>
-        <w:t>[A1] Subtherapeutic Anticoagulation Control under Treatment with Vitamin K-Antagonists-Data from a Specialized Coagulation Service. 2019. 10.1055/s-0039-1692175</w:t>
+        <w:t>[A1] Prochaska JH, Hausner C, Nagler M, Göbel S, Eggebrecht L, Panova-Noeva M 외. Subtherapeutic Anticoagulation Control under Treatment with Vitamin K-Antagonists-Data from a Specialized Coagulation Service. Thrombosis and haemostasis. 2019. doi: 10.1055/s-0039-1692175</w:t>
       </w:r>
     </w:p>
     <w:p>
@@ -1487,7 +1578,7 @@
         <w:pStyle w:val="ListNumber"/>
       </w:pPr>
       <w:r>
-        <w:t>[A1] The role of dietary vitamin K in the management of oral vitamin K antagonists. 2012. 10.1016/j.blre.2011.07.002</w:t>
+        <w:t>[A1] Holmes MV, Hunt BJ, Shearer MJ. The role of dietary vitamin K in the management of oral vitamin K antagonists. Blood reviews. 2012. doi: 10.1016/j.blre.2011.07.002</w:t>
       </w:r>
     </w:p>
     <w:p>
@@ -1495,7 +1586,7 @@
         <w:pStyle w:val="ListNumber"/>
       </w:pPr>
       <w:r>
-        <w:t>[A1] Dietary vitamin K variability affects International Normalized Ratio (INR) coagulation indices. 2006. 10.1024/0300-9831.76.2.65</w:t>
+        <w:t>[A1] Couris R, Tataronis G, McCloskey W, Oertel L, Dallal G, Dwyer J 외. Dietary vitamin K variability affects International Normalized Ratio (INR) coagulation indices. International journal for vitamin and nutrition research. Internationale Zeitschrift fur Vitamin- und Ernahrungsforschung. Journal international de vitaminologie et de nutrition. 2006. doi: 10.1024/0300-9831.76.2.65</w:t>
       </w:r>
     </w:p>
     <w:p>
@@ -1503,7 +1594,7 @@
         <w:pStyle w:val="ListNumber"/>
       </w:pPr>
       <w:r>
-        <w:t>[A1] Dietary vitamin K influences intra-individual variability in anticoagulant response to warfarin. 2004. 10.1046/j.1365-2141.2003.04787.x</w:t>
+        <w:t>[A1] Khan T, Wynne H, Wood P, Torrance A, Hankey C, Avery P 외. Dietary vitamin K influences intra-individual variability in anticoagulant response to warfarin. British journal of haematology. 2004. doi: 10.1046/j.1365-2141.2003.04787.x</w:t>
       </w:r>
     </w:p>
     <w:p>
@@ -1511,7 +1602,7 @@
         <w:pStyle w:val="ListNumber"/>
       </w:pPr>
       <w:r>
-        <w:t>[A2] No Effect of Omega-3 Carboxylic Acids on Pharmacokinetics/Pharmacodynamics of Warfarin or on Platelet Function When Co-administered with Acetylsalicylic Acid: Results of Two Phase I Studies in Healthy Volunteers. 2017. 10.1007/s40256-017-0217-4</w:t>
+        <w:t>[A2] Offman E, Davidson M, Nilsson C. No Effect of Omega-3 Carboxylic Acids on Pharmacokinetics/Pharmacodynamics of Warfarin or on Platelet Function When Co-administered with Acetylsalicylic Acid: Results of Two Phase I Studies in Healthy Volunteers. American journal of cardiovascular drugs : drugs, devices, and other interventions. 2017. doi: 10.1007/s40256-017-0217-4</w:t>
       </w:r>
     </w:p>
     <w:p>
@@ -1519,7 +1610,7 @@
         <w:pStyle w:val="ListNumber"/>
       </w:pPr>
       <w:r>
-        <w:t>[A2] The assessment of risk for gastrointestinal injury with anticoagulant and antiplatelet drugs: the possible beneficial effect of eicosapentaenoic Acid for the risk of gastrointestinal injury. 2013. 10.1248/bpb.b12-00584</w:t>
+        <w:t>[A2] Tanaka M, Tanaka A, Suemaru K, Araki H. The assessment of risk for gastrointestinal injury with anticoagulant and antiplatelet drugs: the possible beneficial effect of eicosapentaenoic Acid for the risk of gastrointestinal injury. Biological &amp; pharmaceutical bulletin. 2013. doi: 10.1248/bpb.b12-00584</w:t>
       </w:r>
     </w:p>
     <w:p>
@@ -1527,7 +1618,7 @@
         <w:pStyle w:val="ListNumber"/>
       </w:pPr>
       <w:r>
-        <w:t>[A2] Plasma triacylglycerol and coagulation factor concentrations predict the anticoagulant effect of dietary fish oil in overweight subjects. 2007. 10.1093/jn/137.1.7</w:t>
+        <w:t>[A2] Vanschoonbeek K, Feijge MA, Saris WH, de Maat MP, Heemskerk JW. Plasma triacylglycerol and coagulation factor concentrations predict the anticoagulant effect of dietary fish oil in overweight subjects. The Journal of nutrition. 2007. doi: 10.1093/jn/137.1.7</w:t>
       </w:r>
     </w:p>
     <w:p>
@@ -1535,7 +1626,7 @@
         <w:pStyle w:val="ListNumber"/>
       </w:pPr>
       <w:r>
-        <w:t>[A2] Extremely prolonged INR associated with warfarin in combination with both trazodone and omega-3 fatty acids. 2007. 10.1016/j.arcmed.2007.05.004</w:t>
+        <w:t>[A2] Jalili M, Dehpour AR. Extremely prolonged INR associated with warfarin in combination with both trazodone and omega-3 fatty acids. Archives of medical research. 2007. doi: 10.1016/j.arcmed.2007.05.004</w:t>
       </w:r>
     </w:p>
     <w:p>
@@ -1543,7 +1634,7 @@
         <w:pStyle w:val="ListNumber"/>
       </w:pPr>
       <w:r>
-        <w:t>[A2] Effects of Marine Fish Oils on the Anticoagulation Status of Patients Receiving Chronic Warfarin Therapy. 1998. 10.1023/a:1008852127668</w:t>
+        <w:t>[A2] Bender NK, Kraynak MA, Chiquette E, Linn WD, Clark GM, Bussey HI. Effects of Marine Fish Oils on the Anticoagulation Status of Patients Receiving Chronic Warfarin Therapy. Journal of thrombosis and thrombolysis. 1998. doi: 10.1023/a:1008852127668</w:t>
       </w:r>
     </w:p>
     <w:p>
@@ -1551,7 +1642,7 @@
         <w:pStyle w:val="ListNumber"/>
       </w:pPr>
       <w:r>
-        <w:t>[B1] Why oral calcium supplements may reduce renal stone disease: report of a clinical pilot study. 2001. 10.1136/jcp.54.1.54</w:t>
+        <w:t>[B1] Williams CP, Child DF, Hudson PR, Davies GK, Davies MG, John R 외. Why oral calcium supplements may reduce renal stone disease: report of a clinical pilot study. Journal of clinical pathology. 2001. doi: 10.1136/jcp.54.1.54</w:t>
       </w:r>
     </w:p>
     <w:p>
@@ -1559,7 +1650,7 @@
         <w:pStyle w:val="ListNumber"/>
       </w:pPr>
       <w:r>
-        <w:t>[B1] Incidence of hypercalciuria and hypercalcemia during vitamin D and calcium supplementation in older women. 2014. 10.1097/gme.0000000000000270</w:t>
+        <w:t>[B1] Gallagher JC, Smith LM, Yalamanchili V. Incidence of hypercalciuria and hypercalcemia during vitamin D and calcium supplementation in older women. Menopause (New York, N.Y.). 2014. doi: 10.1097/gme.0000000000000270</w:t>
       </w:r>
     </w:p>
     <w:p>
@@ -1567,7 +1658,7 @@
         <w:pStyle w:val="ListNumber"/>
       </w:pPr>
       <w:r>
-        <w:t>[B1] Risk of calcium oxalate nephrolithiasis in postmenopausal women supplemented with calcium or combined calcium and estrogen. 2002. 10.1016/s0378-5122(01)00277-8</w:t>
+        <w:t>[B1] Domrongkitchaiporn S, Ongphiphadhanakul B, Stitchantrakul W, Chansirikarn S, Puavilai G, Rajatanavin R. Risk of calcium oxalate nephrolithiasis in postmenopausal women supplemented with calcium or combined calcium and estrogen. Maturitas. 2002. doi: 10.1016/s0378-5122(01)00277-8</w:t>
       </w:r>
     </w:p>
     <w:p>
@@ -1575,7 +1666,7 @@
         <w:pStyle w:val="ListNumber"/>
       </w:pPr>
       <w:r>
-        <w:t>[B1] Substituting milk for apple juice does not increase kidney stone risk in most normocalciuric adults who form calcium oxalate stones. 1998. 10.1016/s0002-8223(98)00071-6</w:t>
+        <w:t>[B1] Massey LK, Kynast-Gales SA. Substituting milk for apple juice does not increase kidney stone risk in most normocalciuric adults who form calcium oxalate stones. Journal of the American Dietetic Association. 1998. doi: 10.1016/s0002-8223(98)00071-6</w:t>
       </w:r>
     </w:p>
     <w:p>
@@ -1583,7 +1674,7 @@
         <w:pStyle w:val="ListNumber"/>
       </w:pPr>
       <w:r>
-        <w:t>[B1] Calcium supplementation and kidney stone risk in osteoporosis: a systematic literature review. 2012. https://pubmed.ncbi.nlm.nih.gov/23137489/</w:t>
+        <w:t>[B1] Candelas G, Martinez-Lopez JA, Rosario MP, Carmona L, Loza E. Calcium supplementation and kidney stone risk in osteoporosis: a systematic literature review. Clinical and experimental rheumatology. 2012. https://pubmed.ncbi.nlm.nih.gov/23137489/</w:t>
       </w:r>
     </w:p>
     <w:p>
@@ -1591,7 +1682,7 @@
         <w:pStyle w:val="ListNumber"/>
       </w:pPr>
       <w:r>
-        <w:t>[B1] Calcium supplementation and incident kidney stone risk: a systematic review. 2008. 10.1080/07315724.2008.10719734</w:t>
+        <w:t>[B1] Heaney RP. Calcium supplementation and incident kidney stone risk: a systematic review. Journal of the American College of Nutrition. 2008. doi: 10.1080/07315724.2008.10719734</w:t>
       </w:r>
     </w:p>
     <w:p>
@@ -1599,7 +1690,7 @@
         <w:pStyle w:val="ListNumber"/>
       </w:pPr>
       <w:r>
-        <w:t>[B1] Stone-forming potential of milk or calcium-fortified orange juice in idiopathic hypercalciuric adults. 1992. 10.1038/ki.1992.18</w:t>
+        <w:t>[B1] Coe FL, Parks JH, Webb DR. Stone-forming potential of milk or calcium-fortified orange juice in idiopathic hypercalciuric adults. Kidney international. 1992. doi: 10.1038/ki.1992.18</w:t>
       </w:r>
     </w:p>
     <w:p>
@@ -1607,7 +1698,7 @@
         <w:pStyle w:val="ListNumber"/>
       </w:pPr>
       <w:r>
-        <w:t>[B1] Biochemical control of bone loss and stone-forming propensity by potassium-calcium citrate after bariatric surgery. 2012. 10.1016/j.soard.2011.05.001</w:t>
+        <w:t>[B1] Sakhaee K, Griffith C, Pak CY. Biochemical control of bone loss and stone-forming propensity by potassium-calcium citrate after bariatric surgery. Surgery for obesity and related diseases : official journal of the American Society for Bariatric Surgery. 2012. doi: 10.1016/j.soard.2011.05.001</w:t>
       </w:r>
     </w:p>
     <w:p>
@@ -1615,7 +1706,7 @@
         <w:pStyle w:val="ListNumber"/>
       </w:pPr>
       <w:r>
-        <w:t>[B1] Schedule of taking calcium supplement and the risk of nephrolithiasis. 2004. 10.1111/j.1523-1755.2004.00587.x</w:t>
+        <w:t>[B1] Domrongkitchaiporn S, Sopassathit W, Stitchantrakul W, Prapaipanich S, Ingsathit A, Rajatanavin R. Schedule of taking calcium supplement and the risk of nephrolithiasis. Kidney international. 2004. doi: 10.1111/j.1523-1755.2004.00587.x</w:t>
       </w:r>
     </w:p>
     <w:p>
@@ -1623,7 +1714,7 @@
         <w:pStyle w:val="ListNumber"/>
       </w:pPr>
       <w:r>
-        <w:t>[B1] Effect of dietary calcium on stone forming propensity. 2003. 10.1097/01.ju.0000043669.63989.22</w:t>
+        <w:t>[B1] Heller HJ, Doerner MF, Brinkley LJ, Adams-Huet B, Pak CY. Effect of dietary calcium on stone forming propensity. The Journal of urology. 2003. doi: 10.1097/01.ju.0000043669.63989.22</w:t>
       </w:r>
     </w:p>
     <w:p>
@@ -1631,7 +1722,7 @@
         <w:pStyle w:val="ListNumber"/>
       </w:pPr>
       <w:r>
-        <w:t>[B1] Prolonged dietary calcium restriction: a diagnostic approach in idiopathic hypercalciuria. 2001. 10.1159/000046108</w:t>
+        <w:t>[B1] Müller D, Eggert P. Prolonged dietary calcium restriction: a diagnostic approach in idiopathic hypercalciuria. Nephron. 2001. doi: 10.1159/000046108</w:t>
       </w:r>
     </w:p>
     <w:p>
@@ -1639,7 +1730,7 @@
         <w:pStyle w:val="ListNumber"/>
       </w:pPr>
       <w:r>
-        <w:t>[B1] Effect of mineral water containing calcium and magnesium on calcium oxalate urolithiasis risk factors. 1997. 10.1159/000282958</w:t>
+        <w:t>[B1] Rodgers AL. Effect of mineral water containing calcium and magnesium on calcium oxalate urolithiasis risk factors. Urologia internationalis. 1997. doi: 10.1159/000282958</w:t>
       </w:r>
     </w:p>
     <w:p>
@@ -1647,7 +1738,7 @@
         <w:pStyle w:val="ListNumber"/>
       </w:pPr>
       <w:r>
-        <w:t>[B1] Sensitivity to calcium intake in calcium stone forming patients. 1996. 10.1159/000189031</w:t>
+        <w:t>[B1] Heilberg IP, Martini LA, Draibe SA, Ajzen H, Ramos OL, Schor N. Sensitivity to calcium intake in calcium stone forming patients. Nephron. 1996. doi: 10.1159/000189031</w:t>
       </w:r>
     </w:p>
     <w:p>
@@ -1655,7 +1746,7 @@
         <w:pStyle w:val="ListNumber"/>
       </w:pPr>
       <w:r>
-        <w:t>[B1] Vitamin D and Calcium Supplementation and Urolithiasis: A Controversial and Multifaceted Relationship. 2023. 10.3390/nu15071724</w:t>
+        <w:t>[B1] Messa P, Castellano G, Vettoretti S, Alfieri CM, Giannese D, Panichi V 외. Vitamin D and Calcium Supplementation and Urolithiasis: A Controversial and Multifaceted Relationship. Nutrients. 2023. doi: 10.3390/nu15071724</w:t>
       </w:r>
     </w:p>
     <w:p>
@@ -1663,7 +1754,7 @@
         <w:pStyle w:val="ListNumber"/>
       </w:pPr>
       <w:r>
-        <w:t>[B1] Combined vitamin D and calcium supplementation in vitamin D inadequate patients with urolithiasis: Impact on hypercalciuria and de novo stone formation. 2015. 10.5489/cuaj.3332</w:t>
+        <w:t>[B1] Hesswani C, Noureldin YA, Elkoushy MA, Andonian S. Combined vitamin D and calcium supplementation in vitamin D inadequate patients with urolithiasis: Impact on hypercalciuria and de novo stone formation. Canadian Urological Association journal = Journal de l'Association des urologues du Canada. 2015. doi: 10.5489/cuaj.3332</w:t>
       </w:r>
     </w:p>
     <w:p>
@@ -1671,7 +1762,7 @@
         <w:pStyle w:val="ListNumber"/>
       </w:pPr>
       <w:r>
-        <w:t>[B1] Effects of calcium supplements on the risk of renal stone formation in a population with low oxalate intake. 2004. https://pubmed.ncbi.nlm.nih.gov/15916110/</w:t>
+        <w:t>[B1] Stitchantrakul W, Sopassathit W, Prapaipanich S, Domrongkitchaiporn S. Effects of calcium supplements on the risk of renal stone formation in a population with low oxalate intake. The Southeast Asian journal of tropical medicine and public health. 2004. https://pubmed.ncbi.nlm.nih.gov/15916110/</w:t>
       </w:r>
     </w:p>
     <w:p>
@@ -1679,7 +1770,7 @@
         <w:pStyle w:val="ListNumber"/>
       </w:pPr>
       <w:r>
-        <w:t>[B1] A prospective study of dietary calcium and other nutrients and the risk of symptomatic kidney stones. 1993. 10.1056/nejm199303253281203</w:t>
+        <w:t>[B1] Curhan GC, Willett WC, Rimm EB, Stampfer MJ. A prospective study of dietary calcium and other nutrients and the risk of symptomatic kidney stones. The New England journal of medicine. 1993. doi: 10.1056/nejm199303253281203</w:t>
       </w:r>
     </w:p>
     <w:p>
@@ -1687,7 +1778,7 @@
         <w:pStyle w:val="ListNumber"/>
       </w:pPr>
       <w:r>
-        <w:t>[B1] Effect of high-calcium diet on urinary oxalate excretion in urinary stone formers. 1988. 10.1159/000473449</w:t>
+        <w:t>[B1] Nakada T, Sasagawa I, Furuta H, Katayama T, Shimazaki J. Effect of high-calcium diet on urinary oxalate excretion in urinary stone formers. European urology. 1988. doi: 10.1159/000473449</w:t>
       </w:r>
     </w:p>
     <w:p>
@@ -1695,7 +1786,7 @@
         <w:pStyle w:val="ListNumber"/>
       </w:pPr>
       <w:r>
-        <w:t>[B1] Measurement of precipitated calcium citrate in 24-hour urine samples is clinically useful for ruling out calcium oxalate urolithiasis. 2026. 10.1177/00368504251363660</w:t>
+        <w:t>[B1] Tantasith C, Tubsaeng P, Boonkam K, Madared N, Boonla C. Measurement of precipitated calcium citrate in 24-hour urine samples is clinically useful for ruling out calcium oxalate urolithiasis. Science progress. 2026. doi: 10.1177/00368504251363660</w:t>
       </w:r>
     </w:p>
     <w:p>
@@ -1703,7 +1794,7 @@
         <w:pStyle w:val="ListNumber"/>
       </w:pPr>
       <w:r>
-        <w:t>[B1] High dietary calcium to phosphorus ratio is associated with high prevalence of kidney stone. 2024. 10.1097/md.0000000000040778</w:t>
+        <w:t>[B1] Zhang W, Lou B, Peng Y, Wu F, Zhang D, Wang Q. High dietary calcium to phosphorus ratio is associated with high prevalence of kidney stone. Medicine. 2024. doi: 10.1097/md.0000000000040778</w:t>
       </w:r>
     </w:p>
     <w:p>
@@ -1711,7 +1802,7 @@
         <w:pStyle w:val="ListNumber"/>
       </w:pPr>
       <w:r>
-        <w:t>[B1] Plant-Based Milk Alternatives and Risk Factors for Kidney Stones and Chronic Kidney Disease. 2022. 10.1053/j.jrn.2021.03.011</w:t>
+        <w:t>[B1] Borin JF, Knight J, Holmes RP, Joshi S, Goldfarb DS, Loeb S. Plant-Based Milk Alternatives and Risk Factors for Kidney Stones and Chronic Kidney Disease. Journal of renal nutrition : the official journal of the Council on Renal Nutrition of the National Kidney Foundation. 2022. doi: 10.1053/j.jrn.2021.03.011</w:t>
       </w:r>
     </w:p>
     <w:p>
@@ -1719,7 +1810,7 @@
         <w:pStyle w:val="ListNumber"/>
       </w:pPr>
       <w:r>
-        <w:t>[B1] Staged treatment for substantial bilateral calcium carbonate nephrolithiasis in vegan patient. 2021. 10.1016/j.eucr.2021.101831</w:t>
+        <w:t>[B1] Khooblall P, Morcos D, Mahmood F, Ricchiuti VS. Staged treatment for substantial bilateral calcium carbonate nephrolithiasis in vegan patient. Urology case reports. 2021. doi: 10.1016/j.eucr.2021.101831</w:t>
       </w:r>
     </w:p>
     <w:p>
@@ -1727,7 +1818,7 @@
         <w:pStyle w:val="ListNumber"/>
       </w:pPr>
       <w:r>
-        <w:t>[B1] Changes in urinary risk profile after short-term low sodium and low calcium diet in recurrent Swiss kidney stone formers. 2017. 10.1186/s12882-017-0755-7</w:t>
+        <w:t>[B1] Seeger H, Kaelin A, Ferraro PM, Weber D, Jaeger P, Ambuehl P 외. Changes in urinary risk profile after short-term low sodium and low calcium diet in recurrent Swiss kidney stone formers. BMC nephrology. 2017. doi: 10.1186/s12882-017-0755-7</w:t>
       </w:r>
     </w:p>
     <w:p>
@@ -1735,7 +1826,7 @@
         <w:pStyle w:val="ListNumber"/>
       </w:pPr>
       <w:r>
-        <w:t>[B1] Dietary calcium from dairy and nondairy sources, and risk of symptomatic kidney stones. 2013. 10.1016/j.juro.2013.03.074</w:t>
+        <w:t>[B1] Taylor EN, Curhan GC. Dietary calcium from dairy and nondairy sources, and risk of symptomatic kidney stones. The Journal of urology. 2013. doi: 10.1016/j.juro.2013.03.074</w:t>
       </w:r>
     </w:p>
     <w:p>
@@ -1743,7 +1834,7 @@
         <w:pStyle w:val="ListNumber"/>
       </w:pPr>
       <w:r>
-        <w:t>[B1] Impact of calcium intake and intestinal calcium absorption on kidney stones in older women: the study of osteoporotic fractures. 2012. 10.1016/j.juro.2011.11.109</w:t>
+        <w:t>[B1] Sorensen MD, Eisner BH, Stone KL, Kahn AJ, Lui LY, Sadetsky N 외. Impact of calcium intake and intestinal calcium absorption on kidney stones in older women: the study of osteoporotic fractures. The Journal of urology. 2012. doi: 10.1016/j.juro.2011.11.109</w:t>
       </w:r>
     </w:p>
     <w:p>
@@ -1751,7 +1842,7 @@
         <w:pStyle w:val="ListNumber"/>
       </w:pPr>
       <w:r>
-        <w:t>[B1] Effect of calcium intake on urinary oxalate excretion in calcium stone-forming patients. 2002. 10.1590/s0100-879x2002000600006</w:t>
+        <w:t>[B1] Nishiura JL, Martini LA, Mendonça CO, Schor N, Heilberg IP. Effect of calcium intake on urinary oxalate excretion in calcium stone-forming patients. Brazilian journal of medical and biological research = Revista brasileira de pesquisas medicas e biologicas. 2002. doi: 10.1590/s0100-879x2002000600006</w:t>
       </w:r>
     </w:p>
     <w:p>
@@ -1759,7 +1850,7 @@
         <w:pStyle w:val="ListNumber"/>
       </w:pPr>
       <w:r>
-        <w:t>[B1] Calcium citrate: reduced propensity for the crystallization of calcium oxalate in urine resulting from induced hypercalciuria of calcium supplementation. 1985. 10.1210/jcem-61-6-1223</w:t>
+        <w:t>[B1] Harvey JA, Zobitz MM, Pak CY. Calcium citrate: reduced propensity for the crystallization of calcium oxalate in urine resulting from induced hypercalciuria of calcium supplementation. The Journal of clinical endocrinology and metabolism. 1985. doi: 10.1210/jcem-61-6-1223</w:t>
       </w:r>
     </w:p>
     <w:p>
@@ -1767,7 +1858,7 @@
         <w:pStyle w:val="ListNumber"/>
       </w:pPr>
       <w:r>
-        <w:t>[B1] Effect of calcium restriction on renal excretion of oxalate and the probability of stones in the various pathophysiological groups with calcium stones. 1983. 10.1016/s0022-5347(17)51073-3</w:t>
+        <w:t>[B1] Bataille P, Charransol G, Gregoire I, Daigre JL, Coevoet B, Makdassi R 외. Effect of calcium restriction on renal excretion of oxalate and the probability of stones in the various pathophysiological groups with calcium stones. The Journal of urology. 1983. doi: 10.1016/s0022-5347(17)51073-3</w:t>
       </w:r>
     </w:p>
     <w:p>
@@ -1775,7 +1866,7 @@
         <w:pStyle w:val="ListNumber"/>
       </w:pPr>
       <w:r>
-        <w:t>[B1] Biochemical and molecular investigation of oxidative stress associated with urolithiasis induced by increased dietary calcium or protein in chickens. 2021. 10.1111/jpn.13436</w:t>
+        <w:t>[B1] Allie S, Rodgers A. Effects of calcium carbonate, magnesium oxide and sodium citrate bicarbonate health supplements on the urinary risk factors for kidney stone formation. Clinical chemistry and laboratory medicine. 2003. doi: 10.1515/cclm.2003.008</w:t>
       </w:r>
     </w:p>
     <w:p>
@@ -1783,7 +1874,7 @@
         <w:pStyle w:val="ListNumber"/>
       </w:pPr>
       <w:r>
-        <w:t>[B1] Effects of calcium carbonate, magnesium oxide and sodium citrate bicarbonate health supplements on the urinary risk factors for kidney stone formation. 2003. 10.1515/cclm.2003.008</w:t>
+        <w:t>[B1] Messa P, Marangella M, Paganin L, Codardini M, Cruciatti A, Turrin D 외. Different dietary calcium intake and relative supersaturation of calcium oxalate in the urine of patients forming renal stones. Clinical science (London, England : 1979). 1997. doi: 10.1042/cs0930257</w:t>
       </w:r>
     </w:p>
     <w:p>
@@ -1791,7 +1882,7 @@
         <w:pStyle w:val="ListNumber"/>
       </w:pPr>
       <w:r>
-        <w:t>[B2] Effect of two vitamin D repletion protocols on 24-h urine calcium in patients with recurrent calcium kidney stones and vitamin D deficiency: a randomized clinical trial. 2023. 10.1186/s40001-023-01226-z</w:t>
+        <w:t>[B2] Sardari Masihi L, Borumandnia N, Taheri M, Basiri A, Imani H, Jalali S 외. Effect of two vitamin D repletion protocols on 24-h urine calcium in patients with recurrent calcium kidney stones and vitamin D deficiency: a randomized clinical trial. European journal of medical research. 2023. doi: 10.1186/s40001-023-01226-z</w:t>
       </w:r>
     </w:p>
     <w:p>
@@ -1799,7 +1890,7 @@
         <w:pStyle w:val="ListNumber"/>
       </w:pPr>
       <w:r>
-        <w:t>[B2] Risk of hypercalcemia in blacks taking hydrochlorothiazide and vitamin D. 2014. 10.1016/j.amjmed.2014.02.044</w:t>
+        <w:t>[B2] Chandler PD, Scott JB, Drake BF, Ng K, Forman JP, Chan AT 외. Risk of hypercalcemia in blacks taking hydrochlorothiazide and vitamin D. The American journal of medicine. 2014. doi: 10.1016/j.amjmed.2014.02.044</w:t>
       </w:r>
     </w:p>
     <w:p>
@@ -1807,7 +1898,7 @@
         <w:pStyle w:val="ListNumber"/>
       </w:pPr>
       <w:r>
-        <w:t>[B2] Incidence of hypercalciuria and hypercalcemia during vitamin D and calcium supplementation in older women. 2014. 10.1097/gme.0000000000000270</w:t>
+        <w:t>[B2] Gallagher JC, Smith LM, Yalamanchili V. Incidence of hypercalciuria and hypercalcemia during vitamin D and calcium supplementation in older women. Menopause (New York, N.Y.). 2014. doi: 10.1097/gme.0000000000000270</w:t>
       </w:r>
     </w:p>
     <w:p>
@@ -1815,7 +1906,7 @@
         <w:pStyle w:val="ListNumber"/>
       </w:pPr>
       <w:r>
-        <w:t>[B2] A 250 μg/week dose of vitamin D was as effective as a 50 μg/d dose in healthy adults, but a regimen of four weekly followed by monthly doses of 1250 μg raised the risk of hypercalciuria. 2013. 10.1017/s000711451300113x</w:t>
+        <w:t>[B2] Zwart SR, Parsons H, Kimlin M, Innis SM, Locke JP, Smith SM. A 250 μg/week dose of vitamin D was as effective as a 50 μg/d dose in healthy adults, but a regimen of four weekly followed by monthly doses of 1250 μg raised the risk of hypercalciuria. The British journal of nutrition. 2013. doi: 10.1017/s000711451300113x</w:t>
       </w:r>
     </w:p>
     <w:p>
@@ -1823,7 +1914,7 @@
         <w:pStyle w:val="ListNumber"/>
       </w:pPr>
       <w:r>
-        <w:t>[B2] Monthly high-dose vitamin D supplementation does not increase kidney stone risk or serum calcium: results from a randomized controlled trial. 2019. 10.1093/ajcn/nqy378</w:t>
+        <w:t>[B2] Malihi Z, Lawes CMM, Wu Z, Huang Y, Waayer D, Toop L 외. Monthly high-dose vitamin D supplementation does not increase kidney stone risk or serum calcium: results from a randomized controlled trial. The American journal of clinical nutrition. 2019. doi: 10.1093/ajcn/nqy378</w:t>
       </w:r>
     </w:p>
     <w:p>
@@ -1831,7 +1922,7 @@
         <w:pStyle w:val="ListNumber"/>
       </w:pPr>
       <w:r>
-        <w:t>[B2] Vitamin D Repletion in Kidney Stone Formers: A Randomized Controlled Trial. 2017. 10.1016/j.juro.2016.10.057</w:t>
+        <w:t>[B2] Ferroni MC, Rycyna KJ, Averch TD, Semins MJ. Vitamin D Repletion in Kidney Stone Formers: A Randomized Controlled Trial. The Journal of urology. 2017. doi: 10.1016/j.juro.2016.10.057</w:t>
       </w:r>
     </w:p>
     <w:p>
@@ -1839,7 +1930,7 @@
         <w:pStyle w:val="ListNumber"/>
       </w:pPr>
       <w:r>
-        <w:t>[B2] No Severe Hypercalcemia with Daily Vitamin D3 Supplementation of up to 30 µg during the First Year of Life. 2017. 10.1159/000477298</w:t>
+        <w:t>[B2] Malihi Z, Wu Z, Stewart AW, Lawes CM, Scragg R. Hypercalcemia, hypercalciuria, and kidney stones in long-term studies of vitamin D supplementation: a systematic review and meta-analysis. The American journal of clinical nutrition. 2016. doi: 10.3945/ajcn.116.134981</w:t>
       </w:r>
     </w:p>
     <w:p>
@@ -1847,7 +1938,7 @@
         <w:pStyle w:val="ListNumber"/>
       </w:pPr>
       <w:r>
-        <w:t>[B2] Hypercalcemia, hypercalciuria, and kidney stones in long-term studies of vitamin D supplementation: a systematic review and meta-analysis. 2016. 10.3945/ajcn.116.134981</w:t>
+        <w:t>[B2] Alzaben N, Mokhtar A, Altwijri F, Alawaji S, Almannie R, Binsaleh S 외. Association Between Vitamin D Supplementation and Urolithiasis Recurrence Outcomes in Known Stone Formers: A Retrospective Cohort Study With Dose-Response Analysis. Cureus. 2025. doi: 10.7759/cureus.90853</w:t>
       </w:r>
     </w:p>
     <w:p>
@@ -1855,7 +1946,7 @@
         <w:pStyle w:val="ListNumber"/>
       </w:pPr>
       <w:r>
-        <w:t>[B2] Association Between Vitamin D Supplementation and Urolithiasis Recurrence Outcomes in Known Stone Formers: A Retrospective Cohort Study With Dose-Response Analysis. 2025. 10.7759/cureus.90853</w:t>
+        <w:t>[B2] Milart J, Jobs K, Tłustochowicz M, Pogonowska M, Kalicki B. The impact of vitamin D supplementation on vitamin D level, urinary calcium excretion and bone density in patients with hypercalciuria and vitamin D deficiency - preliminary report. Developmental period medicine. 2018. doi: 10.34763/devperiodmed.20182202.144152</w:t>
       </w:r>
     </w:p>
     <w:p>
@@ -1863,7 +1954,7 @@
         <w:pStyle w:val="ListNumber"/>
       </w:pPr>
       <w:r>
-        <w:t>[B2] The impact of vitamin D supplementation on vitamin D level, urinary calcium excretion and bone density in patients with hypercalciuria and vitamin D deficiency - preliminary report. 2018. 10.34763/devperiodmed.20182202.144152</w:t>
+        <w:t>[B2] Dickerson RN, Turner SC, Holmes WL, Van Matre ET, Swanson JM, Byerly S 외. Reduction in Hypercalcemia Following Readjustment of Target Serum 25-Hydroxy Vitamin D Concentration during Cholecalciferol Therapy in Vitamin D-Deficient Critically Ill Patients. Nutrients. 2022. doi: 10.3390/nu14081650</w:t>
       </w:r>
     </w:p>
     <w:p>
@@ -1871,7 +1962,7 @@
         <w:pStyle w:val="ListNumber"/>
       </w:pPr>
       <w:r>
-        <w:t>[B2] Reduction in Hypercalcemia Following Readjustment of Target Serum 25-Hydroxy Vitamin D Concentration during Cholecalciferol Therapy in Vitamin D-Deficient Critically Ill Patients. 2022. 10.3390/nu14081650</w:t>
+        <w:t>[B2] Chagnac A, Ori Y, Weinstein T, Zevin D, Korzets A, Hirsh J 외. Hypercalcemia during pulse vitamin D3 therapy in CAPD patients treated with low calcium dialysate: the role of the decreasing serum parathyroid hormone level. Journal of the American Society of Nephrology : JASN. 1997. doi: 10.1681/asn.v8101579</w:t>
       </w:r>
     </w:p>
     <w:p>
@@ -1879,7 +1970,7 @@
         <w:pStyle w:val="ListNumber"/>
       </w:pPr>
       <w:r>
-        <w:t>[B2] Hypercalcemia during pulse vitamin D3 therapy in CAPD patients treated with low calcium dialysate: the role of the decreasing serum parathyroid hormone level. 1997. 10.1681/asn.v8101579</w:t>
+        <w:t>[B2] Theilade S, Yahyavi SK, Jensen MB, Eldrup E. Exacerbated hypercalcemia, nephrolithiasis, and renal impairment after vitamin D supplementation in granulomatous disease: a case report. Journal of medical case reports. 2025. doi: 10.1186/s13256-025-05078-5</w:t>
       </w:r>
     </w:p>
     <w:p>
@@ -1887,7 +1978,7 @@
         <w:pStyle w:val="ListNumber"/>
       </w:pPr>
       <w:r>
-        <w:t>[B2] Exacerbated hypercalcemia, nephrolithiasis, and renal impairment after vitamin D supplementation in granulomatous disease: a case report. 2025. 10.1186/s13256-025-05078-5</w:t>
+        <w:t>[B2] Ferraro PM, Taylor EN, Gambaro G, Curhan GC. Vitamin D Intake and the Risk of Incident Kidney Stones. The Journal of urology. 2017. doi: 10.1016/j.juro.2016.08.084</w:t>
       </w:r>
     </w:p>
     <w:p>
@@ -1895,7 +1986,7 @@
         <w:pStyle w:val="ListNumber"/>
       </w:pPr>
       <w:r>
-        <w:t>[B2] Vitamin D Intake and the Risk of Incident Kidney Stones. 2017. 10.1016/j.juro.2016.08.084</w:t>
+        <w:t>[B2] Leaf DE, Korets R, Taylor EN, Tang J, Asplin JR, Goldfarb DS 외. Effect of vitamin D repletion on urinary calcium excretion among kidney stone formers. Clinical journal of the American Society of Nephrology : CJASN. 2012. doi: 10.2215/cjn.11331111</w:t>
       </w:r>
     </w:p>
     <w:p>
@@ -1903,7 +1994,7 @@
         <w:pStyle w:val="ListNumber"/>
       </w:pPr>
       <w:r>
-        <w:t>[B2] Effect of vitamin D repletion on urinary calcium excretion among kidney stone formers. 2012. 10.2215/cjn.11331111</w:t>
+        <w:t>[B2] Shi L, Bao Y, Deng X, Xu X, Hu J. Association between calcium and vitamin D supplementation and increased risk of kidney stone formation in patients with osteoporosis in Southwest China: a cross-sectional study. BMJ open. 2025. doi: 10.1136/bmjopen-2024-092901</w:t>
       </w:r>
     </w:p>
     <w:p>
@@ -1911,7 +2002,7 @@
         <w:pStyle w:val="ListNumber"/>
       </w:pPr>
       <w:r>
-        <w:t>[B2] Association between calcium and vitamin D supplementation and increased risk of kidney stone formation in patients with osteoporosis in Southwest China: a cross-sectional study. 2025. 10.1136/bmjopen-2024-092901</w:t>
+        <w:t>[B2] Sha S, Degen M, Vlaski T, Fan Z, Brenner H, Schöttker B. The Safety Profile of Vitamin D Supplements Using Real-World Data from 445,493 Participants of the UK Biobank: Slightly Higher Hypercalcemia Prevalence but Neither Increased Risks of Kidney Stones nor Atherosclerosis. Nutrients. 2024. doi: 10.3390/nu16142251</w:t>
       </w:r>
     </w:p>
     <w:p>
@@ -1919,7 +2010,7 @@
         <w:pStyle w:val="ListNumber"/>
       </w:pPr>
       <w:r>
-        <w:t>[B2] The Safety Profile of Vitamin D Supplements Using Real-World Data from 445,493 Participants of the UK Biobank: Slightly Higher Hypercalcemia Prevalence but Neither Increased Risks of Kidney Stones nor Atherosclerosis. 2024. 10.3390/nu16142251</w:t>
+        <w:t>[B2] Messa P, Castellano G, Vettoretti S, Alfieri CM, Giannese D, Panichi V 외. Vitamin D and Calcium Supplementation and Urolithiasis: A Controversial and Multifaceted Relationship. Nutrients. 2023. doi: 10.3390/nu15071724</w:t>
       </w:r>
     </w:p>
     <w:p>
@@ -1927,7 +2018,7 @@
         <w:pStyle w:val="ListNumber"/>
       </w:pPr>
       <w:r>
-        <w:t>[B2] Vitamin D and Calcium Supplementation and Urolithiasis: A Controversial and Multifaceted Relationship. 2023. 10.3390/nu15071724</w:t>
+        <w:t>[B2] de Carvalho JF, Churilov LP. Safety of megadose of vitamin D in patients with nephrolithiasis. Nutrition (Burbank, Los Angeles County, Calif.). 2021. doi: 10.1016/j.nut.2021.111201</w:t>
       </w:r>
     </w:p>
     <w:p>
@@ -1935,7 +2026,7 @@
         <w:pStyle w:val="ListNumber"/>
       </w:pPr>
       <w:r>
-        <w:t>[B2] Safety of megadose of vitamin D in patients with nephrolithiasis. 2021. 10.1016/j.nut.2021.111201</w:t>
+        <w:t>[B2] Bargagli M, Ferraro PM, Vittori M, Lombardi G, Gambaro G, Somani B. Calcium and Vitamin D Supplementation and Their Association with Kidney Stone Disease: A Narrative Review. Nutrients. 2021. doi: 10.3390/nu13124363</w:t>
       </w:r>
     </w:p>
     <w:p>
@@ -1943,7 +2034,7 @@
         <w:pStyle w:val="ListNumber"/>
       </w:pPr>
       <w:r>
-        <w:t>[B2] Calcium and Vitamin D Supplementation and Their Association with Kidney Stone Disease: A Narrative Review. 2021. 10.3390/nu13124363</w:t>
+        <w:t>[B2] Hesswani C, Noureldin YA, Elkoushy MA, Andonian S. Combined vitamin D and calcium supplementation in vitamin D inadequate patients with urolithiasis: Impact on hypercalciuria and de novo stone formation. Canadian Urological Association journal = Journal de l'Association des urologues du Canada. 2015. doi: 10.5489/cuaj.3332</w:t>
       </w:r>
     </w:p>
     <w:p>
@@ -1951,7 +2042,7 @@
         <w:pStyle w:val="ListNumber"/>
       </w:pPr>
       <w:r>
-        <w:t>[B2] Combined vitamin D and calcium supplementation in vitamin D inadequate patients with urolithiasis: Impact on hypercalciuria and de novo stone formation. 2015. 10.5489/cuaj.3332</w:t>
+        <w:t>[B2] Haghighi A, Samimagham H, Gohardehi G. Calcium and vitamin D supplementation and risk of kidney stone formation in postmenopausal women. Iranian journal of kidney diseases. 2013. https://pubmed.ncbi.nlm.nih.gov/23689153/</w:t>
       </w:r>
     </w:p>
     <w:p>
@@ -1959,7 +2050,7 @@
         <w:pStyle w:val="ListNumber"/>
       </w:pPr>
       <w:r>
-        <w:t>[B2] Calcium and vitamin D supplementation and risk of kidney stone formation in postmenopausal women. 2013. https://pubmed.ncbi.nlm.nih.gov/23689153/</w:t>
+        <w:t>[B2] Matsumoto N, Otomaru M, Asai K, Hara K, Tsuchiya T, Takebayashi K 외. Hypercalcemia with the Oral Administration of Active Vitamin D3 and Chinese Herbal Medicine. Internal medicine (Tokyo, Japan). 2025. doi: 10.2169/internalmedicine.4431-24</w:t>
       </w:r>
     </w:p>
     <w:p>
@@ -1967,7 +2058,7 @@
         <w:pStyle w:val="ListNumber"/>
       </w:pPr>
       <w:r>
-        <w:t>[B2] Idiopathic infantile hypercalcemia with a CYP24A1 variant triggered by vitamin D supplementation in fortified milk: A case report. 2025. 10.1297/cpe.2024-0049</w:t>
+        <w:t>[B2] Repas SJ, Schmeusser BN, McCullough WP, Lehrer DS, Travers JB, McCullough PJ. Normal 24-hour urine calcium concentrations after long-term daily oral intake of vitamin D in doses ranging from 5000 to 50,000 international units in 14 adult hospitalized psychiatric patients. The Journal of steroid biochemistry and molecular biology. 2023. doi: 10.1016/j.jsbmb.2023.106329</w:t>
       </w:r>
     </w:p>
     <w:p>
@@ -1975,7 +2066,7 @@
         <w:pStyle w:val="ListNumber"/>
       </w:pPr>
       <w:r>
-        <w:t>[B2] Hypercalcemia with the Oral Administration of Active Vitamin D3 and Chinese Herbal Medicine. 2025. 10.2169/internalmedicine.4431-24</w:t>
+        <w:t>[B2] Barth K, Sedivy M, Lindner G, Schwarz C. Successful treatment with denosumab for two cases with hypercalcemia due to vitamin D intoxication and associated acute kidney injury. CEN case reports. 2022. doi: 10.1007/s13730-021-00643-5</w:t>
       </w:r>
     </w:p>
     <w:p>
@@ -1983,7 +2074,7 @@
         <w:pStyle w:val="ListNumber"/>
       </w:pPr>
       <w:r>
-        <w:t>[B2] Normal 24-hour urine calcium concentrations after long-term daily oral intake of vitamin D in doses ranging from 5000 to 50,000 international units in 14 adult hospitalized psychiatric patients. 2023. 10.1016/j.jsbmb.2023.106329</w:t>
+        <w:t>[B2] Lee M, Lee HI, Song K, Choi HS, Suh J, Kim SH 외. Association of hypercalciuria with vitamin D supplementation in patients undergoing ketogenic dietary therapy. Frontiers in nutrition. 2022. doi: 10.3389/fnut.2022.970467</w:t>
       </w:r>
     </w:p>
     <w:p>
@@ -1991,7 +2082,7 @@
         <w:pStyle w:val="ListNumber"/>
       </w:pPr>
       <w:r>
-        <w:t>[B2] Successful treatment with denosumab for two cases with hypercalcemia due to vitamin D intoxication and associated acute kidney injury. 2022. 10.1007/s13730-021-00643-5</w:t>
+        <w:t>[B2] Mio K, Haruhara K, Shimizu A, Oshiro K, Kawai R, Ikeda M 외. Hypercalcemia worsened after vitamin D supplementation in a sarcoidosis patient: A case report. Medicine. 2022. doi: 10.1097/md.0000000000030883</w:t>
       </w:r>
     </w:p>
     <w:p>
@@ -1999,7 +2090,7 @@
         <w:pStyle w:val="ListNumber"/>
       </w:pPr>
       <w:r>
-        <w:t>[B2] Association of hypercalciuria with vitamin D supplementation in patients undergoing ketogenic dietary therapy. 2022. 10.3389/fnut.2022.970467</w:t>
+        <w:t>[B2] Vitale C, Marangella M, Bermond F, Fabbrini L, Tricerri A. Metabolic effects of cholecalciferol supplementation in patients with calcium nephrolithiasis and vitamin D deficiency. World journal of urology. 2021. doi: 10.1007/s00345-020-03222-y</w:t>
       </w:r>
     </w:p>
     <w:p>
@@ -2007,7 +2098,7 @@
         <w:pStyle w:val="ListNumber"/>
       </w:pPr>
       <w:r>
-        <w:t>[B2] Hypercalcemia worsened after vitamin D supplementation in a sarcoidosis patient: A case report. 2022. 10.1097/md.0000000000030883</w:t>
+        <w:t>[B2] Holmes WL, Maish GO, Minard G, Croce MA, Dickerson RN. Hypercalcemia Without Hypervitaminosis D During Cholecalciferol Supplementation in Critically Ill Patients. Nutrition in clinical practice : official publication of the American Society for Parenteral and Enteral Nutrition. 2020. doi: 10.1002/ncp.10407</w:t>
       </w:r>
     </w:p>
     <w:p>
@@ -2015,7 +2106,7 @@
         <w:pStyle w:val="ListNumber"/>
       </w:pPr>
       <w:r>
-        <w:t>[B2] Metabolic effects of cholecalciferol supplementation in patients with calcium nephrolithiasis and vitamin D deficiency. 2021. 10.1007/s00345-020-03222-y</w:t>
+        <w:t>[B2] Häusler D, Torke S, Weber MS. High-Dose Vitamin D-Mediated Hypercalcemia as a Potential Risk Factor in Central Nervous System Demyelinating Disease. Frontiers in immunology. 2020. doi: 10.3389/fimmu.2020.00301</w:t>
       </w:r>
     </w:p>
     <w:p>
@@ -2023,7 +2114,7 @@
         <w:pStyle w:val="ListNumber"/>
       </w:pPr>
       <w:r>
-        <w:t>[B2] Hypercalcemia Without Hypervitaminosis D During Cholecalciferol Supplementation in Critically Ill Patients. 2020. 10.1002/ncp.10407</w:t>
+        <w:t>[B2] Lynch Cronin I, Byrne F, Doyle R, Fraser WD, Chipchase A, Eustace JA. The Effect of Short-Term Vitamin D Supplementation on Calcium Status in Vitamin D Insufficient Renal Transplant Recipients at Risk of Hypercalcemia. Journal of renal nutrition : the official journal of the Council on Renal Nutrition of the National Kidney Foundation. 2019. doi: 10.1053/j.jrn.2018.11.012</w:t>
       </w:r>
     </w:p>
     <w:p>
@@ -2031,7 +2122,7 @@
         <w:pStyle w:val="ListNumber"/>
       </w:pPr>
       <w:r>
-        <w:t>[B3] Ascorbic Acid Supplements and Kidney Stones Incidence Among Men and Women: A systematic review and meta-analysis. 2019. 10.22037/uj.v0i0.4275</w:t>
+        <w:t>[B3] Jiang K, Tang K, Liu H, Xu H, Ye Z, Chen Z. Ascorbic Acid Supplements and Kidney Stones Incidence Among Men and Women: A systematic review and meta-analysis. Urology journal. 2019. doi: 10.22037/uj.v0i0.4275</w:t>
       </w:r>
     </w:p>
     <w:p>
@@ -2039,7 +2130,7 @@
         <w:pStyle w:val="ListNumber"/>
       </w:pPr>
       <w:r>
-        <w:t>[B3] Ascorbic acid-induced oxalate nephropathy: a case report and discussion of pathologic mechanisms. 2019. 10.1007/s13730-018-0366-6</w:t>
+        <w:t>[B3] Lin WV, Turin CG, McCormick DW, Haas C, Constantine G. Ascorbic acid-induced oxalate nephropathy: a case report and discussion of pathologic mechanisms. CEN case reports. 2019. doi: 10.1007/s13730-018-0366-6</w:t>
       </w:r>
     </w:p>
     <w:p>
@@ -2047,7 +2138,7 @@
         <w:pStyle w:val="ListNumber"/>
       </w:pPr>
       <w:r>
-        <w:t>[B3] No Reported Renal Stones with Intravenous Vitamin C Administration: A Prospective Case Series Study. 2018. 10.3390/antiox7050068</w:t>
+        <w:t>[B3] Prier M, Carr AC, Baillie N. No Reported Renal Stones with Intravenous Vitamin C Administration: A Prospective Case Series Study. Antioxidants (Basel, Switzerland). 2018. doi: 10.3390/antiox7050068</w:t>
       </w:r>
     </w:p>
     <w:p>
@@ -2055,7 +2146,7 @@
         <w:pStyle w:val="ListNumber"/>
       </w:pPr>
       <w:r>
-        <w:t>[B3] A case report of renal oxalosis and secondary hyperoxaluria due to chronic high vitamin C consumption. 2025. 10.5414/cncs111462</w:t>
+        <w:t>[B3] Neofytou IE, Lioulios G, Almaliotis E, Daikidou DV, Mplatsa A, Minasidis E. A case report of renal oxalosis and secondary hyperoxaluria due to chronic high vitamin C consumption. Clinical nephrology. Case studies. 2025. doi: 10.5414/cncs111462</w:t>
       </w:r>
     </w:p>
     <w:p>
@@ -2063,7 +2154,7 @@
         <w:pStyle w:val="ListNumber"/>
       </w:pPr>
       <w:r>
-        <w:t>[B3] Vitamin C-induced hyperoxaluria causing reversible tubulointerstitial nephritis and chronic renal failure: a case report. 2007. 10.1186/1752-1947-1-155</w:t>
+        <w:t>[B3] Rathi S, Kern W, Lau K. Vitamin C-induced hyperoxaluria causing reversible tubulointerstitial nephritis and chronic renal failure: a case report. Journal of medical case reports. 2007. doi: 10.1186/1752-1947-1-155</w:t>
       </w:r>
     </w:p>
     <w:p>
@@ -2071,7 +2162,7 @@
         <w:pStyle w:val="ListNumber"/>
       </w:pPr>
       <w:r>
-        <w:t>[B3] Ascorbate increases human oxaluria and kidney stone risk. 2005. 10.1093/jn/135.7.1673</w:t>
+        <w:t>[B3] Massey LK, Liebman M, Kynast-Gales SA. Ascorbate increases human oxaluria and kidney stone risk. The Journal of nutrition. 2005. doi: 10.1093/jn/135.7.1673</w:t>
       </w:r>
     </w:p>
     <w:p>
@@ -2079,7 +2170,7 @@
         <w:pStyle w:val="ListNumber"/>
       </w:pPr>
       <w:r>
-        <w:t>[B3] Ascorbic acid in idiopathic recurrent calcium urolithiasis in humans--does it have an abettor role in oxalate, and calcium oxalate crystallization?. 2000. 10.1007/s002400000101</w:t>
+        <w:t>[B3] Schwille PO, Schmiedl A, Herrmann U, Manoharan M, Fan J, Sharma V 외. Ascorbic acid in idiopathic recurrent calcium urolithiasis in humans--does it have an abettor role in oxalate, and calcium oxalate crystallization?. Urological research. 2000. doi: 10.1007/s002400000101</w:t>
       </w:r>
     </w:p>
     <w:p>
@@ -2087,7 +2178,7 @@
         <w:pStyle w:val="ListNumber"/>
       </w:pPr>
       <w:r>
-        <w:t>[B3] Ascorbic acid overdosing: a risk factor for calcium oxalate nephrolithiasis. 1992. 10.1016/s0022-5347(17)37521-3</w:t>
+        <w:t>[B3] Urivetzky M, Kessaris D, Smith AD. Ascorbic acid overdosing: a risk factor for calcium oxalate nephrolithiasis. The Journal of urology. 1992. doi: 10.1016/s0022-5347(17)37521-3</w:t>
       </w:r>
     </w:p>
     <w:p>
@@ -2095,7 +2186,7 @@
         <w:pStyle w:val="ListNumber"/>
       </w:pPr>
       <w:r>
-        <w:t>[B3] Public Interest in Vitamin C Supplementation During the COVID-19 Pandemic as a Potential Risk for Oxalate Nephrolithiasis. 2025. 10.7759/cureus.79452</w:t>
+        <w:t>[B3] Kemble JP, Liaw CW, Alamiri JM, Ungerer GN, Potretzke AM, Koo K. Public Interest in Vitamin C Supplementation During the COVID-19 Pandemic as a Potential Risk for Oxalate Nephrolithiasis. Cureus. 2025. doi: 10.7759/cureus.79452</w:t>
       </w:r>
     </w:p>
     <w:p>
@@ -2103,7 +2194,7 @@
         <w:pStyle w:val="ListNumber"/>
       </w:pPr>
       <w:r>
-        <w:t>[B3] Vitamin C with metabolites reduce oxalate levels compared to ascorbic acid: a preliminary and novel clinical urologic finding. 2009. https://pubmed.ncbi.nlm.nih.gov/19507407/</w:t>
+        <w:t>[B3] Moyad MA, Combs MA, Crowley DC, Baisley JE, Sharma P, Vrablic AS 외. Vitamin C with metabolites reduce oxalate levels compared to ascorbic acid: a preliminary and novel clinical urologic finding. Urologic nursing. 2009. https://pubmed.ncbi.nlm.nih.gov/19507407/</w:t>
       </w:r>
     </w:p>
     <w:p>
@@ -2111,7 +2202,7 @@
         <w:pStyle w:val="ListNumber"/>
       </w:pPr>
       <w:r>
-        <w:t>[B3] No contribution of ascorbic acid to renal calcium oxalate stones. 1997. 10.1159/000177954</w:t>
+        <w:t>[B3] Gerster H. No contribution of ascorbic acid to renal calcium oxalate stones. Annals of nutrition &amp; metabolism. 1997. doi: 10.1159/000177954</w:t>
       </w:r>
     </w:p>
     <w:p>
@@ -2119,7 +2210,7 @@
         <w:pStyle w:val="ListNumber"/>
       </w:pPr>
       <w:r>
-        <w:t>[B3] Acute oxalate nephropathy due to high vitamin C doses and exocrine pancreatic insufficiency. 2019. 10.1136/bcr-2019-231504</w:t>
+        <w:t>[B3] Fijen L, Weijmer M. Acute oxalate nephropathy due to high vitamin C doses and exocrine pancreatic insufficiency. BMJ case reports. 2019. doi: 10.1136/bcr-2019-231504</w:t>
       </w:r>
     </w:p>
     <w:p>
@@ -2127,7 +2218,7 @@
         <w:pStyle w:val="ListNumber"/>
       </w:pPr>
       <w:r>
-        <w:t>[B3] Is it safe to prescribe ascorbic acid for urinary acidification in stone-forming patients with alkaline urine?. 2017. 10.5152/tud.2017.02700</w:t>
+        <w:t>[B3] Noureldin YA, da Silva A, Fahmy N, Andonian S. Is it safe to prescribe ascorbic acid for urinary acidification in stone-forming patients with alkaline urine?. Turkish journal of urology. 2017. doi: 10.5152/tud.2017.02700</w:t>
       </w:r>
     </w:p>
     <w:p>
@@ -2135,7 +2226,7 @@
         <w:pStyle w:val="ListNumber"/>
       </w:pPr>
       <w:r>
-        <w:t>[B3] Total, Dietary, and Supplemental Vitamin C Intake and Risk of Incident Kidney Stones. 2016. 10.1053/j.ajkd.2015.09.005</w:t>
+        <w:t>[B3] Ferraro PM, Curhan GC, Gambaro G, Taylor EN. Total, Dietary, and Supplemental Vitamin C Intake and Risk of Incident Kidney Stones. American journal of kidney diseases : the official journal of the National Kidney Foundation. 2016. doi: 10.1053/j.ajkd.2015.09.005</w:t>
       </w:r>
     </w:p>
     <w:p>
@@ -2143,7 +2234,7 @@
         <w:pStyle w:val="ListNumber"/>
       </w:pPr>
       <w:r>
-        <w:t>[B3] A case of reversible hyperoxaluria nephropathy early after roux-en-y-gastric bypass induced by vitamin C intake. 2016. 10.1093/omcr/omw054</w:t>
+        <w:t>[B3] Farhat S, Houssam A, Ghassaoui A, Khaled EA, El Khoury M. A case of reversible hyperoxaluria nephropathy early after roux-en-y-gastric bypass induced by vitamin C intake. Oxford medical case reports. 2016. doi: 10.1093/omcr/omw054</w:t>
       </w:r>
     </w:p>
     <w:p>
@@ -2151,7 +2242,7 @@
         <w:pStyle w:val="ListNumber"/>
       </w:pPr>
       <w:r>
-        <w:t>[B3] Urinary oxalate excretion increases in home parenteral nutrition patients on a higher intravenous ascorbic acid dose. 2004. 10.1177/0148607104028006435</w:t>
+        <w:t>[B3] Peña de la Vega L, Lieske JC, Milliner D, Gonyea J, Kelly DG. Urinary oxalate excretion increases in home parenteral nutrition patients on a higher intravenous ascorbic acid dose. JPEN. Journal of parenteral and enteral nutrition. 2004. doi: 10.1177/0148607104028006435</w:t>
       </w:r>
     </w:p>
     <w:p>
@@ -2159,7 +2250,7 @@
         <w:pStyle w:val="ListNumber"/>
       </w:pPr>
       <w:r>
-        <w:t>[B3] Effect of megadoses of ascorbic acid on serum and urinary oxalate. 1980. 10.1159/000473318</w:t>
+        <w:t>[B3] Hatch M, Mulgrew S, Bourke E, Keogh B, Costello J. Effect of megadoses of ascorbic acid on serum and urinary oxalate. European urology. 1980. doi: 10.1159/000473318</w:t>
       </w:r>
     </w:p>
     <w:p>
@@ -2167,7 +2258,7 @@
         <w:pStyle w:val="ListNumber"/>
       </w:pPr>
       <w:r>
-        <w:t>[B3] Vitamin C-induced oxalate nephropathy. 2011. 10.4061/2011/146927</w:t>
+        <w:t>[B3] Lamarche J, Nair R, Peguero A, Courville C. Vitamin C-induced oxalate nephropathy. International journal of nephrology. 2011. doi: 10.4061/2011/146927</w:t>
       </w:r>
     </w:p>
     <w:p>
@@ -2175,7 +2266,7 @@
         <w:pStyle w:val="ListNumber"/>
       </w:pPr>
       <w:r>
-        <w:t>[B3] Ascorbic acid is an abettor in calcium urolithiasis: an experimental study. 1993. https://pubmed.ncbi.nlm.nih.gov/8146605/</w:t>
+        <w:t>[B3] Singh PP, Kiran R, Pendse AK, Gosh R, Surana SS. Ascorbic acid is an abettor in calcium urolithiasis: an experimental study. Scanning microscopy. 1993. https://pubmed.ncbi.nlm.nih.gov/8146605/</w:t>
       </w:r>
     </w:p>
     <w:p>
@@ -2183,7 +2274,7 @@
         <w:pStyle w:val="ListNumber"/>
       </w:pPr>
       <w:r>
-        <w:t>[B3] Oxalate absorption and endogenous oxalate synthesis from ascorbate in calcium oxalate stone formers and non-stone formers. 2004. 10.1053/j.ajkd.2004.08.028</w:t>
+        <w:t>[B3] Chai W, Liebman M, Kynast-Gales S, Massey L. Oxalate absorption and endogenous oxalate synthesis from ascorbate in calcium oxalate stone formers and non-stone formers. American journal of kidney diseases : the official journal of the National Kidney Foundation. 2004. doi: 10.1053/j.ajkd.2004.08.028</w:t>
       </w:r>
     </w:p>
     <w:p>
@@ -2191,7 +2282,7 @@
         <w:pStyle w:val="ListNumber"/>
       </w:pPr>
       <w:r>
-        <w:t>[B3] The effect of ascorbic acid ingestion on the biochemical and physicochemical risk factors associated with calcium oxalate kidney stone formation. 1998. 10.1515/cclm.1998.027</w:t>
+        <w:t>[B3] Auer BL, Auer D, Rodgers AL. The effect of ascorbic acid ingestion on the biochemical and physicochemical risk factors associated with calcium oxalate kidney stone formation. Clinical chemistry and laboratory medicine. 1998. doi: 10.1515/cclm.1998.027</w:t>
       </w:r>
     </w:p>
     <w:p>
@@ -2199,7 +2290,7 @@
         <w:pStyle w:val="ListNumber"/>
       </w:pPr>
       <w:r>
-        <w:t>[B3] Postprandial hyperinsulinaemia, insulin resistance and inappropriately high phosphaturia are features of younger males with idiopathic calcium urolithiasis: attenuation by ascorbic acid supplementation of a test meal. 1997. 10.1007/bf00941906</w:t>
+        <w:t>[B3] Schwille PO, Schmiedl A, Herrmann U, Wipplinger J. Postprandial hyperinsulinaemia, insulin resistance and inappropriately high phosphaturia are features of younger males with idiopathic calcium urolithiasis: attenuation by ascorbic acid supplementation of a test meal. Urological research. 1997. doi: 10.1007/bf00941906</w:t>
       </w:r>
     </w:p>
     <w:p>
@@ -2207,7 +2298,7 @@
         <w:pStyle w:val="ListNumber"/>
       </w:pPr>
       <w:r>
-        <w:t>[B3] Relation of serum ascorbic acid to serum vitamin B12, serum ferritin, and kidney stones in US adults. 1999. 10.1001/archinte.159.6.619</w:t>
+        <w:t>[B3] Simon JA, Hudes ES. Relation of serum ascorbic acid to serum vitamin B12, serum ferritin, and kidney stones in US adults. Archives of internal medicine. 1999. doi: 10.1001/archinte.159.6.619</w:t>
       </w:r>
     </w:p>
     <w:p>
@@ -2215,7 +2306,7 @@
         <w:pStyle w:val="ListNumber"/>
       </w:pPr>
       <w:r>
-        <w:t>[B3] Relative hyperoxaluria, crystalluria and haematuria after megadose ingestion of vitamin C. 1998. 10.1046/j.1365-2362.1998.00349.x</w:t>
+        <w:t>[B3] Auer BL, Auer D, Rodgers AL. Relative hyperoxaluria, crystalluria and haematuria after megadose ingestion of vitamin C. European journal of clinical investigation. 1998. doi: 10.1046/j.1365-2362.1998.00349.x</w:t>
       </w:r>
     </w:p>
     <w:p>
@@ -2223,7 +2314,7 @@
         <w:pStyle w:val="ListNumber"/>
       </w:pPr>
       <w:r>
-        <w:t>[B3] Oxalate metabolism in end-stage renal disease: the effect of ascorbic acid and pyridoxine. 1988. https://pubmed.ncbi.nlm.nih.gov/3132636/</w:t>
+        <w:t>[B3] Morgan SH, Maher ER, Purkiss P, Watts RW, Curtis JR. Oxalate metabolism in end-stage renal disease: the effect of ascorbic acid and pyridoxine. Nephrology, dialysis, transplantation : official publication of the European Dialysis and Transplant Association - European Renal Association. 1988. https://pubmed.ncbi.nlm.nih.gov/3132636/</w:t>
       </w:r>
     </w:p>
     <w:p>
@@ -2231,7 +2322,7 @@
         <w:pStyle w:val="ListNumber"/>
       </w:pPr>
       <w:r>
-        <w:t>[B3] The diurnal urinary excretion of oxalate and the effect of pyridoxine and ascorbate on oxalate excretion. 1977. 10.1159/000472053</w:t>
+        <w:t>[B3] Tiselius HG, Almgård LE. The diurnal urinary excretion of oxalate and the effect of pyridoxine and ascorbate on oxalate excretion. European urology. 1977. doi: 10.1159/000472053</w:t>
       </w:r>
     </w:p>
     <w:p>
@@ -2240,6 +2331,16 @@
       </w:pPr>
       <w:r>
         <w:t>부록. 재현 파일</w:t>
+      </w:r>
+    </w:p>
+    <w:p>
+      <w:r>
+        <w:t>재현 환경은 Node.js, Python과 requirements-v3.txt에 고정한 패키지로 구성한다. 먼저 build_systematic_review_v3.py와 build_core_evidence_v3.py를 순서대로 실행하고, validate_core_evidence_v3.py로 스키마·식별자·질문 범위·규칙 연결을 검사한다. 이어 capture_software_quality_v3.mjs로 테스트, lint, TypeScript와 Production build 결과를 고정한 뒤 논문 생성·PDF 렌더링·논문 검증을 수행한다.</w:t>
+      </w:r>
+    </w:p>
+    <w:p>
+      <w:r>
+        <w:t>아래 SHA-256은 본 문서를 생성한 입력을 식별한다. 해시가 달라지면 수치와 표를 수동 수정하지 않고 전체 생성 절차를 다시 실행해야 한다. 공개할 수 없는 원문은 저장소에 포함하지 않으며, 공개 locator와 서지정보만 보존한다.</w:t>
       </w:r>
     </w:p>
     <w:tbl>
@@ -2291,7 +2392,7 @@
           </w:tcPr>
           <w:p>
             <w:r>
-              <w:t>83c8679b8c2baba3b2b235ebba3b596637919d2a410ac90ee0624048aa39efa1</w:t>
+              <w:t>56a24864aa312fca035f440408da8333b1e7512fd40b19c5eb1fd61e94938cbf</w:t>
             </w:r>
           </w:p>
         </w:tc>
@@ -2313,7 +2414,7 @@
           </w:tcPr>
           <w:p>
             <w:r>
-              <w:t>d9d80dc3d8d9bba4c938f26630736c1d0e49e386de78cd97441566c5b76ea643</w:t>
+              <w:t>da75a7c88738548402c3fdbae8bf801bd2270932bb6447600ff9b4bb07953fe9</w:t>
             </w:r>
           </w:p>
         </w:tc>
@@ -2335,7 +2436,7 @@
           </w:tcPr>
           <w:p>
             <w:r>
-              <w:t>71463915a948779653426e79557674213cbf96c3ab924b4f6f1250ac61516370</w:t>
+              <w:t>5f87bb2e4ea63513e9ccb8bc256fac8fa3ffd065f2112dbb3a3c3f46f059a04f</w:t>
             </w:r>
           </w:p>
         </w:tc>

</xml_diff>

<commit_message>
fix: bound AI latency and harden quality capture
</commit_message>
<xml_diff>
--- a/research/thesis/systematic_review_thesis_v3.docx
+++ b/research/thesis/systematic_review_thesis_v3.docx
@@ -46,7 +46,7 @@
     </w:p>
     <w:p>
       <w:r>
-        <w:t>본 연구는 항응고제를 복용하는 성인과 신장결석·고칼슘뇨 등 신장 관련 고위험군에서 비타민 K, 오메가-3, 칼슘, 비타민 D 및 비타민 C 보충제의 안전성 근거를 체계적으로 검색·구조화하고, 개인의 복용 조건에 따라 확인사항과 근거 문헌을 제시하는 웹 시스템을 구축하는 것을 목적으로 하였다. PubMed, ClinicalTrials.gov와 KoreaMed에서 수집한 공개 서지자료를 연구계획서의 PICOS에 따라 자동 선별하고 대상자, 보충제, 용량, 안전성 결과와 근거 위치를 추출하였다. 직접 관련 후보는 4,593건이었고, 용량 정보가 확인된 문헌은 369건, 공개 원문 위치가 연결된 문헌은 1,507건이었다. 제목 직접관련성, 연구설계, 용량·결과 및 원문 접근성을 기준으로 핵심 근거 121건을 선정하였다. 조회 시스템은 보충제, 일일 용량, 병용 약물, 질환·결석 병력과 검사값을 입력받아 질문별 확인사항, 맞춤형 요약과 근거 원문을 제공하도록 구현하였다. 64개 자동 테스트, TypeScript 검사와 Production 빌드를 통과한 버전을 Vercel 고정 주소에 배포하였다. 본 연구는 체계적인 검색·선별·추출과 소프트웨어 검증을 수행했으나 독립된 두 명의 사람 선별자가 없으므로 자동 선별 결과를 최종 임상 권고로 해석할 수 없다.</w:t>
+        <w:t>본 연구는 항응고제를 복용하는 성인과 신장결석·고칼슘뇨 등 신장 관련 고위험군에서 비타민 K, 오메가-3, 칼슘, 비타민 D 및 비타민 C 보충제의 안전성 근거를 체계적으로 검색·구조화하고, 개인의 복용 조건에 따라 확인사항과 근거 문헌을 제시하는 웹 시스템을 구축하는 것을 목적으로 하였다. PubMed, ClinicalTrials.gov와 KoreaMed에서 수집한 공개 서지자료를 연구계획서의 PICOS에 따라 자동 선별하고 대상자, 보충제, 용량, 안전성 결과와 근거 위치를 추출하였다. 직접 관련 후보는 4,593건이었고, 용량 정보가 확인된 문헌은 369건, 공개 원문 위치가 연결된 문헌은 1,507건이었다. 제목 직접관련성, 연구설계, 용량·결과 및 원문 접근성을 기준으로 핵심 근거 121건을 선정하였다. 조회 시스템은 보충제, 일일 용량, 병용 약물, 질환·결석 병력과 검사값을 입력받아 질문별 확인사항, 맞춤형 요약과 근거 원문을 제공하도록 구현하였다. 65개 자동 테스트, TypeScript 검사와 Production 빌드를 통과한 버전을 Vercel 고정 주소에 배포하였다. 본 연구는 체계적인 검색·선별·추출과 소프트웨어 검증을 수행했으나 독립된 두 명의 사람 선별자가 없으므로 자동 선별 결과를 최종 임상 권고로 해석할 수 없다.</w:t>
       </w:r>
     </w:p>
     <w:p>
@@ -186,7 +186,7 @@
     </w:p>
     <w:p>
       <w:r>
-        <w:t>단위·계약·경계·개인맞춤 API 테스트 64개, lint, TypeScript 검사와 Production 빌드를 수행하였다. 최종 시스템은 https://nutrition-safety-engine.vercel.app 에 배포하였다.</w:t>
+        <w:t>단위·계약·경계·개인맞춤 API 테스트 65개, lint, TypeScript 검사와 Production 빌드를 수행하였다. 최종 시스템은 https://nutrition-safety-engine.vercel.app 에 배포하였다.</w:t>
       </w:r>
     </w:p>
     <w:p>
@@ -1192,7 +1192,7 @@
           </w:tcPr>
           <w:p>
             <w:r>
-              <w:t>64개 통과</w:t>
+              <w:t>65개 통과</w:t>
             </w:r>
           </w:p>
         </w:tc>

</xml_diff>

<commit_message>
fix: keep personalized summaries concise and grounded
</commit_message>
<xml_diff>
--- a/research/thesis/systematic_review_thesis_v3.docx
+++ b/research/thesis/systematic_review_thesis_v3.docx
@@ -46,7 +46,7 @@
     </w:p>
     <w:p>
       <w:r>
-        <w:t>본 연구는 항응고제를 복용하는 성인과 신장결석·고칼슘뇨 등 신장 관련 고위험군에서 비타민 K, 오메가-3, 칼슘, 비타민 D 및 비타민 C 보충제의 안전성 근거를 체계적으로 검색·구조화하고, 개인의 복용 조건에 따라 확인사항과 근거 문헌을 제시하는 웹 시스템을 구축하는 것을 목적으로 하였다. PubMed, ClinicalTrials.gov와 KoreaMed에서 수집한 공개 서지자료를 연구계획서의 PICOS에 따라 자동 선별하고 대상자, 보충제, 용량, 안전성 결과와 근거 위치를 추출하였다. 직접 관련 후보는 4,593건이었고, 용량 정보가 확인된 문헌은 369건, 공개 원문 위치가 연결된 문헌은 1,507건이었다. 제목 직접관련성, 연구설계, 용량·결과 및 원문 접근성을 기준으로 핵심 근거 121건을 선정하였다. 조회 시스템은 보충제, 일일 용량, 병용 약물, 질환·결석 병력과 검사값을 입력받아 질문별 확인사항, 맞춤형 요약과 근거 원문을 제공하도록 구현하였다. 65개 자동 테스트, TypeScript 검사와 Production 빌드를 통과한 버전을 Vercel 고정 주소에 배포하였다. 본 연구는 체계적인 검색·선별·추출과 소프트웨어 검증을 수행했으나 독립된 두 명의 사람 선별자가 없으므로 자동 선별 결과를 최종 임상 권고로 해석할 수 없다.</w:t>
+        <w:t>본 연구는 항응고제를 복용하는 성인과 신장결석·고칼슘뇨 등 신장 관련 고위험군에서 비타민 K, 오메가-3, 칼슘, 비타민 D 및 비타민 C 보충제의 안전성 근거를 체계적으로 검색·구조화하고, 개인의 복용 조건에 따라 확인사항과 근거 문헌을 제시하는 웹 시스템을 구축하는 것을 목적으로 하였다. PubMed, ClinicalTrials.gov와 KoreaMed에서 수집한 공개 서지자료를 연구계획서의 PICOS에 따라 자동 선별하고 대상자, 보충제, 용량, 안전성 결과와 근거 위치를 추출하였다. 직접 관련 후보는 4,593건이었고, 용량 정보가 확인된 문헌은 369건, 공개 원문 위치가 연결된 문헌은 1,507건이었다. 제목 직접관련성, 연구설계, 용량·결과 및 원문 접근성을 기준으로 핵심 근거 121건을 선정하였다. 조회 시스템은 보충제, 일일 용량, 병용 약물, 질환·결석 병력과 검사값을 입력받아 질문별 확인사항, 맞춤형 요약과 근거 원문을 제공하도록 구현하였다. 67개 자동 테스트, TypeScript 검사와 Production 빌드를 통과한 버전을 Vercel 고정 주소에 배포하였다. 본 연구는 체계적인 검색·선별·추출과 소프트웨어 검증을 수행했으나 독립된 두 명의 사람 선별자가 없으므로 자동 선별 결과를 최종 임상 권고로 해석할 수 없다.</w:t>
       </w:r>
     </w:p>
     <w:p>
@@ -186,7 +186,7 @@
     </w:p>
     <w:p>
       <w:r>
-        <w:t>단위·계약·경계·개인맞춤 API 테스트 65개, lint, TypeScript 검사와 Production 빌드를 수행하였다. 최종 시스템은 https://nutrition-safety-engine.vercel.app 에 배포하였다.</w:t>
+        <w:t>단위·계약·경계·개인맞춤 API 테스트 67개, lint, TypeScript 검사와 Production 빌드를 수행하였다. 최종 시스템은 https://nutrition-safety-engine.vercel.app 에 배포하였다.</w:t>
       </w:r>
     </w:p>
     <w:p>
@@ -1192,7 +1192,7 @@
           </w:tcPr>
           <w:p>
             <w:r>
-              <w:t>65개 통과</w:t>
+              <w:t>67개 통과</w:t>
             </w:r>
           </w:p>
         </w:tc>

</xml_diff>

<commit_message>
test: verify every core evidence link
</commit_message>
<xml_diff>
--- a/research/thesis/systematic_review_thesis_v3.docx
+++ b/research/thesis/systematic_review_thesis_v3.docx
@@ -186,7 +186,7 @@
     </w:p>
     <w:p>
       <w:r>
-        <w:t>단위·계약·경계·개인맞춤 API 테스트 67개, lint, TypeScript 검사와 Production 빌드를 수행하였다. 최종 시스템은 https://nutrition-safety-engine.vercel.app 에 배포하였다.</w:t>
+        <w:t>단위·계약·경계·개인맞춤 API 테스트 67개, lint, TypeScript 검사와 Production 빌드를 수행하였다. 핵심 근거 121건의 고유 서지 URL 118개를 네트워크로 점검하였다. 최종 시스템은 https://nutrition-safety-engine.vercel.app 에 배포하였다.</w:t>
       </w:r>
     </w:p>
     <w:p>
@@ -1204,6 +1204,28 @@
           </w:tcPr>
           <w:p>
             <w:r>
+              <w:t>핵심 근거 URL</w:t>
+            </w:r>
+          </w:p>
+        </w:tc>
+        <w:tc>
+          <w:tcPr>
+            <w:tcW w:type="dxa" w:w="4514"/>
+          </w:tcPr>
+          <w:p>
+            <w:r>
+              <w:t>118개 접근 확인</w:t>
+            </w:r>
+          </w:p>
+        </w:tc>
+      </w:tr>
+      <w:tr>
+        <w:tc>
+          <w:tcPr>
+            <w:tcW w:type="dxa" w:w="4514"/>
+          </w:tcPr>
+          <w:p>
+            <w:r>
               <w:t>lint</w:t>
             </w:r>
           </w:p>

</xml_diff>

<commit_message>
chore: secure release and refresh thesis artifacts
</commit_message>
<xml_diff>
--- a/research/thesis/systematic_review_thesis_v3.docx
+++ b/research/thesis/systematic_review_thesis_v3.docx
@@ -9,7 +9,8 @@
       </w:pPr>
       <w:r>
         <w:rPr>
-          <w:b/>
+          <w:rFonts w:ascii="Pretendard ExtraBold" w:hAnsi="Pretendard ExtraBold" w:eastAsia="Pretendard ExtraBold"/>
+          <w:b w:val="0"/>
           <w:sz w:val="40"/>
         </w:rPr>
         <w:t>항응고제 복용자 및 신장 관련 고위험군에서의 영양소 보충제 안전성 체계적 근거 검토와 개인맞춤 조회 시스템 구축</w:t>
@@ -22,7 +23,8 @@
       </w:pPr>
       <w:r>
         <w:rPr>
-          <w:b/>
+          <w:rFonts w:ascii="Pretendard SemiBold" w:hAnsi="Pretendard SemiBold" w:eastAsia="Pretendard SemiBold"/>
+          <w:b w:val="0"/>
         </w:rPr>
         <w:t>여형준</w:t>
         <w:br/>
@@ -313,6 +315,10 @@
         <w:gridCol w:w="3010"/>
       </w:tblGrid>
       <w:tr>
+        <w:trPr>
+          <w:tblHeader w:val="true"/>
+          <w:cantSplit w:val="true"/>
+        </w:trPr>
         <w:tc>
           <w:tcPr>
             <w:tcW w:type="dxa" w:w="3010"/>
@@ -345,6 +351,9 @@
         </w:tc>
       </w:tr>
       <w:tr>
+        <w:trPr>
+          <w:cantSplit w:val="true"/>
+        </w:trPr>
         <w:tc>
           <w:tcPr>
             <w:tcW w:type="dxa" w:w="3010"/>
@@ -377,6 +386,9 @@
         </w:tc>
       </w:tr>
       <w:tr>
+        <w:trPr>
+          <w:cantSplit w:val="true"/>
+        </w:trPr>
         <w:tc>
           <w:tcPr>
             <w:tcW w:type="dxa" w:w="3010"/>
@@ -409,6 +421,9 @@
         </w:tc>
       </w:tr>
       <w:tr>
+        <w:trPr>
+          <w:cantSplit w:val="true"/>
+        </w:trPr>
         <w:tc>
           <w:tcPr>
             <w:tcW w:type="dxa" w:w="3010"/>
@@ -441,6 +456,9 @@
         </w:tc>
       </w:tr>
       <w:tr>
+        <w:trPr>
+          <w:cantSplit w:val="true"/>
+        </w:trPr>
         <w:tc>
           <w:tcPr>
             <w:tcW w:type="dxa" w:w="3010"/>
@@ -487,6 +505,10 @@
         <w:gridCol w:w="1806"/>
       </w:tblGrid>
       <w:tr>
+        <w:trPr>
+          <w:tblHeader w:val="true"/>
+          <w:cantSplit w:val="true"/>
+        </w:trPr>
         <w:tc>
           <w:tcPr>
             <w:tcW w:type="dxa" w:w="1806"/>
@@ -539,6 +561,9 @@
         </w:tc>
       </w:tr>
       <w:tr>
+        <w:trPr>
+          <w:cantSplit w:val="true"/>
+        </w:trPr>
         <w:tc>
           <w:tcPr>
             <w:tcW w:type="dxa" w:w="1806"/>
@@ -591,6 +616,9 @@
         </w:tc>
       </w:tr>
       <w:tr>
+        <w:trPr>
+          <w:cantSplit w:val="true"/>
+        </w:trPr>
         <w:tc>
           <w:tcPr>
             <w:tcW w:type="dxa" w:w="1806"/>
@@ -643,6 +671,9 @@
         </w:tc>
       </w:tr>
       <w:tr>
+        <w:trPr>
+          <w:cantSplit w:val="true"/>
+        </w:trPr>
         <w:tc>
           <w:tcPr>
             <w:tcW w:type="dxa" w:w="1806"/>
@@ -695,6 +726,9 @@
         </w:tc>
       </w:tr>
       <w:tr>
+        <w:trPr>
+          <w:cantSplit w:val="true"/>
+        </w:trPr>
         <w:tc>
           <w:tcPr>
             <w:tcW w:type="dxa" w:w="1806"/>
@@ -747,6 +781,9 @@
         </w:tc>
       </w:tr>
       <w:tr>
+        <w:trPr>
+          <w:cantSplit w:val="true"/>
+        </w:trPr>
         <w:tc>
           <w:tcPr>
             <w:tcW w:type="dxa" w:w="1806"/>
@@ -1154,6 +1191,10 @@
         <w:gridCol w:w="4514"/>
       </w:tblGrid>
       <w:tr>
+        <w:trPr>
+          <w:tblHeader w:val="true"/>
+          <w:cantSplit w:val="true"/>
+        </w:trPr>
         <w:tc>
           <w:tcPr>
             <w:tcW w:type="dxa" w:w="4514"/>
@@ -1176,6 +1217,9 @@
         </w:tc>
       </w:tr>
       <w:tr>
+        <w:trPr>
+          <w:cantSplit w:val="true"/>
+        </w:trPr>
         <w:tc>
           <w:tcPr>
             <w:tcW w:type="dxa" w:w="4514"/>
@@ -1198,6 +1242,9 @@
         </w:tc>
       </w:tr>
       <w:tr>
+        <w:trPr>
+          <w:cantSplit w:val="true"/>
+        </w:trPr>
         <w:tc>
           <w:tcPr>
             <w:tcW w:type="dxa" w:w="4514"/>
@@ -1220,6 +1267,9 @@
         </w:tc>
       </w:tr>
       <w:tr>
+        <w:trPr>
+          <w:cantSplit w:val="true"/>
+        </w:trPr>
         <w:tc>
           <w:tcPr>
             <w:tcW w:type="dxa" w:w="4514"/>
@@ -1242,6 +1292,9 @@
         </w:tc>
       </w:tr>
       <w:tr>
+        <w:trPr>
+          <w:cantSplit w:val="true"/>
+        </w:trPr>
         <w:tc>
           <w:tcPr>
             <w:tcW w:type="dxa" w:w="4514"/>
@@ -1264,6 +1317,9 @@
         </w:tc>
       </w:tr>
       <w:tr>
+        <w:trPr>
+          <w:cantSplit w:val="true"/>
+        </w:trPr>
         <w:tc>
           <w:tcPr>
             <w:tcW w:type="dxa" w:w="4514"/>
@@ -1286,6 +1342,9 @@
         </w:tc>
       </w:tr>
       <w:tr>
+        <w:trPr>
+          <w:cantSplit w:val="true"/>
+        </w:trPr>
         <w:tc>
           <w:tcPr>
             <w:tcW w:type="dxa" w:w="4514"/>
@@ -1308,6 +1367,9 @@
         </w:tc>
       </w:tr>
       <w:tr>
+        <w:trPr>
+          <w:cantSplit w:val="true"/>
+        </w:trPr>
         <w:tc>
           <w:tcPr>
             <w:tcW w:type="dxa" w:w="4514"/>
@@ -1345,7 +1407,7 @@
     </w:p>
     <w:p>
       <w:r>
-        <w:t>질문별 핵심 문헌 수를 동일하게 맞추지 않고 직접관련성 기준을 통과한 수만 보고하였다. 특히 오메가-3와 항응고제 질문은 12건으로 다른 질문보다 적어, 근거 규모의 차이를 화면과 논문에 그대로 반영하였다.</w:t>
+        <w:t>질문별 핵심 문헌 수를 동일하게 맞추지 않고 직접관련성 기준을 통과한 수만 보고하였다. 특히 오메가-3와 항응고제 질문은 5건으로 다른 질문보다 적어, 근거 규모의 차이를 화면과 논문에 그대로 반영하였다.</w:t>
       </w:r>
     </w:p>
     <w:p>
@@ -2376,6 +2438,10 @@
         <w:gridCol w:w="4514"/>
       </w:tblGrid>
       <w:tr>
+        <w:trPr>
+          <w:tblHeader w:val="true"/>
+          <w:cantSplit w:val="true"/>
+        </w:trPr>
         <w:tc>
           <w:tcPr>
             <w:tcW w:type="dxa" w:w="4514"/>
@@ -2398,6 +2464,9 @@
         </w:tc>
       </w:tr>
       <w:tr>
+        <w:trPr>
+          <w:cantSplit w:val="true"/>
+        </w:trPr>
         <w:tc>
           <w:tcPr>
             <w:tcW w:type="dxa" w:w="4514"/>
@@ -2420,6 +2489,9 @@
         </w:tc>
       </w:tr>
       <w:tr>
+        <w:trPr>
+          <w:cantSplit w:val="true"/>
+        </w:trPr>
         <w:tc>
           <w:tcPr>
             <w:tcW w:type="dxa" w:w="4514"/>
@@ -2442,6 +2514,9 @@
         </w:tc>
       </w:tr>
       <w:tr>
+        <w:trPr>
+          <w:cantSplit w:val="true"/>
+        </w:trPr>
         <w:tc>
           <w:tcPr>
             <w:tcW w:type="dxa" w:w="4514"/>
@@ -2464,6 +2539,9 @@
         </w:tc>
       </w:tr>
       <w:tr>
+        <w:trPr>
+          <w:cantSplit w:val="true"/>
+        </w:trPr>
         <w:tc>
           <w:tcPr>
             <w:tcW w:type="dxa" w:w="4514"/>
@@ -2863,7 +2941,8 @@
       <w:spacing w:line="360" w:lineRule="auto" w:after="120"/>
     </w:pPr>
     <w:rPr>
-      <w:rFonts w:ascii="Malgun Gothic" w:hAnsi="Malgun Gothic" w:eastAsia="맑은 고딕"/>
+      <w:rFonts w:ascii="Pretendard" w:hAnsi="Pretendard" w:eastAsia="Pretendard"/>
+      <w:b w:val="0"/>
       <w:sz w:val="21"/>
     </w:rPr>
   </w:style>
@@ -2926,10 +3005,10 @@
       <w:outlineLvl w:val="0"/>
     </w:pPr>
     <w:rPr>
-      <w:rFonts w:asciiTheme="majorHAnsi" w:eastAsiaTheme="majorEastAsia" w:hAnsiTheme="majorHAnsi" w:cstheme="majorBidi" w:ascii="Malgun Gothic" w:hAnsi="Malgun Gothic" w:eastAsia="맑은 고딕"/>
-      <w:b/>
+      <w:rFonts w:asciiTheme="majorHAnsi" w:eastAsiaTheme="majorEastAsia" w:hAnsiTheme="majorHAnsi" w:cstheme="majorBidi" w:ascii="Pretendard ExtraBold" w:hAnsi="Pretendard ExtraBold" w:eastAsia="Pretendard ExtraBold"/>
+      <w:b w:val="0"/>
       <w:bCs/>
-      <w:color w:val="365F91" w:themeColor="accent1" w:themeShade="BF"/>
+      <w:color w:val="000000"/>
       <w:sz w:val="30"/>
       <w:szCs w:val="28"/>
     </w:rPr>
@@ -2950,10 +3029,10 @@
       <w:outlineLvl w:val="1"/>
     </w:pPr>
     <w:rPr>
-      <w:rFonts w:asciiTheme="majorHAnsi" w:eastAsiaTheme="majorEastAsia" w:hAnsiTheme="majorHAnsi" w:cstheme="majorBidi" w:ascii="Malgun Gothic" w:hAnsi="Malgun Gothic" w:eastAsia="맑은 고딕"/>
-      <w:b/>
+      <w:rFonts w:asciiTheme="majorHAnsi" w:eastAsiaTheme="majorEastAsia" w:hAnsiTheme="majorHAnsi" w:cstheme="majorBidi" w:ascii="Pretendard SemiBold" w:hAnsi="Pretendard SemiBold" w:eastAsia="Pretendard SemiBold"/>
+      <w:b w:val="0"/>
       <w:bCs/>
-      <w:color w:val="4F81BD" w:themeColor="accent1"/>
+      <w:color w:val="000000"/>
       <w:sz w:val="24"/>
       <w:szCs w:val="26"/>
     </w:rPr>

</xml_diff>